<commit_message>
Fix Agent service recovery in restricted Windows environments
</commit_message>
<xml_diff>
--- a/docs/SamsungSwitchWatch_User_Manual_KO.docx
+++ b/docs/SamsungSwitchWatch_User_Manual_KO.docx
@@ -1159,7 +1159,7 @@
           <w:color w:val="16324F"/>
           <w:sz w:val="21"/>
         </w:rPr>
-        <w:t>0.11.4-poc는 코드 서명되지 않은 시험판입니다. 압축을 풀기 전에 Agent와 Viewer ZIP의 SHA-256을 해당 GitHub Release 본문에 표시된 값과 비교하고 사내 보안 반입 절차를 완료하세요. SmartScreen 또는 EDR 경고를 우회하지 않습니다.</w:t>
+        <w:t>0.11.5-poc는 코드 서명되지 않은 시험판입니다. 압축을 풀기 전에 Agent와 Viewer ZIP의 SHA-256을 해당 GitHub Release 본문에 표시된 값과 비교하고 사내 보안 반입 절차를 완료하세요. SmartScreen 또는 EDR 경고를 우회하지 않습니다.</w:t>
       </w:r>
     </w:p>
     <w:p>
@@ -2352,7 +2352,7 @@
           <w:color w:val="16324F"/>
           <w:sz w:val="21"/>
         </w:rPr>
-        <w:t>Agent Setup에 AGENT_LOCAL_CONNECTION_UNCONFIRMED 또는 FIREWALL_REMOTE_ACCESS_UNCONFIRMED가 표시되면 Agent 서비스와 프로그램은 설치됐지만 연결 준비를 확인하지 못했다는 뜻입니다. Viewer에서 연결 테스트를 실행하고, TCP/18443이 실패할 때 Windows 관리자에게 확인하세요. 규칙을 AGENT_CONNECTION_REFUSED가 보이면 Viewer에 스위치 IP나 localhost가 아니라 Agent를 설치한 PC의 실제 주소를 입력했는지 먼저 확인하세요. 같은 PC 시험에서는 해당 PC의 사설 IPv4 또는 localhost를 사용할 수 있습니다. 그 다음 Windows 서비스에서 SamsungSwitchWatchAgent가 Running인지 확인하고 TCP/18443을 점검합니다. TCP 단계는 성공하고 HTTPS 단계가 실패하면 방화벽이 아니라 Agent PC의 로컬 HTTPS/TLS 준비 상태를 확인합니다. AGENT_CLIENT_NOT_ALLOWED이면 Viewer 주소가 RFC1918 사설 범위인지 확인합니다. 서비스를 수동 등록하지 말고 0.11.4-poc Agent Setup을 사용하세요.</w:t>
+        <w:t>Agent Setup에 AGENT_LOCAL_CONNECTION_UNCONFIRMED 또는 FIREWALL_REMOTE_ACCESS_UNCONFIRMED가 표시되면 Agent 서비스와 프로그램은 설치됐지만 연결 준비를 확인하지 못했다는 뜻입니다. Viewer에서 연결 테스트를 실행하고, TCP/18443이 실패할 때 Windows 관리자에게 확인하세요. 규칙을 AGENT_CONNECTION_REFUSED가 보이면 Viewer에 스위치 IP나 localhost가 아니라 Agent를 설치한 PC의 실제 주소를 입력했는지 먼저 확인하세요. 같은 PC 시험에서는 해당 PC의 사설 IPv4 또는 localhost를 사용할 수 있습니다. 그 다음 Windows 서비스에서 SamsungSwitchWatchAgent가 Running인지 확인하고 TCP/18443을 점검합니다. TCP 단계는 성공하고 HTTPS 단계가 실패하면 방화벽이 아니라 Agent PC의 로컬 HTTPS/TLS 준비 상태를 확인합니다. AGENT_CLIENT_NOT_ALLOWED이면 Viewer 주소가 RFC1918 사설 범위인지 확인합니다. 서비스를 수동 등록하지 말고 0.11.5-poc Agent Setup을 사용하세요.</w:t>
       </w:r>
     </w:p>
     <w:p>
@@ -2514,7 +2514,7 @@
           <w:color w:val="16324F"/>
           <w:sz w:val="21"/>
         </w:rPr>
-        <w:t>0.11.4-poc는 코드 서명되지 않아 SmartScreen이나 사내 EDR이 차단할 수 있습니다. ZIP을 완전히 압축 해제하고 Setup, Viewer EXE와 제공된 DLL이 같은 폴더에 있는지 확인하세요. EDR·AppLocker·WDAC가 차단하면 우회하지 말고 공식 ZIP의 버전·해시와 차단 기록을 보안 담당자에게 전달하세요.</w:t>
+        <w:t>0.11.5-poc는 코드 서명되지 않아 SmartScreen이나 사내 EDR이 차단할 수 있습니다. ZIP을 완전히 압축 해제하고 Setup, Viewer EXE와 제공된 DLL이 같은 폴더에 있는지 확인하세요. EDR·AppLocker·WDAC가 차단하면 우회하지 말고 공식 ZIP의 버전·해시와 차단 기록을 보안 담당자에게 전달하세요.</w:t>
       </w:r>
     </w:p>
     <w:p>
@@ -7633,7 +7633,7 @@
                 <w:rFonts w:ascii="맑은 고딕" w:hAnsi="맑은 고딕" w:eastAsia="맑은 고딕" w:cs="맑은 고딕"/>
                 <w:sz w:val="16"/>
               </w:rPr>
-              <w:t>파일 복구 완료 여부를 먼저 확인한 뒤 기존 서비스 설정·시작 실패를 Windows 관리자에게 전달</w:t>
+              <w:t>파일 복구 완료 여부를 먼저 확인한 뒤 기존 서비스 핵심 설정·시작 실패를 Windows 관리자에게 전달</w:t>
             </w:r>
           </w:p>
         </w:tc>
@@ -7663,6 +7663,62 @@
                 <w:rFonts w:ascii="맑은 고딕" w:hAnsi="맑은 고딕" w:eastAsia="맑은 고딕" w:cs="맑은 고딕"/>
                 <w:sz w:val="16"/>
               </w:rPr>
+              <w:t>ROLLBACK_SERVICE_*_RESTORE_WARNING</w:t>
+            </w:r>
+          </w:p>
+        </w:tc>
+        <w:tc>
+          <w:tcPr>
+            <w:tcW w:type="dxa" w:w="5060"/>
+            <w:tcMar>
+              <w:top w:w="80" w:type="dxa"/>
+              <w:start w:w="120" w:type="dxa"/>
+              <w:bottom w:w="80" w:type="dxa"/>
+              <w:end w:w="120" w:type="dxa"/>
+            </w:tcMar>
+            <w:vAlign w:val="center"/>
+          </w:tcPr>
+          <w:p>
+            <w:pPr>
+              <w:spacing w:before="0" w:after="0" w:line="240" w:lineRule="auto"/>
+              <w:jc w:val="left"/>
+            </w:pPr>
+            <w:r>
+              <w:rPr>
+                <w:rFonts w:ascii="맑은 고딕" w:hAnsi="맑은 고딕" w:eastAsia="맑은 고딕" w:cs="맑은 고딕"/>
+                <w:sz w:val="16"/>
+              </w:rPr>
+              <w:t>서비스 설명·자동 복구 정책·접근 권한의 부가 설정만 복구되지 않은 경고. Agent 핵심 구성과 실행 상태가 정상이라면 복구는 완료됨</w:t>
+            </w:r>
+          </w:p>
+        </w:tc>
+      </w:tr>
+      <w:tr>
+        <w:trPr>
+          <w:cantSplit w:val="true"/>
+        </w:trPr>
+        <w:tc>
+          <w:tcPr>
+            <w:tcW w:type="dxa" w:w="4300"/>
+            <w:shd w:fill="FAFBFC"/>
+            <w:tcMar>
+              <w:top w:w="80" w:type="dxa"/>
+              <w:start w:w="120" w:type="dxa"/>
+              <w:bottom w:w="80" w:type="dxa"/>
+              <w:end w:w="120" w:type="dxa"/>
+            </w:tcMar>
+            <w:vAlign w:val="center"/>
+          </w:tcPr>
+          <w:p>
+            <w:pPr>
+              <w:spacing w:before="0" w:after="0" w:line="240" w:lineRule="auto"/>
+              <w:jc w:val="left"/>
+            </w:pPr>
+            <w:r>
+              <w:rPr>
+                <w:rFonts w:ascii="맑은 고딕" w:hAnsi="맑은 고딕" w:eastAsia="맑은 고딕" w:cs="맑은 고딕"/>
+                <w:sz w:val="16"/>
+              </w:rPr>
               <w:t>ROLLBACK_HTTPS_FIREWALL_RESTORE_FAILED / ROLLBACK_LEGACY_FIREWALL_RESTORE_FAILED</w:t>
             </w:r>
           </w:p>
@@ -7670,6 +7726,7 @@
         <w:tc>
           <w:tcPr>
             <w:tcW w:type="dxa" w:w="5060"/>
+            <w:shd w:fill="FAFBFC"/>
             <w:tcMar>
               <w:top w:w="80" w:type="dxa"/>
               <w:start w:w="120" w:type="dxa"/>
@@ -7700,7 +7757,6 @@
         <w:tc>
           <w:tcPr>
             <w:tcW w:type="dxa" w:w="4300"/>
-            <w:shd w:fill="FAFBFC"/>
             <w:tcMar>
               <w:top w:w="80" w:type="dxa"/>
               <w:start w:w="120" w:type="dxa"/>
@@ -7726,7 +7782,6 @@
         <w:tc>
           <w:tcPr>
             <w:tcW w:type="dxa" w:w="5060"/>
-            <w:shd w:fill="FAFBFC"/>
             <w:tcMar>
               <w:top w:w="80" w:type="dxa"/>
               <w:start w:w="120" w:type="dxa"/>
@@ -7757,6 +7812,7 @@
         <w:tc>
           <w:tcPr>
             <w:tcW w:type="dxa" w:w="4300"/>
+            <w:shd w:fill="FAFBFC"/>
             <w:tcMar>
               <w:top w:w="80" w:type="dxa"/>
               <w:start w:w="120" w:type="dxa"/>
@@ -7782,6 +7838,7 @@
         <w:tc>
           <w:tcPr>
             <w:tcW w:type="dxa" w:w="5060"/>
+            <w:shd w:fill="FAFBFC"/>
             <w:tcMar>
               <w:top w:w="80" w:type="dxa"/>
               <w:start w:w="120" w:type="dxa"/>
@@ -7812,7 +7869,6 @@
         <w:tc>
           <w:tcPr>
             <w:tcW w:type="dxa" w:w="4300"/>
-            <w:shd w:fill="FAFBFC"/>
             <w:tcMar>
               <w:top w:w="80" w:type="dxa"/>
               <w:start w:w="120" w:type="dxa"/>
@@ -7838,7 +7894,6 @@
         <w:tc>
           <w:tcPr>
             <w:tcW w:type="dxa" w:w="5060"/>
-            <w:shd w:fill="FAFBFC"/>
             <w:tcMar>
               <w:top w:w="80" w:type="dxa"/>
               <w:start w:w="120" w:type="dxa"/>
@@ -7869,6 +7924,7 @@
         <w:tc>
           <w:tcPr>
             <w:tcW w:type="dxa" w:w="4300"/>
+            <w:shd w:fill="FAFBFC"/>
             <w:tcMar>
               <w:top w:w="80" w:type="dxa"/>
               <w:start w:w="120" w:type="dxa"/>
@@ -7894,6 +7950,7 @@
         <w:tc>
           <w:tcPr>
             <w:tcW w:type="dxa" w:w="5060"/>
+            <w:shd w:fill="FAFBFC"/>
             <w:tcMar>
               <w:top w:w="80" w:type="dxa"/>
               <w:start w:w="120" w:type="dxa"/>
@@ -7924,7 +7981,6 @@
         <w:tc>
           <w:tcPr>
             <w:tcW w:type="dxa" w:w="4300"/>
-            <w:shd w:fill="FAFBFC"/>
             <w:tcMar>
               <w:top w:w="80" w:type="dxa"/>
               <w:start w:w="120" w:type="dxa"/>
@@ -7950,7 +8006,6 @@
         <w:tc>
           <w:tcPr>
             <w:tcW w:type="dxa" w:w="5060"/>
-            <w:shd w:fill="FAFBFC"/>
             <w:tcMar>
               <w:top w:w="80" w:type="dxa"/>
               <w:start w:w="120" w:type="dxa"/>
@@ -7981,6 +8036,7 @@
         <w:tc>
           <w:tcPr>
             <w:tcW w:type="dxa" w:w="4300"/>
+            <w:shd w:fill="FAFBFC"/>
             <w:tcMar>
               <w:top w:w="80" w:type="dxa"/>
               <w:start w:w="120" w:type="dxa"/>
@@ -8006,6 +8062,7 @@
         <w:tc>
           <w:tcPr>
             <w:tcW w:type="dxa" w:w="5060"/>
+            <w:shd w:fill="FAFBFC"/>
             <w:tcMar>
               <w:top w:w="80" w:type="dxa"/>
               <w:start w:w="120" w:type="dxa"/>
@@ -8036,7 +8093,6 @@
         <w:tc>
           <w:tcPr>
             <w:tcW w:type="dxa" w:w="4300"/>
-            <w:shd w:fill="FAFBFC"/>
             <w:tcMar>
               <w:top w:w="80" w:type="dxa"/>
               <w:start w:w="120" w:type="dxa"/>
@@ -8062,7 +8118,6 @@
         <w:tc>
           <w:tcPr>
             <w:tcW w:type="dxa" w:w="5060"/>
-            <w:shd w:fill="FAFBFC"/>
             <w:tcMar>
               <w:top w:w="80" w:type="dxa"/>
               <w:start w:w="120" w:type="dxa"/>
@@ -8093,6 +8148,7 @@
         <w:tc>
           <w:tcPr>
             <w:tcW w:type="dxa" w:w="4300"/>
+            <w:shd w:fill="FAFBFC"/>
             <w:tcMar>
               <w:top w:w="80" w:type="dxa"/>
               <w:start w:w="120" w:type="dxa"/>
@@ -8118,6 +8174,7 @@
         <w:tc>
           <w:tcPr>
             <w:tcW w:type="dxa" w:w="5060"/>
+            <w:shd w:fill="FAFBFC"/>
             <w:tcMar>
               <w:top w:w="80" w:type="dxa"/>
               <w:start w:w="120" w:type="dxa"/>
@@ -8148,7 +8205,6 @@
         <w:tc>
           <w:tcPr>
             <w:tcW w:type="dxa" w:w="4300"/>
-            <w:shd w:fill="FAFBFC"/>
             <w:tcMar>
               <w:top w:w="80" w:type="dxa"/>
               <w:start w:w="120" w:type="dxa"/>
@@ -8174,7 +8230,6 @@
         <w:tc>
           <w:tcPr>
             <w:tcW w:type="dxa" w:w="5060"/>
-            <w:shd w:fill="FAFBFC"/>
             <w:tcMar>
               <w:top w:w="80" w:type="dxa"/>
               <w:start w:w="120" w:type="dxa"/>
@@ -8205,6 +8260,7 @@
         <w:tc>
           <w:tcPr>
             <w:tcW w:type="dxa" w:w="4300"/>
+            <w:shd w:fill="FAFBFC"/>
             <w:tcMar>
               <w:top w:w="80" w:type="dxa"/>
               <w:start w:w="120" w:type="dxa"/>
@@ -8230,6 +8286,7 @@
         <w:tc>
           <w:tcPr>
             <w:tcW w:type="dxa" w:w="5060"/>
+            <w:shd w:fill="FAFBFC"/>
             <w:tcMar>
               <w:top w:w="80" w:type="dxa"/>
               <w:start w:w="120" w:type="dxa"/>
@@ -8260,7 +8317,6 @@
         <w:tc>
           <w:tcPr>
             <w:tcW w:type="dxa" w:w="4300"/>
-            <w:shd w:fill="FAFBFC"/>
             <w:tcMar>
               <w:top w:w="80" w:type="dxa"/>
               <w:start w:w="120" w:type="dxa"/>
@@ -8286,7 +8342,6 @@
         <w:tc>
           <w:tcPr>
             <w:tcW w:type="dxa" w:w="5060"/>
-            <w:shd w:fill="FAFBFC"/>
             <w:tcMar>
               <w:top w:w="80" w:type="dxa"/>
               <w:start w:w="120" w:type="dxa"/>
@@ -8317,6 +8372,7 @@
         <w:tc>
           <w:tcPr>
             <w:tcW w:type="dxa" w:w="4300"/>
+            <w:shd w:fill="FAFBFC"/>
             <w:tcMar>
               <w:top w:w="80" w:type="dxa"/>
               <w:start w:w="120" w:type="dxa"/>
@@ -8342,6 +8398,7 @@
         <w:tc>
           <w:tcPr>
             <w:tcW w:type="dxa" w:w="5060"/>
+            <w:shd w:fill="FAFBFC"/>
             <w:tcMar>
               <w:top w:w="80" w:type="dxa"/>
               <w:start w:w="120" w:type="dxa"/>
@@ -8372,7 +8429,6 @@
         <w:tc>
           <w:tcPr>
             <w:tcW w:type="dxa" w:w="4300"/>
-            <w:shd w:fill="FAFBFC"/>
             <w:tcMar>
               <w:top w:w="80" w:type="dxa"/>
               <w:start w:w="120" w:type="dxa"/>
@@ -8398,7 +8454,6 @@
         <w:tc>
           <w:tcPr>
             <w:tcW w:type="dxa" w:w="5060"/>
-            <w:shd w:fill="FAFBFC"/>
             <w:tcMar>
               <w:top w:w="80" w:type="dxa"/>
               <w:start w:w="120" w:type="dxa"/>
@@ -8429,6 +8484,7 @@
         <w:tc>
           <w:tcPr>
             <w:tcW w:type="dxa" w:w="4300"/>
+            <w:shd w:fill="FAFBFC"/>
             <w:tcMar>
               <w:top w:w="80" w:type="dxa"/>
               <w:start w:w="120" w:type="dxa"/>
@@ -8454,6 +8510,7 @@
         <w:tc>
           <w:tcPr>
             <w:tcW w:type="dxa" w:w="5060"/>
+            <w:shd w:fill="FAFBFC"/>
             <w:tcMar>
               <w:top w:w="80" w:type="dxa"/>
               <w:start w:w="120" w:type="dxa"/>
@@ -8484,7 +8541,6 @@
         <w:tc>
           <w:tcPr>
             <w:tcW w:type="dxa" w:w="4300"/>
-            <w:shd w:fill="FAFBFC"/>
             <w:tcMar>
               <w:top w:w="80" w:type="dxa"/>
               <w:start w:w="120" w:type="dxa"/>
@@ -8510,7 +8566,6 @@
         <w:tc>
           <w:tcPr>
             <w:tcW w:type="dxa" w:w="5060"/>
-            <w:shd w:fill="FAFBFC"/>
             <w:tcMar>
               <w:top w:w="80" w:type="dxa"/>
               <w:start w:w="120" w:type="dxa"/>
@@ -8541,6 +8596,7 @@
         <w:tc>
           <w:tcPr>
             <w:tcW w:type="dxa" w:w="4300"/>
+            <w:shd w:fill="FAFBFC"/>
             <w:tcMar>
               <w:top w:w="80" w:type="dxa"/>
               <w:start w:w="120" w:type="dxa"/>
@@ -8566,6 +8622,7 @@
         <w:tc>
           <w:tcPr>
             <w:tcW w:type="dxa" w:w="5060"/>
+            <w:shd w:fill="FAFBFC"/>
             <w:tcMar>
               <w:top w:w="80" w:type="dxa"/>
               <w:start w:w="120" w:type="dxa"/>
@@ -8596,7 +8653,6 @@
         <w:tc>
           <w:tcPr>
             <w:tcW w:type="dxa" w:w="4300"/>
-            <w:shd w:fill="FAFBFC"/>
             <w:tcMar>
               <w:top w:w="80" w:type="dxa"/>
               <w:start w:w="120" w:type="dxa"/>
@@ -8622,7 +8678,6 @@
         <w:tc>
           <w:tcPr>
             <w:tcW w:type="dxa" w:w="5060"/>
-            <w:shd w:fill="FAFBFC"/>
             <w:tcMar>
               <w:top w:w="80" w:type="dxa"/>
               <w:start w:w="120" w:type="dxa"/>
@@ -8653,6 +8708,7 @@
         <w:tc>
           <w:tcPr>
             <w:tcW w:type="dxa" w:w="4300"/>
+            <w:shd w:fill="FAFBFC"/>
             <w:tcMar>
               <w:top w:w="80" w:type="dxa"/>
               <w:start w:w="120" w:type="dxa"/>
@@ -8678,6 +8734,7 @@
         <w:tc>
           <w:tcPr>
             <w:tcW w:type="dxa" w:w="5060"/>
+            <w:shd w:fill="FAFBFC"/>
             <w:tcMar>
               <w:top w:w="80" w:type="dxa"/>
               <w:start w:w="120" w:type="dxa"/>
@@ -8708,7 +8765,6 @@
         <w:tc>
           <w:tcPr>
             <w:tcW w:type="dxa" w:w="4300"/>
-            <w:shd w:fill="FAFBFC"/>
             <w:tcMar>
               <w:top w:w="80" w:type="dxa"/>
               <w:start w:w="120" w:type="dxa"/>
@@ -8734,7 +8790,6 @@
         <w:tc>
           <w:tcPr>
             <w:tcW w:type="dxa" w:w="5060"/>
-            <w:shd w:fill="FAFBFC"/>
             <w:tcMar>
               <w:top w:w="80" w:type="dxa"/>
               <w:start w:w="120" w:type="dxa"/>
@@ -8765,6 +8820,7 @@
         <w:tc>
           <w:tcPr>
             <w:tcW w:type="dxa" w:w="4300"/>
+            <w:shd w:fill="FAFBFC"/>
             <w:tcMar>
               <w:top w:w="80" w:type="dxa"/>
               <w:start w:w="120" w:type="dxa"/>
@@ -8790,6 +8846,7 @@
         <w:tc>
           <w:tcPr>
             <w:tcW w:type="dxa" w:w="5060"/>
+            <w:shd w:fill="FAFBFC"/>
             <w:tcMar>
               <w:top w:w="80" w:type="dxa"/>
               <w:start w:w="120" w:type="dxa"/>
@@ -8820,7 +8877,6 @@
         <w:tc>
           <w:tcPr>
             <w:tcW w:type="dxa" w:w="4300"/>
-            <w:shd w:fill="FAFBFC"/>
             <w:tcMar>
               <w:top w:w="80" w:type="dxa"/>
               <w:start w:w="120" w:type="dxa"/>
@@ -8846,7 +8902,6 @@
         <w:tc>
           <w:tcPr>
             <w:tcW w:type="dxa" w:w="5060"/>
-            <w:shd w:fill="FAFBFC"/>
             <w:tcMar>
               <w:top w:w="80" w:type="dxa"/>
               <w:start w:w="120" w:type="dxa"/>
@@ -8877,6 +8932,7 @@
         <w:tc>
           <w:tcPr>
             <w:tcW w:type="dxa" w:w="4300"/>
+            <w:shd w:fill="FAFBFC"/>
             <w:tcMar>
               <w:top w:w="80" w:type="dxa"/>
               <w:start w:w="120" w:type="dxa"/>
@@ -8902,6 +8958,7 @@
         <w:tc>
           <w:tcPr>
             <w:tcW w:type="dxa" w:w="5060"/>
+            <w:shd w:fill="FAFBFC"/>
             <w:tcMar>
               <w:top w:w="80" w:type="dxa"/>
               <w:start w:w="120" w:type="dxa"/>
@@ -8932,7 +8989,6 @@
         <w:tc>
           <w:tcPr>
             <w:tcW w:type="dxa" w:w="4300"/>
-            <w:shd w:fill="FAFBFC"/>
             <w:tcMar>
               <w:top w:w="80" w:type="dxa"/>
               <w:start w:w="120" w:type="dxa"/>
@@ -8958,7 +9014,6 @@
         <w:tc>
           <w:tcPr>
             <w:tcW w:type="dxa" w:w="5060"/>
-            <w:shd w:fill="FAFBFC"/>
             <w:tcMar>
               <w:top w:w="80" w:type="dxa"/>
               <w:start w:w="120" w:type="dxa"/>
@@ -8989,6 +9044,7 @@
         <w:tc>
           <w:tcPr>
             <w:tcW w:type="dxa" w:w="4300"/>
+            <w:shd w:fill="FAFBFC"/>
             <w:tcMar>
               <w:top w:w="80" w:type="dxa"/>
               <w:start w:w="120" w:type="dxa"/>
@@ -9014,6 +9070,7 @@
         <w:tc>
           <w:tcPr>
             <w:tcW w:type="dxa" w:w="5060"/>
+            <w:shd w:fill="FAFBFC"/>
             <w:tcMar>
               <w:top w:w="80" w:type="dxa"/>
               <w:start w:w="120" w:type="dxa"/>
@@ -9044,7 +9101,6 @@
         <w:tc>
           <w:tcPr>
             <w:tcW w:type="dxa" w:w="4300"/>
-            <w:shd w:fill="FAFBFC"/>
             <w:tcMar>
               <w:top w:w="80" w:type="dxa"/>
               <w:start w:w="120" w:type="dxa"/>
@@ -9070,7 +9126,6 @@
         <w:tc>
           <w:tcPr>
             <w:tcW w:type="dxa" w:w="5060"/>
-            <w:shd w:fill="FAFBFC"/>
             <w:tcMar>
               <w:top w:w="80" w:type="dxa"/>
               <w:start w:w="120" w:type="dxa"/>
@@ -9101,6 +9156,7 @@
         <w:tc>
           <w:tcPr>
             <w:tcW w:type="dxa" w:w="4300"/>
+            <w:shd w:fill="FAFBFC"/>
             <w:tcMar>
               <w:top w:w="80" w:type="dxa"/>
               <w:start w:w="120" w:type="dxa"/>
@@ -9126,6 +9182,7 @@
         <w:tc>
           <w:tcPr>
             <w:tcW w:type="dxa" w:w="5060"/>
+            <w:shd w:fill="FAFBFC"/>
             <w:tcMar>
               <w:top w:w="80" w:type="dxa"/>
               <w:start w:w="120" w:type="dxa"/>
@@ -9156,7 +9213,6 @@
         <w:tc>
           <w:tcPr>
             <w:tcW w:type="dxa" w:w="4300"/>
-            <w:shd w:fill="FAFBFC"/>
             <w:tcMar>
               <w:top w:w="80" w:type="dxa"/>
               <w:start w:w="120" w:type="dxa"/>
@@ -9182,7 +9238,6 @@
         <w:tc>
           <w:tcPr>
             <w:tcW w:type="dxa" w:w="5060"/>
-            <w:shd w:fill="FAFBFC"/>
             <w:tcMar>
               <w:top w:w="80" w:type="dxa"/>
               <w:start w:w="120" w:type="dxa"/>
@@ -9213,6 +9268,7 @@
         <w:tc>
           <w:tcPr>
             <w:tcW w:type="dxa" w:w="4300"/>
+            <w:shd w:fill="FAFBFC"/>
             <w:tcMar>
               <w:top w:w="80" w:type="dxa"/>
               <w:start w:w="120" w:type="dxa"/>
@@ -9238,6 +9294,7 @@
         <w:tc>
           <w:tcPr>
             <w:tcW w:type="dxa" w:w="5060"/>
+            <w:shd w:fill="FAFBFC"/>
             <w:tcMar>
               <w:top w:w="80" w:type="dxa"/>
               <w:start w:w="120" w:type="dxa"/>
@@ -9268,7 +9325,6 @@
         <w:tc>
           <w:tcPr>
             <w:tcW w:type="dxa" w:w="4300"/>
-            <w:shd w:fill="FAFBFC"/>
             <w:tcMar>
               <w:top w:w="80" w:type="dxa"/>
               <w:start w:w="120" w:type="dxa"/>
@@ -9294,7 +9350,6 @@
         <w:tc>
           <w:tcPr>
             <w:tcW w:type="dxa" w:w="5060"/>
-            <w:shd w:fill="FAFBFC"/>
             <w:tcMar>
               <w:top w:w="80" w:type="dxa"/>
               <w:start w:w="120" w:type="dxa"/>
@@ -10070,7 +10125,7 @@
         <w:color w:val="64748B"/>
         <w:sz w:val="17"/>
       </w:rPr>
-      <w:t xml:space="preserve">v0.11.4-poc  |  </w:t>
+      <w:t xml:space="preserve">v0.11.5-poc  |  </w:t>
     </w:r>
     <w:r>
       <w:rPr>
@@ -10101,7 +10156,7 @@
         <w:color w:val="64748B"/>
         <w:sz w:val="17"/>
       </w:rPr>
-      <w:t>v0.11.4-poc  |  2026-08-05</w:t>
+      <w:t>v0.11.5-poc  |  2026-08-11</w:t>
     </w:r>
   </w:p>
 </w:ftr>

</xml_diff>

<commit_message>
Harden Agent file activation updates
</commit_message>
<xml_diff>
--- a/docs/SamsungSwitchWatch_User_Manual_KO.docx
+++ b/docs/SamsungSwitchWatch_User_Manual_KO.docx
@@ -1159,7 +1159,7 @@
           <w:color w:val="16324F"/>
           <w:sz w:val="21"/>
         </w:rPr>
-        <w:t>0.11.5-poc는 코드 서명되지 않은 시험판입니다. 압축을 풀기 전에 Agent와 Viewer ZIP의 SHA-256을 해당 GitHub Release 본문에 표시된 값과 비교하고 사내 보안 반입 절차를 완료하세요. SmartScreen 또는 EDR 경고를 우회하지 않습니다.</w:t>
+        <w:t>0.11.6-poc는 코드 서명되지 않은 시험판입니다. 압축을 풀기 전에 Agent와 Viewer ZIP의 SHA-256을 해당 GitHub Release 본문에 표시된 값과 비교하고 사내 보안 반입 절차를 완료하세요. SmartScreen 또는 EDR 경고를 우회하지 않습니다.</w:t>
       </w:r>
     </w:p>
     <w:p>
@@ -1648,6 +1648,35 @@
           <w:sz w:val="21"/>
         </w:rPr>
         <w:t>Setup은 BUILD-MANIFEST.json과 Agent 실행 파일 SHA-256을 확인하고, Program Files의 임시 staging에 복사한 파일을 다시 검사한 뒤 교체합니다. 패키지·파일·서비스 변경 자체가 실패한 경우에만 설치 전 상태로 되돌리기를 시도합니다. 서비스가 설치·시작된 뒤 로컬 HTTPS/API/버전 또는 방화벽 준비 상태를 확인하지 못한 경우에는 설치를 되돌리지 않고 AGENT_LOCAL_CONNECTION_UNCONFIRMED 경고로 남깁니다. 다음 실행에서 완료되지 않은 journal이 남아 있으면 자동 복구하지 않고 별도의 '이전 상태 복구' 작업을 요구합니다. 검사 중에는 현재 서비스 PID와 TCP/18443 소유를 매번 다시 확인합니다. rollback 전에는 관찰한 서비스 프로세스 종료를 확인하고 프로그램 폴더의 일시적 잠금만 최대 5회 제한적으로 재시도합니다. staging·backup·failed·journal 정리가 잠시 실패하면 정확히 검증된 대상만 최대 3회 시도하고 실패한 시도 사이 250ms 대기한 뒤 삭제 결과를 확인합니다. 변경 자체의 복구까지 실패하면 최초 설치 실패 코드를 별도로 유지하고 SETUP_ROLLBACK_FAILED와 실패한 ROLLBACK_* 단계를 함께 표시합니다.</w:t>
+      </w:r>
+    </w:p>
+    <w:p>
+      <w:pPr>
+        <w:keepLines/>
+        <w:pageBreakBefore w:val="0"/>
+        <w:spacing w:before="80" w:after="160" w:line="283" w:lineRule="auto"/>
+        <w:ind w:left="115" w:right="58"/>
+        <w:shd w:fill="FFF8E8"/>
+        <w:pBdr>
+          <w:left w:val="single" w:sz="16" w:space="8" w:color="8A5A00"/>
+        </w:pBdr>
+      </w:pPr>
+      <w:r>
+        <w:rPr>
+          <w:rFonts w:ascii="맑은 고딕" w:hAnsi="맑은 고딕" w:eastAsia="맑은 고딕" w:cs="맑은 고딕"/>
+          <w:b/>
+          <w:color w:val="8A5A00"/>
+          <w:sz w:val="21"/>
+        </w:rPr>
+        <w:t xml:space="preserve">Agent 파일 활성화가 잠시 막힌 경우  </w:t>
+      </w:r>
+      <w:r>
+        <w:rPr>
+          <w:rFonts w:ascii="맑은 고딕" w:hAnsi="맑은 고딕" w:eastAsia="맑은 고딕" w:cs="맑은 고딕"/>
+          <w:color w:val="16324F"/>
+          <w:sz w:val="21"/>
+        </w:rPr>
+        <w:t>업데이트 중 기존 Agent 폴더를 backup으로 옮기는 단계와 검증된 staging을 설치 위치로 활성화하는 단계는 각각 최대 5회만 시도하고, 실패한 시도 사이에만 250ms 대기합니다. 계속 실패하면 SETUP_BACKUP_MOVE_FAILED 또는 SETUP_FILE_ACTIVATION_FAILED로 구분하고 기존 rollback을 수행합니다. 제품 폴더를 수동으로 이동·삭제하지 말고 화면의 rollback 또는 '이전 상태 복구' 결과를 먼저 확인하세요. backup 이동 뒤 관리자 전용 ACL 강화만 실패한 SETUP_BACKUP_ACCESS_WARNING은 설치를 중단하지 않는 경고입니다. 새 Agent 실행과 준비 상태를 확인하고 backup 권한을 임의로 넓히지 마세요.</w:t>
       </w:r>
     </w:p>
     <w:p>
@@ -2352,7 +2381,7 @@
           <w:color w:val="16324F"/>
           <w:sz w:val="21"/>
         </w:rPr>
-        <w:t>Agent Setup에 AGENT_LOCAL_CONNECTION_UNCONFIRMED 또는 FIREWALL_REMOTE_ACCESS_UNCONFIRMED가 표시되면 Agent 서비스와 프로그램은 설치됐지만 연결 준비를 확인하지 못했다는 뜻입니다. Viewer에서 연결 테스트를 실행하고, TCP/18443이 실패할 때 Windows 관리자에게 확인하세요. 규칙을 AGENT_CONNECTION_REFUSED가 보이면 Viewer에 스위치 IP나 localhost가 아니라 Agent를 설치한 PC의 실제 주소를 입력했는지 먼저 확인하세요. 같은 PC 시험에서는 해당 PC의 사설 IPv4 또는 localhost를 사용할 수 있습니다. 그 다음 Windows 서비스에서 SamsungSwitchWatchAgent가 Running인지 확인하고 TCP/18443을 점검합니다. TCP 단계는 성공하고 HTTPS 단계가 실패하면 방화벽이 아니라 Agent PC의 로컬 HTTPS/TLS 준비 상태를 확인합니다. AGENT_CLIENT_NOT_ALLOWED이면 Viewer 주소가 RFC1918 사설 범위인지 확인합니다. 서비스를 수동 등록하지 말고 0.11.5-poc Agent Setup을 사용하세요.</w:t>
+        <w:t>Agent Setup에 AGENT_LOCAL_CONNECTION_UNCONFIRMED 또는 FIREWALL_REMOTE_ACCESS_UNCONFIRMED가 표시되면 Agent 서비스와 프로그램은 설치됐지만 연결 준비를 확인하지 못했다는 뜻입니다. Viewer에서 연결 테스트를 실행하고, TCP/18443이 실패할 때 Windows 관리자에게 확인하세요. 규칙을 AGENT_CONNECTION_REFUSED가 보이면 Viewer에 스위치 IP나 localhost가 아니라 Agent를 설치한 PC의 실제 주소를 입력했는지 먼저 확인하세요. 같은 PC 시험에서는 해당 PC의 사설 IPv4 또는 localhost를 사용할 수 있습니다. 그 다음 Windows 서비스에서 SamsungSwitchWatchAgent가 Running인지 확인하고 TCP/18443을 점검합니다. TCP 단계는 성공하고 HTTPS 단계가 실패하면 방화벽이 아니라 Agent PC의 로컬 HTTPS/TLS 준비 상태를 확인합니다. AGENT_CLIENT_NOT_ALLOWED이면 Viewer 주소가 RFC1918 사설 범위인지 확인합니다. 서비스를 수동 등록하지 말고 0.11.6-poc Agent Setup을 사용하세요.</w:t>
       </w:r>
     </w:p>
     <w:p>
@@ -2514,7 +2543,7 @@
           <w:color w:val="16324F"/>
           <w:sz w:val="21"/>
         </w:rPr>
-        <w:t>0.11.5-poc는 코드 서명되지 않아 SmartScreen이나 사내 EDR이 차단할 수 있습니다. ZIP을 완전히 압축 해제하고 Setup, Viewer EXE와 제공된 DLL이 같은 폴더에 있는지 확인하세요. EDR·AppLocker·WDAC가 차단하면 우회하지 말고 공식 ZIP의 버전·해시와 차단 기록을 보안 담당자에게 전달하세요.</w:t>
+        <w:t>0.11.6-poc는 코드 서명되지 않아 SmartScreen이나 사내 EDR이 차단할 수 있습니다. ZIP을 완전히 압축 해제하고 Setup, Viewer EXE와 제공된 DLL이 같은 폴더에 있는지 확인하세요. EDR·AppLocker·WDAC가 차단하면 우회하지 말고 공식 ZIP의 버전·해시와 차단 기록을 보안 담당자에게 전달하세요.</w:t>
       </w:r>
     </w:p>
     <w:p>
@@ -7047,6 +7076,174 @@
                 <w:rFonts w:ascii="맑은 고딕" w:hAnsi="맑은 고딕" w:eastAsia="맑은 고딕" w:cs="맑은 고딕"/>
                 <w:sz w:val="16"/>
               </w:rPr>
+              <w:t>SETUP_BACKUP_MOVE_FAILED</w:t>
+            </w:r>
+          </w:p>
+        </w:tc>
+        <w:tc>
+          <w:tcPr>
+            <w:tcW w:type="dxa" w:w="5060"/>
+            <w:shd w:fill="FAFBFC"/>
+            <w:tcMar>
+              <w:top w:w="80" w:type="dxa"/>
+              <w:start w:w="120" w:type="dxa"/>
+              <w:bottom w:w="80" w:type="dxa"/>
+              <w:end w:w="120" w:type="dxa"/>
+            </w:tcMar>
+            <w:vAlign w:val="center"/>
+          </w:tcPr>
+          <w:p>
+            <w:pPr>
+              <w:spacing w:before="0" w:after="0" w:line="240" w:lineRule="auto"/>
+              <w:jc w:val="left"/>
+            </w:pPr>
+            <w:r>
+              <w:rPr>
+                <w:rFonts w:ascii="맑은 고딕" w:hAnsi="맑은 고딕" w:eastAsia="맑은 고딕" w:cs="맑은 고딕"/>
+                <w:sz w:val="16"/>
+              </w:rPr>
+              <w:t>기존 Agent→backup 이동이 5회 안에 끝나지 않음 → rollback 결과 확인 → 제품 폴더 수동 이동·삭제 금지</w:t>
+            </w:r>
+          </w:p>
+        </w:tc>
+      </w:tr>
+      <w:tr>
+        <w:trPr>
+          <w:cantSplit w:val="true"/>
+        </w:trPr>
+        <w:tc>
+          <w:tcPr>
+            <w:tcW w:type="dxa" w:w="4300"/>
+            <w:tcMar>
+              <w:top w:w="80" w:type="dxa"/>
+              <w:start w:w="120" w:type="dxa"/>
+              <w:bottom w:w="80" w:type="dxa"/>
+              <w:end w:w="120" w:type="dxa"/>
+            </w:tcMar>
+            <w:vAlign w:val="center"/>
+          </w:tcPr>
+          <w:p>
+            <w:pPr>
+              <w:spacing w:before="0" w:after="0" w:line="240" w:lineRule="auto"/>
+              <w:jc w:val="left"/>
+            </w:pPr>
+            <w:r>
+              <w:rPr>
+                <w:rFonts w:ascii="맑은 고딕" w:hAnsi="맑은 고딕" w:eastAsia="맑은 고딕" w:cs="맑은 고딕"/>
+                <w:sz w:val="16"/>
+              </w:rPr>
+              <w:t>SETUP_FILE_ACTIVATION_FAILED</w:t>
+            </w:r>
+          </w:p>
+        </w:tc>
+        <w:tc>
+          <w:tcPr>
+            <w:tcW w:type="dxa" w:w="5060"/>
+            <w:tcMar>
+              <w:top w:w="80" w:type="dxa"/>
+              <w:start w:w="120" w:type="dxa"/>
+              <w:bottom w:w="80" w:type="dxa"/>
+              <w:end w:w="120" w:type="dxa"/>
+            </w:tcMar>
+            <w:vAlign w:val="center"/>
+          </w:tcPr>
+          <w:p>
+            <w:pPr>
+              <w:spacing w:before="0" w:after="0" w:line="240" w:lineRule="auto"/>
+              <w:jc w:val="left"/>
+            </w:pPr>
+            <w:r>
+              <w:rPr>
+                <w:rFonts w:ascii="맑은 고딕" w:hAnsi="맑은 고딕" w:eastAsia="맑은 고딕" w:cs="맑은 고딕"/>
+                <w:sz w:val="16"/>
+              </w:rPr>
+              <w:t>staging→설치 위치 활성화가 5회 안에 끝나지 않음 → 이전 Agent 복원 또는 이전 상태 복구 결과 확인</w:t>
+            </w:r>
+          </w:p>
+        </w:tc>
+      </w:tr>
+      <w:tr>
+        <w:trPr>
+          <w:cantSplit w:val="true"/>
+        </w:trPr>
+        <w:tc>
+          <w:tcPr>
+            <w:tcW w:type="dxa" w:w="4300"/>
+            <w:shd w:fill="FAFBFC"/>
+            <w:tcMar>
+              <w:top w:w="80" w:type="dxa"/>
+              <w:start w:w="120" w:type="dxa"/>
+              <w:bottom w:w="80" w:type="dxa"/>
+              <w:end w:w="120" w:type="dxa"/>
+            </w:tcMar>
+            <w:vAlign w:val="center"/>
+          </w:tcPr>
+          <w:p>
+            <w:pPr>
+              <w:spacing w:before="0" w:after="0" w:line="240" w:lineRule="auto"/>
+              <w:jc w:val="left"/>
+            </w:pPr>
+            <w:r>
+              <w:rPr>
+                <w:rFonts w:ascii="맑은 고딕" w:hAnsi="맑은 고딕" w:eastAsia="맑은 고딕" w:cs="맑은 고딕"/>
+                <w:sz w:val="16"/>
+              </w:rPr>
+              <w:t>SETUP_BACKUP_ACCESS_WARNING</w:t>
+            </w:r>
+          </w:p>
+        </w:tc>
+        <w:tc>
+          <w:tcPr>
+            <w:tcW w:type="dxa" w:w="5060"/>
+            <w:shd w:fill="FAFBFC"/>
+            <w:tcMar>
+              <w:top w:w="80" w:type="dxa"/>
+              <w:start w:w="120" w:type="dxa"/>
+              <w:bottom w:w="80" w:type="dxa"/>
+              <w:end w:w="120" w:type="dxa"/>
+            </w:tcMar>
+            <w:vAlign w:val="center"/>
+          </w:tcPr>
+          <w:p>
+            <w:pPr>
+              <w:spacing w:before="0" w:after="0" w:line="240" w:lineRule="auto"/>
+              <w:jc w:val="left"/>
+            </w:pPr>
+            <w:r>
+              <w:rPr>
+                <w:rFonts w:ascii="맑은 고딕" w:hAnsi="맑은 고딕" w:eastAsia="맑은 고딕" w:cs="맑은 고딕"/>
+                <w:sz w:val="16"/>
+              </w:rPr>
+              <w:t>backup 관리자 전용 ACL 강화만 실패한 경고 → 설치 성공과 새 Agent 실행 확인 → backup 권한 임의 확대 금지</w:t>
+            </w:r>
+          </w:p>
+        </w:tc>
+      </w:tr>
+      <w:tr>
+        <w:trPr>
+          <w:cantSplit w:val="true"/>
+        </w:trPr>
+        <w:tc>
+          <w:tcPr>
+            <w:tcW w:type="dxa" w:w="4300"/>
+            <w:tcMar>
+              <w:top w:w="80" w:type="dxa"/>
+              <w:start w:w="120" w:type="dxa"/>
+              <w:bottom w:w="80" w:type="dxa"/>
+              <w:end w:w="120" w:type="dxa"/>
+            </w:tcMar>
+            <w:vAlign w:val="center"/>
+          </w:tcPr>
+          <w:p>
+            <w:pPr>
+              <w:spacing w:before="0" w:after="0" w:line="240" w:lineRule="auto"/>
+              <w:jc w:val="left"/>
+            </w:pPr>
+            <w:r>
+              <w:rPr>
+                <w:rFonts w:ascii="맑은 고딕" w:hAnsi="맑은 고딕" w:eastAsia="맑은 고딕" w:cs="맑은 고딕"/>
+                <w:sz w:val="16"/>
+              </w:rPr>
               <w:t>SETUP_PATH_NOT_WRITABLE</w:t>
             </w:r>
           </w:p>
@@ -7054,7 +7251,6 @@
         <w:tc>
           <w:tcPr>
             <w:tcW w:type="dxa" w:w="5060"/>
-            <w:shd w:fill="FAFBFC"/>
             <w:tcMar>
               <w:top w:w="80" w:type="dxa"/>
               <w:start w:w="120" w:type="dxa"/>
@@ -7085,6 +7281,7 @@
         <w:tc>
           <w:tcPr>
             <w:tcW w:type="dxa" w:w="4300"/>
+            <w:shd w:fill="FAFBFC"/>
             <w:tcMar>
               <w:top w:w="80" w:type="dxa"/>
               <w:start w:w="120" w:type="dxa"/>
@@ -7110,6 +7307,7 @@
         <w:tc>
           <w:tcPr>
             <w:tcW w:type="dxa" w:w="5060"/>
+            <w:shd w:fill="FAFBFC"/>
             <w:tcMar>
               <w:top w:w="80" w:type="dxa"/>
               <w:start w:w="120" w:type="dxa"/>
@@ -7140,7 +7338,6 @@
         <w:tc>
           <w:tcPr>
             <w:tcW w:type="dxa" w:w="4300"/>
-            <w:shd w:fill="FAFBFC"/>
             <w:tcMar>
               <w:top w:w="80" w:type="dxa"/>
               <w:start w:w="120" w:type="dxa"/>
@@ -7166,7 +7363,6 @@
         <w:tc>
           <w:tcPr>
             <w:tcW w:type="dxa" w:w="5060"/>
-            <w:shd w:fill="FAFBFC"/>
             <w:tcMar>
               <w:top w:w="80" w:type="dxa"/>
               <w:start w:w="120" w:type="dxa"/>
@@ -7197,6 +7393,7 @@
         <w:tc>
           <w:tcPr>
             <w:tcW w:type="dxa" w:w="4300"/>
+            <w:shd w:fill="FAFBFC"/>
             <w:tcMar>
               <w:top w:w="80" w:type="dxa"/>
               <w:start w:w="120" w:type="dxa"/>
@@ -7222,6 +7419,7 @@
         <w:tc>
           <w:tcPr>
             <w:tcW w:type="dxa" w:w="5060"/>
+            <w:shd w:fill="FAFBFC"/>
             <w:tcMar>
               <w:top w:w="80" w:type="dxa"/>
               <w:start w:w="120" w:type="dxa"/>
@@ -7252,7 +7450,6 @@
         <w:tc>
           <w:tcPr>
             <w:tcW w:type="dxa" w:w="4300"/>
-            <w:shd w:fill="FAFBFC"/>
             <w:tcMar>
               <w:top w:w="80" w:type="dxa"/>
               <w:start w:w="120" w:type="dxa"/>
@@ -7278,7 +7475,6 @@
         <w:tc>
           <w:tcPr>
             <w:tcW w:type="dxa" w:w="5060"/>
-            <w:shd w:fill="FAFBFC"/>
             <w:tcMar>
               <w:top w:w="80" w:type="dxa"/>
               <w:start w:w="120" w:type="dxa"/>
@@ -7309,6 +7505,7 @@
         <w:tc>
           <w:tcPr>
             <w:tcW w:type="dxa" w:w="4300"/>
+            <w:shd w:fill="FAFBFC"/>
             <w:tcMar>
               <w:top w:w="80" w:type="dxa"/>
               <w:start w:w="120" w:type="dxa"/>
@@ -7334,6 +7531,7 @@
         <w:tc>
           <w:tcPr>
             <w:tcW w:type="dxa" w:w="5060"/>
+            <w:shd w:fill="FAFBFC"/>
             <w:tcMar>
               <w:top w:w="80" w:type="dxa"/>
               <w:start w:w="120" w:type="dxa"/>
@@ -7364,7 +7562,6 @@
         <w:tc>
           <w:tcPr>
             <w:tcW w:type="dxa" w:w="4300"/>
-            <w:shd w:fill="FAFBFC"/>
             <w:tcMar>
               <w:top w:w="80" w:type="dxa"/>
               <w:start w:w="120" w:type="dxa"/>
@@ -7390,7 +7587,6 @@
         <w:tc>
           <w:tcPr>
             <w:tcW w:type="dxa" w:w="5060"/>
-            <w:shd w:fill="FAFBFC"/>
             <w:tcMar>
               <w:top w:w="80" w:type="dxa"/>
               <w:start w:w="120" w:type="dxa"/>
@@ -7421,6 +7617,7 @@
         <w:tc>
           <w:tcPr>
             <w:tcW w:type="dxa" w:w="4300"/>
+            <w:shd w:fill="FAFBFC"/>
             <w:tcMar>
               <w:top w:w="80" w:type="dxa"/>
               <w:start w:w="120" w:type="dxa"/>
@@ -7446,6 +7643,7 @@
         <w:tc>
           <w:tcPr>
             <w:tcW w:type="dxa" w:w="5060"/>
+            <w:shd w:fill="FAFBFC"/>
             <w:tcMar>
               <w:top w:w="80" w:type="dxa"/>
               <w:start w:w="120" w:type="dxa"/>
@@ -7476,7 +7674,6 @@
         <w:tc>
           <w:tcPr>
             <w:tcW w:type="dxa" w:w="4300"/>
-            <w:shd w:fill="FAFBFC"/>
             <w:tcMar>
               <w:top w:w="80" w:type="dxa"/>
               <w:start w:w="120" w:type="dxa"/>
@@ -7502,7 +7699,6 @@
         <w:tc>
           <w:tcPr>
             <w:tcW w:type="dxa" w:w="5060"/>
-            <w:shd w:fill="FAFBFC"/>
             <w:tcMar>
               <w:top w:w="80" w:type="dxa"/>
               <w:start w:w="120" w:type="dxa"/>
@@ -7533,6 +7729,7 @@
         <w:tc>
           <w:tcPr>
             <w:tcW w:type="dxa" w:w="4300"/>
+            <w:shd w:fill="FAFBFC"/>
             <w:tcMar>
               <w:top w:w="80" w:type="dxa"/>
               <w:start w:w="120" w:type="dxa"/>
@@ -7558,6 +7755,7 @@
         <w:tc>
           <w:tcPr>
             <w:tcW w:type="dxa" w:w="5060"/>
+            <w:shd w:fill="FAFBFC"/>
             <w:tcMar>
               <w:top w:w="80" w:type="dxa"/>
               <w:start w:w="120" w:type="dxa"/>
@@ -7588,7 +7786,6 @@
         <w:tc>
           <w:tcPr>
             <w:tcW w:type="dxa" w:w="4300"/>
-            <w:shd w:fill="FAFBFC"/>
             <w:tcMar>
               <w:top w:w="80" w:type="dxa"/>
               <w:start w:w="120" w:type="dxa"/>
@@ -7614,7 +7811,6 @@
         <w:tc>
           <w:tcPr>
             <w:tcW w:type="dxa" w:w="5060"/>
-            <w:shd w:fill="FAFBFC"/>
             <w:tcMar>
               <w:top w:w="80" w:type="dxa"/>
               <w:start w:w="120" w:type="dxa"/>
@@ -7645,6 +7841,7 @@
         <w:tc>
           <w:tcPr>
             <w:tcW w:type="dxa" w:w="4300"/>
+            <w:shd w:fill="FAFBFC"/>
             <w:tcMar>
               <w:top w:w="80" w:type="dxa"/>
               <w:start w:w="120" w:type="dxa"/>
@@ -7670,6 +7867,7 @@
         <w:tc>
           <w:tcPr>
             <w:tcW w:type="dxa" w:w="5060"/>
+            <w:shd w:fill="FAFBFC"/>
             <w:tcMar>
               <w:top w:w="80" w:type="dxa"/>
               <w:start w:w="120" w:type="dxa"/>
@@ -7700,7 +7898,6 @@
         <w:tc>
           <w:tcPr>
             <w:tcW w:type="dxa" w:w="4300"/>
-            <w:shd w:fill="FAFBFC"/>
             <w:tcMar>
               <w:top w:w="80" w:type="dxa"/>
               <w:start w:w="120" w:type="dxa"/>
@@ -7726,7 +7923,6 @@
         <w:tc>
           <w:tcPr>
             <w:tcW w:type="dxa" w:w="5060"/>
-            <w:shd w:fill="FAFBFC"/>
             <w:tcMar>
               <w:top w:w="80" w:type="dxa"/>
               <w:start w:w="120" w:type="dxa"/>
@@ -7757,6 +7953,7 @@
         <w:tc>
           <w:tcPr>
             <w:tcW w:type="dxa" w:w="4300"/>
+            <w:shd w:fill="FAFBFC"/>
             <w:tcMar>
               <w:top w:w="80" w:type="dxa"/>
               <w:start w:w="120" w:type="dxa"/>
@@ -7782,6 +7979,7 @@
         <w:tc>
           <w:tcPr>
             <w:tcW w:type="dxa" w:w="5060"/>
+            <w:shd w:fill="FAFBFC"/>
             <w:tcMar>
               <w:top w:w="80" w:type="dxa"/>
               <w:start w:w="120" w:type="dxa"/>
@@ -7812,7 +8010,6 @@
         <w:tc>
           <w:tcPr>
             <w:tcW w:type="dxa" w:w="4300"/>
-            <w:shd w:fill="FAFBFC"/>
             <w:tcMar>
               <w:top w:w="80" w:type="dxa"/>
               <w:start w:w="120" w:type="dxa"/>
@@ -7838,7 +8035,6 @@
         <w:tc>
           <w:tcPr>
             <w:tcW w:type="dxa" w:w="5060"/>
-            <w:shd w:fill="FAFBFC"/>
             <w:tcMar>
               <w:top w:w="80" w:type="dxa"/>
               <w:start w:w="120" w:type="dxa"/>
@@ -7869,6 +8065,7 @@
         <w:tc>
           <w:tcPr>
             <w:tcW w:type="dxa" w:w="4300"/>
+            <w:shd w:fill="FAFBFC"/>
             <w:tcMar>
               <w:top w:w="80" w:type="dxa"/>
               <w:start w:w="120" w:type="dxa"/>
@@ -7894,6 +8091,7 @@
         <w:tc>
           <w:tcPr>
             <w:tcW w:type="dxa" w:w="5060"/>
+            <w:shd w:fill="FAFBFC"/>
             <w:tcMar>
               <w:top w:w="80" w:type="dxa"/>
               <w:start w:w="120" w:type="dxa"/>
@@ -7924,7 +8122,6 @@
         <w:tc>
           <w:tcPr>
             <w:tcW w:type="dxa" w:w="4300"/>
-            <w:shd w:fill="FAFBFC"/>
             <w:tcMar>
               <w:top w:w="80" w:type="dxa"/>
               <w:start w:w="120" w:type="dxa"/>
@@ -7950,7 +8147,6 @@
         <w:tc>
           <w:tcPr>
             <w:tcW w:type="dxa" w:w="5060"/>
-            <w:shd w:fill="FAFBFC"/>
             <w:tcMar>
               <w:top w:w="80" w:type="dxa"/>
               <w:start w:w="120" w:type="dxa"/>
@@ -7981,6 +8177,7 @@
         <w:tc>
           <w:tcPr>
             <w:tcW w:type="dxa" w:w="4300"/>
+            <w:shd w:fill="FAFBFC"/>
             <w:tcMar>
               <w:top w:w="80" w:type="dxa"/>
               <w:start w:w="120" w:type="dxa"/>
@@ -8006,6 +8203,7 @@
         <w:tc>
           <w:tcPr>
             <w:tcW w:type="dxa" w:w="5060"/>
+            <w:shd w:fill="FAFBFC"/>
             <w:tcMar>
               <w:top w:w="80" w:type="dxa"/>
               <w:start w:w="120" w:type="dxa"/>
@@ -8036,7 +8234,6 @@
         <w:tc>
           <w:tcPr>
             <w:tcW w:type="dxa" w:w="4300"/>
-            <w:shd w:fill="FAFBFC"/>
             <w:tcMar>
               <w:top w:w="80" w:type="dxa"/>
               <w:start w:w="120" w:type="dxa"/>
@@ -8062,7 +8259,6 @@
         <w:tc>
           <w:tcPr>
             <w:tcW w:type="dxa" w:w="5060"/>
-            <w:shd w:fill="FAFBFC"/>
             <w:tcMar>
               <w:top w:w="80" w:type="dxa"/>
               <w:start w:w="120" w:type="dxa"/>
@@ -8093,6 +8289,7 @@
         <w:tc>
           <w:tcPr>
             <w:tcW w:type="dxa" w:w="4300"/>
+            <w:shd w:fill="FAFBFC"/>
             <w:tcMar>
               <w:top w:w="80" w:type="dxa"/>
               <w:start w:w="120" w:type="dxa"/>
@@ -8118,6 +8315,7 @@
         <w:tc>
           <w:tcPr>
             <w:tcW w:type="dxa" w:w="5060"/>
+            <w:shd w:fill="FAFBFC"/>
             <w:tcMar>
               <w:top w:w="80" w:type="dxa"/>
               <w:start w:w="120" w:type="dxa"/>
@@ -8148,7 +8346,6 @@
         <w:tc>
           <w:tcPr>
             <w:tcW w:type="dxa" w:w="4300"/>
-            <w:shd w:fill="FAFBFC"/>
             <w:tcMar>
               <w:top w:w="80" w:type="dxa"/>
               <w:start w:w="120" w:type="dxa"/>
@@ -8174,7 +8371,6 @@
         <w:tc>
           <w:tcPr>
             <w:tcW w:type="dxa" w:w="5060"/>
-            <w:shd w:fill="FAFBFC"/>
             <w:tcMar>
               <w:top w:w="80" w:type="dxa"/>
               <w:start w:w="120" w:type="dxa"/>
@@ -8205,6 +8401,7 @@
         <w:tc>
           <w:tcPr>
             <w:tcW w:type="dxa" w:w="4300"/>
+            <w:shd w:fill="FAFBFC"/>
             <w:tcMar>
               <w:top w:w="80" w:type="dxa"/>
               <w:start w:w="120" w:type="dxa"/>
@@ -8230,6 +8427,7 @@
         <w:tc>
           <w:tcPr>
             <w:tcW w:type="dxa" w:w="5060"/>
+            <w:shd w:fill="FAFBFC"/>
             <w:tcMar>
               <w:top w:w="80" w:type="dxa"/>
               <w:start w:w="120" w:type="dxa"/>
@@ -8260,7 +8458,6 @@
         <w:tc>
           <w:tcPr>
             <w:tcW w:type="dxa" w:w="4300"/>
-            <w:shd w:fill="FAFBFC"/>
             <w:tcMar>
               <w:top w:w="80" w:type="dxa"/>
               <w:start w:w="120" w:type="dxa"/>
@@ -8286,7 +8483,6 @@
         <w:tc>
           <w:tcPr>
             <w:tcW w:type="dxa" w:w="5060"/>
-            <w:shd w:fill="FAFBFC"/>
             <w:tcMar>
               <w:top w:w="80" w:type="dxa"/>
               <w:start w:w="120" w:type="dxa"/>
@@ -8317,6 +8513,7 @@
         <w:tc>
           <w:tcPr>
             <w:tcW w:type="dxa" w:w="4300"/>
+            <w:shd w:fill="FAFBFC"/>
             <w:tcMar>
               <w:top w:w="80" w:type="dxa"/>
               <w:start w:w="120" w:type="dxa"/>
@@ -8342,6 +8539,7 @@
         <w:tc>
           <w:tcPr>
             <w:tcW w:type="dxa" w:w="5060"/>
+            <w:shd w:fill="FAFBFC"/>
             <w:tcMar>
               <w:top w:w="80" w:type="dxa"/>
               <w:start w:w="120" w:type="dxa"/>
@@ -8372,7 +8570,6 @@
         <w:tc>
           <w:tcPr>
             <w:tcW w:type="dxa" w:w="4300"/>
-            <w:shd w:fill="FAFBFC"/>
             <w:tcMar>
               <w:top w:w="80" w:type="dxa"/>
               <w:start w:w="120" w:type="dxa"/>
@@ -8398,7 +8595,6 @@
         <w:tc>
           <w:tcPr>
             <w:tcW w:type="dxa" w:w="5060"/>
-            <w:shd w:fill="FAFBFC"/>
             <w:tcMar>
               <w:top w:w="80" w:type="dxa"/>
               <w:start w:w="120" w:type="dxa"/>
@@ -8429,6 +8625,7 @@
         <w:tc>
           <w:tcPr>
             <w:tcW w:type="dxa" w:w="4300"/>
+            <w:shd w:fill="FAFBFC"/>
             <w:tcMar>
               <w:top w:w="80" w:type="dxa"/>
               <w:start w:w="120" w:type="dxa"/>
@@ -8454,6 +8651,7 @@
         <w:tc>
           <w:tcPr>
             <w:tcW w:type="dxa" w:w="5060"/>
+            <w:shd w:fill="FAFBFC"/>
             <w:tcMar>
               <w:top w:w="80" w:type="dxa"/>
               <w:start w:w="120" w:type="dxa"/>
@@ -8484,7 +8682,6 @@
         <w:tc>
           <w:tcPr>
             <w:tcW w:type="dxa" w:w="4300"/>
-            <w:shd w:fill="FAFBFC"/>
             <w:tcMar>
               <w:top w:w="80" w:type="dxa"/>
               <w:start w:w="120" w:type="dxa"/>
@@ -8510,7 +8707,6 @@
         <w:tc>
           <w:tcPr>
             <w:tcW w:type="dxa" w:w="5060"/>
-            <w:shd w:fill="FAFBFC"/>
             <w:tcMar>
               <w:top w:w="80" w:type="dxa"/>
               <w:start w:w="120" w:type="dxa"/>
@@ -8541,6 +8737,7 @@
         <w:tc>
           <w:tcPr>
             <w:tcW w:type="dxa" w:w="4300"/>
+            <w:shd w:fill="FAFBFC"/>
             <w:tcMar>
               <w:top w:w="80" w:type="dxa"/>
               <w:start w:w="120" w:type="dxa"/>
@@ -8566,6 +8763,7 @@
         <w:tc>
           <w:tcPr>
             <w:tcW w:type="dxa" w:w="5060"/>
+            <w:shd w:fill="FAFBFC"/>
             <w:tcMar>
               <w:top w:w="80" w:type="dxa"/>
               <w:start w:w="120" w:type="dxa"/>
@@ -8596,7 +8794,6 @@
         <w:tc>
           <w:tcPr>
             <w:tcW w:type="dxa" w:w="4300"/>
-            <w:shd w:fill="FAFBFC"/>
             <w:tcMar>
               <w:top w:w="80" w:type="dxa"/>
               <w:start w:w="120" w:type="dxa"/>
@@ -8622,7 +8819,6 @@
         <w:tc>
           <w:tcPr>
             <w:tcW w:type="dxa" w:w="5060"/>
-            <w:shd w:fill="FAFBFC"/>
             <w:tcMar>
               <w:top w:w="80" w:type="dxa"/>
               <w:start w:w="120" w:type="dxa"/>
@@ -8653,6 +8849,7 @@
         <w:tc>
           <w:tcPr>
             <w:tcW w:type="dxa" w:w="4300"/>
+            <w:shd w:fill="FAFBFC"/>
             <w:tcMar>
               <w:top w:w="80" w:type="dxa"/>
               <w:start w:w="120" w:type="dxa"/>
@@ -8678,6 +8875,7 @@
         <w:tc>
           <w:tcPr>
             <w:tcW w:type="dxa" w:w="5060"/>
+            <w:shd w:fill="FAFBFC"/>
             <w:tcMar>
               <w:top w:w="80" w:type="dxa"/>
               <w:start w:w="120" w:type="dxa"/>
@@ -8708,7 +8906,6 @@
         <w:tc>
           <w:tcPr>
             <w:tcW w:type="dxa" w:w="4300"/>
-            <w:shd w:fill="FAFBFC"/>
             <w:tcMar>
               <w:top w:w="80" w:type="dxa"/>
               <w:start w:w="120" w:type="dxa"/>
@@ -8734,7 +8931,6 @@
         <w:tc>
           <w:tcPr>
             <w:tcW w:type="dxa" w:w="5060"/>
-            <w:shd w:fill="FAFBFC"/>
             <w:tcMar>
               <w:top w:w="80" w:type="dxa"/>
               <w:start w:w="120" w:type="dxa"/>
@@ -8765,6 +8961,7 @@
         <w:tc>
           <w:tcPr>
             <w:tcW w:type="dxa" w:w="4300"/>
+            <w:shd w:fill="FAFBFC"/>
             <w:tcMar>
               <w:top w:w="80" w:type="dxa"/>
               <w:start w:w="120" w:type="dxa"/>
@@ -8790,6 +8987,7 @@
         <w:tc>
           <w:tcPr>
             <w:tcW w:type="dxa" w:w="5060"/>
+            <w:shd w:fill="FAFBFC"/>
             <w:tcMar>
               <w:top w:w="80" w:type="dxa"/>
               <w:start w:w="120" w:type="dxa"/>
@@ -8820,7 +9018,6 @@
         <w:tc>
           <w:tcPr>
             <w:tcW w:type="dxa" w:w="4300"/>
-            <w:shd w:fill="FAFBFC"/>
             <w:tcMar>
               <w:top w:w="80" w:type="dxa"/>
               <w:start w:w="120" w:type="dxa"/>
@@ -8846,7 +9043,6 @@
         <w:tc>
           <w:tcPr>
             <w:tcW w:type="dxa" w:w="5060"/>
-            <w:shd w:fill="FAFBFC"/>
             <w:tcMar>
               <w:top w:w="80" w:type="dxa"/>
               <w:start w:w="120" w:type="dxa"/>
@@ -8877,6 +9073,7 @@
         <w:tc>
           <w:tcPr>
             <w:tcW w:type="dxa" w:w="4300"/>
+            <w:shd w:fill="FAFBFC"/>
             <w:tcMar>
               <w:top w:w="80" w:type="dxa"/>
               <w:start w:w="120" w:type="dxa"/>
@@ -8902,6 +9099,7 @@
         <w:tc>
           <w:tcPr>
             <w:tcW w:type="dxa" w:w="5060"/>
+            <w:shd w:fill="FAFBFC"/>
             <w:tcMar>
               <w:top w:w="80" w:type="dxa"/>
               <w:start w:w="120" w:type="dxa"/>
@@ -8932,7 +9130,6 @@
         <w:tc>
           <w:tcPr>
             <w:tcW w:type="dxa" w:w="4300"/>
-            <w:shd w:fill="FAFBFC"/>
             <w:tcMar>
               <w:top w:w="80" w:type="dxa"/>
               <w:start w:w="120" w:type="dxa"/>
@@ -8958,7 +9155,6 @@
         <w:tc>
           <w:tcPr>
             <w:tcW w:type="dxa" w:w="5060"/>
-            <w:shd w:fill="FAFBFC"/>
             <w:tcMar>
               <w:top w:w="80" w:type="dxa"/>
               <w:start w:w="120" w:type="dxa"/>
@@ -8989,6 +9185,7 @@
         <w:tc>
           <w:tcPr>
             <w:tcW w:type="dxa" w:w="4300"/>
+            <w:shd w:fill="FAFBFC"/>
             <w:tcMar>
               <w:top w:w="80" w:type="dxa"/>
               <w:start w:w="120" w:type="dxa"/>
@@ -9014,6 +9211,7 @@
         <w:tc>
           <w:tcPr>
             <w:tcW w:type="dxa" w:w="5060"/>
+            <w:shd w:fill="FAFBFC"/>
             <w:tcMar>
               <w:top w:w="80" w:type="dxa"/>
               <w:start w:w="120" w:type="dxa"/>
@@ -9044,7 +9242,6 @@
         <w:tc>
           <w:tcPr>
             <w:tcW w:type="dxa" w:w="4300"/>
-            <w:shd w:fill="FAFBFC"/>
             <w:tcMar>
               <w:top w:w="80" w:type="dxa"/>
               <w:start w:w="120" w:type="dxa"/>
@@ -9070,7 +9267,6 @@
         <w:tc>
           <w:tcPr>
             <w:tcW w:type="dxa" w:w="5060"/>
-            <w:shd w:fill="FAFBFC"/>
             <w:tcMar>
               <w:top w:w="80" w:type="dxa"/>
               <w:start w:w="120" w:type="dxa"/>
@@ -9101,6 +9297,7 @@
         <w:tc>
           <w:tcPr>
             <w:tcW w:type="dxa" w:w="4300"/>
+            <w:shd w:fill="FAFBFC"/>
             <w:tcMar>
               <w:top w:w="80" w:type="dxa"/>
               <w:start w:w="120" w:type="dxa"/>
@@ -9126,6 +9323,7 @@
         <w:tc>
           <w:tcPr>
             <w:tcW w:type="dxa" w:w="5060"/>
+            <w:shd w:fill="FAFBFC"/>
             <w:tcMar>
               <w:top w:w="80" w:type="dxa"/>
               <w:start w:w="120" w:type="dxa"/>
@@ -9156,7 +9354,6 @@
         <w:tc>
           <w:tcPr>
             <w:tcW w:type="dxa" w:w="4300"/>
-            <w:shd w:fill="FAFBFC"/>
             <w:tcMar>
               <w:top w:w="80" w:type="dxa"/>
               <w:start w:w="120" w:type="dxa"/>
@@ -9182,7 +9379,6 @@
         <w:tc>
           <w:tcPr>
             <w:tcW w:type="dxa" w:w="5060"/>
-            <w:shd w:fill="FAFBFC"/>
             <w:tcMar>
               <w:top w:w="80" w:type="dxa"/>
               <w:start w:w="120" w:type="dxa"/>
@@ -9213,6 +9409,7 @@
         <w:tc>
           <w:tcPr>
             <w:tcW w:type="dxa" w:w="4300"/>
+            <w:shd w:fill="FAFBFC"/>
             <w:tcMar>
               <w:top w:w="80" w:type="dxa"/>
               <w:start w:w="120" w:type="dxa"/>
@@ -9238,6 +9435,7 @@
         <w:tc>
           <w:tcPr>
             <w:tcW w:type="dxa" w:w="5060"/>
+            <w:shd w:fill="FAFBFC"/>
             <w:tcMar>
               <w:top w:w="80" w:type="dxa"/>
               <w:start w:w="120" w:type="dxa"/>
@@ -9268,7 +9466,6 @@
         <w:tc>
           <w:tcPr>
             <w:tcW w:type="dxa" w:w="4300"/>
-            <w:shd w:fill="FAFBFC"/>
             <w:tcMar>
               <w:top w:w="80" w:type="dxa"/>
               <w:start w:w="120" w:type="dxa"/>
@@ -9294,7 +9491,6 @@
         <w:tc>
           <w:tcPr>
             <w:tcW w:type="dxa" w:w="5060"/>
-            <w:shd w:fill="FAFBFC"/>
             <w:tcMar>
               <w:top w:w="80" w:type="dxa"/>
               <w:start w:w="120" w:type="dxa"/>
@@ -9325,6 +9521,7 @@
         <w:tc>
           <w:tcPr>
             <w:tcW w:type="dxa" w:w="4300"/>
+            <w:shd w:fill="FAFBFC"/>
             <w:tcMar>
               <w:top w:w="80" w:type="dxa"/>
               <w:start w:w="120" w:type="dxa"/>
@@ -9350,6 +9547,7 @@
         <w:tc>
           <w:tcPr>
             <w:tcW w:type="dxa" w:w="5060"/>
+            <w:shd w:fill="FAFBFC"/>
             <w:tcMar>
               <w:top w:w="80" w:type="dxa"/>
               <w:start w:w="120" w:type="dxa"/>
@@ -9412,6 +9610,35 @@
       <w:pPr>
         <w:spacing w:after="40"/>
       </w:pPr>
+    </w:p>
+    <w:p>
+      <w:pPr>
+        <w:keepLines/>
+        <w:pageBreakBefore w:val="0"/>
+        <w:spacing w:before="80" w:after="160" w:line="283" w:lineRule="auto"/>
+        <w:ind w:left="115" w:right="58"/>
+        <w:shd w:fill="FFF8E8"/>
+        <w:pBdr>
+          <w:left w:val="single" w:sz="16" w:space="8" w:color="8A5A00"/>
+        </w:pBdr>
+      </w:pPr>
+      <w:r>
+        <w:rPr>
+          <w:rFonts w:ascii="맑은 고딕" w:hAnsi="맑은 고딕" w:eastAsia="맑은 고딕" w:cs="맑은 고딕"/>
+          <w:b/>
+          <w:color w:val="8A5A00"/>
+          <w:sz w:val="21"/>
+        </w:rPr>
+        <w:t xml:space="preserve">Agent 파일 이동 실패  </w:t>
+      </w:r>
+      <w:r>
+        <w:rPr>
+          <w:rFonts w:ascii="맑은 고딕" w:hAnsi="맑은 고딕" w:eastAsia="맑은 고딕" w:cs="맑은 고딕"/>
+          <w:color w:val="16324F"/>
+          <w:sz w:val="21"/>
+        </w:rPr>
+        <w:t>SETUP_BACKUP_MOVE_FAILED와 SETUP_FILE_ACTIVATION_FAILED는 방화벽이나 로컬 HTTPS가 아니라 업데이트 파일 이동 단계가 제한된 5회 시도 안에 완료되지 않았다는 뜻입니다. Setup의 rollback 결과와 미완료 journal 표시를 확인하고, 복구 필요 상태이면 '이전 상태 복구'를 먼저 실행하세요. 반복 설치, Agent 폴더 수동 삭제·이동 또는 ACL 변경으로 우회하지 말고 지원 코드와 익명 진단을 Windows 관리자에게 전달합니다. SETUP_BACKUP_ACCESS_WARNING만 표시되고 설치가 완료됐다면 Agent 실행을 확인하되 backup 폴더 권한을 임의로 넓히지 마세요.</w:t>
+      </w:r>
     </w:p>
     <w:p>
       <w:pPr>
@@ -10125,7 +10352,7 @@
         <w:color w:val="64748B"/>
         <w:sz w:val="17"/>
       </w:rPr>
-      <w:t xml:space="preserve">v0.11.5-poc  |  </w:t>
+      <w:t xml:space="preserve">v0.11.6-poc  |  </w:t>
     </w:r>
     <w:r>
       <w:rPr>
@@ -10156,7 +10383,7 @@
         <w:color w:val="64748B"/>
         <w:sz w:val="17"/>
       </w:rPr>
-      <w:t>v0.11.5-poc  |  2026-08-11</w:t>
+      <w:t>v0.11.6-poc  |  2026-08-11</w:t>
     </w:r>
   </w:p>
 </w:ftr>

</xml_diff>

<commit_message>
Harden Agent service setup diagnostics
</commit_message>
<xml_diff>
--- a/docs/SamsungSwitchWatch_User_Manual_KO.docx
+++ b/docs/SamsungSwitchWatch_User_Manual_KO.docx
@@ -1159,7 +1159,7 @@
           <w:color w:val="16324F"/>
           <w:sz w:val="21"/>
         </w:rPr>
-        <w:t>0.11.6-poc는 코드 서명되지 않은 시험판입니다. 압축을 풀기 전에 Agent와 Viewer ZIP의 SHA-256을 해당 GitHub Release 본문에 표시된 값과 비교하고 사내 보안 반입 절차를 완료하세요. SmartScreen 또는 EDR 경고를 우회하지 않습니다.</w:t>
+        <w:t>0.11.7-poc는 코드 서명되지 않은 시험판입니다. 압축을 풀기 전에 Agent와 Viewer ZIP의 SHA-256을 해당 GitHub Release 본문에 표시된 값과 비교하고 사내 보안 반입 절차를 완료하세요. SmartScreen 또는 EDR 경고를 우회하지 않습니다.</w:t>
       </w:r>
     </w:p>
     <w:p>
@@ -1697,7 +1697,7 @@
           <w:color w:val="2E74B5"/>
           <w:sz w:val="21"/>
         </w:rPr>
-        <w:t xml:space="preserve">서비스 조회는 한 번만 짧게 재시도  </w:t>
+        <w:t xml:space="preserve">서비스 핵심 실패와 부가 설정 경고  </w:t>
       </w:r>
       <w:r>
         <w:rPr>
@@ -1705,7 +1705,7 @@
           <w:color w:val="16324F"/>
           <w:sz w:val="21"/>
         </w:rPr>
-        <w:t>설치/업데이트는 별도 사전 점검과 배포에서 같은 서비스 정보를 중복 조회하지 않습니다. 초기 조회가 일시적으로 실패하면 200ms 뒤 한 번만 다시 확인합니다. 계속 실패하면 파일·서비스·방화벽 변경 전에 SETUP_SERVICE_FAILED로 중단합니다. 기존 서비스의 보안 설명자만 읽을 수 없는 경우에는 조회 가능한 구성과 상태로 설치를 계속하되 기존 DACL은 변경하지 않습니다. 설명자를 확보한 경우에만 새 제한 DACL을 적용하고 실패 시 복원합니다.</w:t>
+        <w:t>설치/업데이트는 별도 사전 점검과 배포에서 같은 서비스 정보를 중복 조회하지 않습니다. 초기 조회가 일시적으로 실패하면 200ms 뒤 한 번만 다시 확인합니다. 계속 실패하면 파일·서비스·방화벽 변경 전에 SETUP_SERVICE_CAPTURE_FAILED로 중단합니다. 기존 서비스의 실행 경로·시작 유형·계정 계약 불일치는 SETUP_SERVICE_CONTRACT_FAILED, 기존 서비스 중지는 SETUP_SERVICE_STOP_FAILED, 실행 경로·자동 시작·가상 계정 같은 핵심 구성은 SETUP_SERVICE_CONFIG_FAILED, 실제 시작은 SETUP_SERVICE_START_FAILED로 구분합니다. 이 단계들은 Agent 구동에 필요하므로 실패하면 fail-closed로 중단합니다. 서비스 설명, 자동 복구 정책 또는 제한 DACL 적용만 실패하면 SETUP_SERVICE_DESCRIPTION_WARNING, SETUP_SERVICE_RECOVERY_POLICY_WARNING 또는 SETUP_SERVICE_DACL_WARNING을 남기고 계속합니다. 이 경우에도 핵심 구성과 Running 상태는 반드시 확인합니다.</w:t>
       </w:r>
     </w:p>
     <w:p>
@@ -2381,7 +2381,7 @@
           <w:color w:val="16324F"/>
           <w:sz w:val="21"/>
         </w:rPr>
-        <w:t>Agent Setup에 AGENT_LOCAL_CONNECTION_UNCONFIRMED 또는 FIREWALL_REMOTE_ACCESS_UNCONFIRMED가 표시되면 Agent 서비스와 프로그램은 설치됐지만 연결 준비를 확인하지 못했다는 뜻입니다. Viewer에서 연결 테스트를 실행하고, TCP/18443이 실패할 때 Windows 관리자에게 확인하세요. 규칙을 AGENT_CONNECTION_REFUSED가 보이면 Viewer에 스위치 IP나 localhost가 아니라 Agent를 설치한 PC의 실제 주소를 입력했는지 먼저 확인하세요. 같은 PC 시험에서는 해당 PC의 사설 IPv4 또는 localhost를 사용할 수 있습니다. 그 다음 Windows 서비스에서 SamsungSwitchWatchAgent가 Running인지 확인하고 TCP/18443을 점검합니다. TCP 단계는 성공하고 HTTPS 단계가 실패하면 방화벽이 아니라 Agent PC의 로컬 HTTPS/TLS 준비 상태를 확인합니다. AGENT_CLIENT_NOT_ALLOWED이면 Viewer 주소가 RFC1918 사설 범위인지 확인합니다. 서비스를 수동 등록하지 말고 0.11.6-poc Agent Setup을 사용하세요.</w:t>
+        <w:t>Agent Setup에 AGENT_LOCAL_CONNECTION_UNCONFIRMED 또는 FIREWALL_REMOTE_ACCESS_UNCONFIRMED가 표시되면 Agent 서비스와 프로그램은 설치됐지만 연결 준비를 확인하지 못했다는 뜻입니다. Viewer에서 연결 테스트를 실행하고, TCP/18443이 실패할 때 Windows 관리자에게 확인하세요. 규칙을 AGENT_CONNECTION_REFUSED가 보이면 Viewer에 스위치 IP나 localhost가 아니라 Agent를 설치한 PC의 실제 주소를 입력했는지 먼저 확인하세요. 같은 PC 시험에서는 해당 PC의 사설 IPv4 또는 localhost를 사용할 수 있습니다. 그 다음 Windows 서비스에서 SamsungSwitchWatchAgent가 Running인지 확인하고 TCP/18443을 점검합니다. TCP 단계는 성공하고 HTTPS 단계가 실패하면 방화벽이 아니라 Agent PC의 로컬 HTTPS/TLS 준비 상태를 확인합니다. AGENT_CLIENT_NOT_ALLOWED이면 Viewer 주소가 RFC1918 사설 범위인지 확인합니다. 서비스를 수동 등록하지 말고 0.11.7-poc Agent Setup을 사용하세요.</w:t>
       </w:r>
     </w:p>
     <w:p>
@@ -2543,7 +2543,7 @@
           <w:color w:val="16324F"/>
           <w:sz w:val="21"/>
         </w:rPr>
-        <w:t>0.11.6-poc는 코드 서명되지 않아 SmartScreen이나 사내 EDR이 차단할 수 있습니다. ZIP을 완전히 압축 해제하고 Setup, Viewer EXE와 제공된 DLL이 같은 폴더에 있는지 확인하세요. EDR·AppLocker·WDAC가 차단하면 우회하지 말고 공식 ZIP의 버전·해시와 차단 기록을 보안 담당자에게 전달하세요.</w:t>
+        <w:t>0.11.7-poc는 코드 서명되지 않아 SmartScreen이나 사내 EDR이 차단할 수 있습니다. ZIP을 완전히 압축 해제하고 Setup, Viewer EXE와 제공된 DLL이 같은 폴더에 있는지 확인하세요. EDR·AppLocker·WDAC가 차단하면 우회하지 말고 공식 ZIP의 버전·해시와 차단 기록을 보안 담당자에게 전달하세요.</w:t>
       </w:r>
     </w:p>
     <w:p>
@@ -7020,6 +7020,454 @@
                 <w:rFonts w:ascii="맑은 고딕" w:hAnsi="맑은 고딕" w:eastAsia="맑은 고딕" w:cs="맑은 고딕"/>
                 <w:sz w:val="16"/>
               </w:rPr>
+              <w:t>SETUP_SERVICE_CAPTURE_FAILED</w:t>
+            </w:r>
+          </w:p>
+        </w:tc>
+        <w:tc>
+          <w:tcPr>
+            <w:tcW w:type="dxa" w:w="5060"/>
+            <w:tcMar>
+              <w:top w:w="80" w:type="dxa"/>
+              <w:start w:w="120" w:type="dxa"/>
+              <w:bottom w:w="80" w:type="dxa"/>
+              <w:end w:w="120" w:type="dxa"/>
+            </w:tcMar>
+            <w:vAlign w:val="center"/>
+          </w:tcPr>
+          <w:p>
+            <w:pPr>
+              <w:spacing w:before="0" w:after="0" w:line="240" w:lineRule="auto"/>
+              <w:jc w:val="left"/>
+            </w:pPr>
+            <w:r>
+              <w:rPr>
+                <w:rFonts w:ascii="맑은 고딕" w:hAnsi="맑은 고딕" w:eastAsia="맑은 고딕" w:cs="맑은 고딕"/>
+                <w:sz w:val="16"/>
+              </w:rPr>
+              <w:t>설치 전 서비스 상태 snapshot 조회 → Windows 서비스 관리 권한</w:t>
+            </w:r>
+          </w:p>
+        </w:tc>
+      </w:tr>
+      <w:tr>
+        <w:trPr>
+          <w:cantSplit w:val="true"/>
+        </w:trPr>
+        <w:tc>
+          <w:tcPr>
+            <w:tcW w:type="dxa" w:w="4300"/>
+            <w:shd w:fill="FAFBFC"/>
+            <w:tcMar>
+              <w:top w:w="80" w:type="dxa"/>
+              <w:start w:w="120" w:type="dxa"/>
+              <w:bottom w:w="80" w:type="dxa"/>
+              <w:end w:w="120" w:type="dxa"/>
+            </w:tcMar>
+            <w:vAlign w:val="center"/>
+          </w:tcPr>
+          <w:p>
+            <w:pPr>
+              <w:spacing w:before="0" w:after="0" w:line="240" w:lineRule="auto"/>
+              <w:jc w:val="left"/>
+            </w:pPr>
+            <w:r>
+              <w:rPr>
+                <w:rFonts w:ascii="맑은 고딕" w:hAnsi="맑은 고딕" w:eastAsia="맑은 고딕" w:cs="맑은 고딕"/>
+                <w:sz w:val="16"/>
+              </w:rPr>
+              <w:t>SETUP_SERVICE_CONTRACT_FAILED</w:t>
+            </w:r>
+          </w:p>
+        </w:tc>
+        <w:tc>
+          <w:tcPr>
+            <w:tcW w:type="dxa" w:w="5060"/>
+            <w:shd w:fill="FAFBFC"/>
+            <w:tcMar>
+              <w:top w:w="80" w:type="dxa"/>
+              <w:start w:w="120" w:type="dxa"/>
+              <w:bottom w:w="80" w:type="dxa"/>
+              <w:end w:w="120" w:type="dxa"/>
+            </w:tcMar>
+            <w:vAlign w:val="center"/>
+          </w:tcPr>
+          <w:p>
+            <w:pPr>
+              <w:spacing w:before="0" w:after="0" w:line="240" w:lineRule="auto"/>
+              <w:jc w:val="left"/>
+            </w:pPr>
+            <w:r>
+              <w:rPr>
+                <w:rFonts w:ascii="맑은 고딕" w:hAnsi="맑은 고딕" w:eastAsia="맑은 고딕" w:cs="맑은 고딕"/>
+                <w:sz w:val="16"/>
+              </w:rPr>
+              <w:t>다른 설치·관리 작업이 같은 서비스를 변경했는지 확인</w:t>
+            </w:r>
+          </w:p>
+        </w:tc>
+      </w:tr>
+      <w:tr>
+        <w:trPr>
+          <w:cantSplit w:val="true"/>
+        </w:trPr>
+        <w:tc>
+          <w:tcPr>
+            <w:tcW w:type="dxa" w:w="4300"/>
+            <w:tcMar>
+              <w:top w:w="80" w:type="dxa"/>
+              <w:start w:w="120" w:type="dxa"/>
+              <w:bottom w:w="80" w:type="dxa"/>
+              <w:end w:w="120" w:type="dxa"/>
+            </w:tcMar>
+            <w:vAlign w:val="center"/>
+          </w:tcPr>
+          <w:p>
+            <w:pPr>
+              <w:spacing w:before="0" w:after="0" w:line="240" w:lineRule="auto"/>
+              <w:jc w:val="left"/>
+            </w:pPr>
+            <w:r>
+              <w:rPr>
+                <w:rFonts w:ascii="맑은 고딕" w:hAnsi="맑은 고딕" w:eastAsia="맑은 고딕" w:cs="맑은 고딕"/>
+                <w:sz w:val="16"/>
+              </w:rPr>
+              <w:t>SETUP_SERVICE_STOP_FAILED</w:t>
+            </w:r>
+          </w:p>
+        </w:tc>
+        <w:tc>
+          <w:tcPr>
+            <w:tcW w:type="dxa" w:w="5060"/>
+            <w:tcMar>
+              <w:top w:w="80" w:type="dxa"/>
+              <w:start w:w="120" w:type="dxa"/>
+              <w:bottom w:w="80" w:type="dxa"/>
+              <w:end w:w="120" w:type="dxa"/>
+            </w:tcMar>
+            <w:vAlign w:val="center"/>
+          </w:tcPr>
+          <w:p>
+            <w:pPr>
+              <w:spacing w:before="0" w:after="0" w:line="240" w:lineRule="auto"/>
+              <w:jc w:val="left"/>
+            </w:pPr>
+            <w:r>
+              <w:rPr>
+                <w:rFonts w:ascii="맑은 고딕" w:hAnsi="맑은 고딕" w:eastAsia="맑은 고딕" w:cs="맑은 고딕"/>
+                <w:sz w:val="16"/>
+              </w:rPr>
+              <w:t>기존 Agent 서비스 상태 → EDR의 프로세스 종료 차단</w:t>
+            </w:r>
+          </w:p>
+        </w:tc>
+      </w:tr>
+      <w:tr>
+        <w:trPr>
+          <w:cantSplit w:val="true"/>
+        </w:trPr>
+        <w:tc>
+          <w:tcPr>
+            <w:tcW w:type="dxa" w:w="4300"/>
+            <w:shd w:fill="FAFBFC"/>
+            <w:tcMar>
+              <w:top w:w="80" w:type="dxa"/>
+              <w:start w:w="120" w:type="dxa"/>
+              <w:bottom w:w="80" w:type="dxa"/>
+              <w:end w:w="120" w:type="dxa"/>
+            </w:tcMar>
+            <w:vAlign w:val="center"/>
+          </w:tcPr>
+          <w:p>
+            <w:pPr>
+              <w:spacing w:before="0" w:after="0" w:line="240" w:lineRule="auto"/>
+              <w:jc w:val="left"/>
+            </w:pPr>
+            <w:r>
+              <w:rPr>
+                <w:rFonts w:ascii="맑은 고딕" w:hAnsi="맑은 고딕" w:eastAsia="맑은 고딕" w:cs="맑은 고딕"/>
+                <w:sz w:val="16"/>
+              </w:rPr>
+              <w:t>SETUP_SERVICE_CONFIG_FAILED</w:t>
+            </w:r>
+          </w:p>
+        </w:tc>
+        <w:tc>
+          <w:tcPr>
+            <w:tcW w:type="dxa" w:w="5060"/>
+            <w:shd w:fill="FAFBFC"/>
+            <w:tcMar>
+              <w:top w:w="80" w:type="dxa"/>
+              <w:start w:w="120" w:type="dxa"/>
+              <w:bottom w:w="80" w:type="dxa"/>
+              <w:end w:w="120" w:type="dxa"/>
+            </w:tcMar>
+            <w:vAlign w:val="center"/>
+          </w:tcPr>
+          <w:p>
+            <w:pPr>
+              <w:spacing w:before="0" w:after="0" w:line="240" w:lineRule="auto"/>
+              <w:jc w:val="left"/>
+            </w:pPr>
+            <w:r>
+              <w:rPr>
+                <w:rFonts w:ascii="맑은 고딕" w:hAnsi="맑은 고딕" w:eastAsia="맑은 고딕" w:cs="맑은 고딕"/>
+                <w:sz w:val="16"/>
+              </w:rPr>
+              <w:t>SCM 권한 → 실행 경로·자동 시작·가상 서비스 계정 정책</w:t>
+            </w:r>
+          </w:p>
+        </w:tc>
+      </w:tr>
+      <w:tr>
+        <w:trPr>
+          <w:cantSplit w:val="true"/>
+        </w:trPr>
+        <w:tc>
+          <w:tcPr>
+            <w:tcW w:type="dxa" w:w="4300"/>
+            <w:tcMar>
+              <w:top w:w="80" w:type="dxa"/>
+              <w:start w:w="120" w:type="dxa"/>
+              <w:bottom w:w="80" w:type="dxa"/>
+              <w:end w:w="120" w:type="dxa"/>
+            </w:tcMar>
+            <w:vAlign w:val="center"/>
+          </w:tcPr>
+          <w:p>
+            <w:pPr>
+              <w:spacing w:before="0" w:after="0" w:line="240" w:lineRule="auto"/>
+              <w:jc w:val="left"/>
+            </w:pPr>
+            <w:r>
+              <w:rPr>
+                <w:rFonts w:ascii="맑은 고딕" w:hAnsi="맑은 고딕" w:eastAsia="맑은 고딕" w:cs="맑은 고딕"/>
+                <w:sz w:val="16"/>
+              </w:rPr>
+              <w:t>SETUP_SERVICE_START_FAILED</w:t>
+            </w:r>
+          </w:p>
+        </w:tc>
+        <w:tc>
+          <w:tcPr>
+            <w:tcW w:type="dxa" w:w="5060"/>
+            <w:tcMar>
+              <w:top w:w="80" w:type="dxa"/>
+              <w:start w:w="120" w:type="dxa"/>
+              <w:bottom w:w="80" w:type="dxa"/>
+              <w:end w:w="120" w:type="dxa"/>
+            </w:tcMar>
+            <w:vAlign w:val="center"/>
+          </w:tcPr>
+          <w:p>
+            <w:pPr>
+              <w:spacing w:before="0" w:after="0" w:line="240" w:lineRule="auto"/>
+              <w:jc w:val="left"/>
+            </w:pPr>
+            <w:r>
+              <w:rPr>
+                <w:rFonts w:ascii="맑은 고딕" w:hAnsi="맑은 고딕" w:eastAsia="맑은 고딕" w:cs="맑은 고딕"/>
+                <w:sz w:val="16"/>
+              </w:rPr>
+              <w:t>Windows 서비스 이벤트 → EDR 격리·실행 차단</w:t>
+            </w:r>
+          </w:p>
+        </w:tc>
+      </w:tr>
+      <w:tr>
+        <w:trPr>
+          <w:cantSplit w:val="true"/>
+        </w:trPr>
+        <w:tc>
+          <w:tcPr>
+            <w:tcW w:type="dxa" w:w="4300"/>
+            <w:shd w:fill="FAFBFC"/>
+            <w:tcMar>
+              <w:top w:w="80" w:type="dxa"/>
+              <w:start w:w="120" w:type="dxa"/>
+              <w:bottom w:w="80" w:type="dxa"/>
+              <w:end w:w="120" w:type="dxa"/>
+            </w:tcMar>
+            <w:vAlign w:val="center"/>
+          </w:tcPr>
+          <w:p>
+            <w:pPr>
+              <w:spacing w:before="0" w:after="0" w:line="240" w:lineRule="auto"/>
+              <w:jc w:val="left"/>
+            </w:pPr>
+            <w:r>
+              <w:rPr>
+                <w:rFonts w:ascii="맑은 고딕" w:hAnsi="맑은 고딕" w:eastAsia="맑은 고딕" w:cs="맑은 고딕"/>
+                <w:sz w:val="16"/>
+              </w:rPr>
+              <w:t>SETUP_SERVICE_DESCRIPTION_WARNING</w:t>
+            </w:r>
+          </w:p>
+        </w:tc>
+        <w:tc>
+          <w:tcPr>
+            <w:tcW w:type="dxa" w:w="5060"/>
+            <w:shd w:fill="FAFBFC"/>
+            <w:tcMar>
+              <w:top w:w="80" w:type="dxa"/>
+              <w:start w:w="120" w:type="dxa"/>
+              <w:bottom w:w="80" w:type="dxa"/>
+              <w:end w:w="120" w:type="dxa"/>
+            </w:tcMar>
+            <w:vAlign w:val="center"/>
+          </w:tcPr>
+          <w:p>
+            <w:pPr>
+              <w:spacing w:before="0" w:after="0" w:line="240" w:lineRule="auto"/>
+              <w:jc w:val="left"/>
+            </w:pPr>
+            <w:r>
+              <w:rPr>
+                <w:rFonts w:ascii="맑은 고딕" w:hAnsi="맑은 고딕" w:eastAsia="맑은 고딕" w:cs="맑은 고딕"/>
+                <w:sz w:val="16"/>
+              </w:rPr>
+              <w:t>서비스 설명만 실패한 경고 → 핵심 서비스 Running과 Viewer 연결 확인</w:t>
+            </w:r>
+          </w:p>
+        </w:tc>
+      </w:tr>
+      <w:tr>
+        <w:trPr>
+          <w:cantSplit w:val="true"/>
+        </w:trPr>
+        <w:tc>
+          <w:tcPr>
+            <w:tcW w:type="dxa" w:w="4300"/>
+            <w:tcMar>
+              <w:top w:w="80" w:type="dxa"/>
+              <w:start w:w="120" w:type="dxa"/>
+              <w:bottom w:w="80" w:type="dxa"/>
+              <w:end w:w="120" w:type="dxa"/>
+            </w:tcMar>
+            <w:vAlign w:val="center"/>
+          </w:tcPr>
+          <w:p>
+            <w:pPr>
+              <w:spacing w:before="0" w:after="0" w:line="240" w:lineRule="auto"/>
+              <w:jc w:val="left"/>
+            </w:pPr>
+            <w:r>
+              <w:rPr>
+                <w:rFonts w:ascii="맑은 고딕" w:hAnsi="맑은 고딕" w:eastAsia="맑은 고딕" w:cs="맑은 고딕"/>
+                <w:sz w:val="16"/>
+              </w:rPr>
+              <w:t>SETUP_SERVICE_RECOVERY_POLICY_WARNING</w:t>
+            </w:r>
+          </w:p>
+        </w:tc>
+        <w:tc>
+          <w:tcPr>
+            <w:tcW w:type="dxa" w:w="5060"/>
+            <w:tcMar>
+              <w:top w:w="80" w:type="dxa"/>
+              <w:start w:w="120" w:type="dxa"/>
+              <w:bottom w:w="80" w:type="dxa"/>
+              <w:end w:w="120" w:type="dxa"/>
+            </w:tcMar>
+            <w:vAlign w:val="center"/>
+          </w:tcPr>
+          <w:p>
+            <w:pPr>
+              <w:spacing w:before="0" w:after="0" w:line="240" w:lineRule="auto"/>
+              <w:jc w:val="left"/>
+            </w:pPr>
+            <w:r>
+              <w:rPr>
+                <w:rFonts w:ascii="맑은 고딕" w:hAnsi="맑은 고딕" w:eastAsia="맑은 고딕" w:cs="맑은 고딕"/>
+                <w:sz w:val="16"/>
+              </w:rPr>
+              <w:t>자동 복구 정책만 실패한 경고 → 핵심 서비스 Running과 Viewer 연결 확인</w:t>
+            </w:r>
+          </w:p>
+        </w:tc>
+      </w:tr>
+      <w:tr>
+        <w:trPr>
+          <w:cantSplit w:val="true"/>
+        </w:trPr>
+        <w:tc>
+          <w:tcPr>
+            <w:tcW w:type="dxa" w:w="4300"/>
+            <w:shd w:fill="FAFBFC"/>
+            <w:tcMar>
+              <w:top w:w="80" w:type="dxa"/>
+              <w:start w:w="120" w:type="dxa"/>
+              <w:bottom w:w="80" w:type="dxa"/>
+              <w:end w:w="120" w:type="dxa"/>
+            </w:tcMar>
+            <w:vAlign w:val="center"/>
+          </w:tcPr>
+          <w:p>
+            <w:pPr>
+              <w:spacing w:before="0" w:after="0" w:line="240" w:lineRule="auto"/>
+              <w:jc w:val="left"/>
+            </w:pPr>
+            <w:r>
+              <w:rPr>
+                <w:rFonts w:ascii="맑은 고딕" w:hAnsi="맑은 고딕" w:eastAsia="맑은 고딕" w:cs="맑은 고딕"/>
+                <w:sz w:val="16"/>
+              </w:rPr>
+              <w:t>SETUP_SERVICE_DACL_WARNING</w:t>
+            </w:r>
+          </w:p>
+        </w:tc>
+        <w:tc>
+          <w:tcPr>
+            <w:tcW w:type="dxa" w:w="5060"/>
+            <w:shd w:fill="FAFBFC"/>
+            <w:tcMar>
+              <w:top w:w="80" w:type="dxa"/>
+              <w:start w:w="120" w:type="dxa"/>
+              <w:bottom w:w="80" w:type="dxa"/>
+              <w:end w:w="120" w:type="dxa"/>
+            </w:tcMar>
+            <w:vAlign w:val="center"/>
+          </w:tcPr>
+          <w:p>
+            <w:pPr>
+              <w:spacing w:before="0" w:after="0" w:line="240" w:lineRule="auto"/>
+              <w:jc w:val="left"/>
+            </w:pPr>
+            <w:r>
+              <w:rPr>
+                <w:rFonts w:ascii="맑은 고딕" w:hAnsi="맑은 고딕" w:eastAsia="맑은 고딕" w:cs="맑은 고딕"/>
+                <w:sz w:val="16"/>
+              </w:rPr>
+              <w:t>제한 DACL만 실패한 경고 → 핵심 서비스 Running과 사내 SCM 정책 확인</w:t>
+            </w:r>
+          </w:p>
+        </w:tc>
+      </w:tr>
+      <w:tr>
+        <w:trPr>
+          <w:cantSplit w:val="true"/>
+        </w:trPr>
+        <w:tc>
+          <w:tcPr>
+            <w:tcW w:type="dxa" w:w="4300"/>
+            <w:tcMar>
+              <w:top w:w="80" w:type="dxa"/>
+              <w:start w:w="120" w:type="dxa"/>
+              <w:bottom w:w="80" w:type="dxa"/>
+              <w:end w:w="120" w:type="dxa"/>
+            </w:tcMar>
+            <w:vAlign w:val="center"/>
+          </w:tcPr>
+          <w:p>
+            <w:pPr>
+              <w:spacing w:before="0" w:after="0" w:line="240" w:lineRule="auto"/>
+              <w:jc w:val="left"/>
+            </w:pPr>
+            <w:r>
+              <w:rPr>
+                <w:rFonts w:ascii="맑은 고딕" w:hAnsi="맑은 고딕" w:eastAsia="맑은 고딕" w:cs="맑은 고딕"/>
+                <w:sz w:val="16"/>
+              </w:rPr>
               <w:t>SETUP_SERVICE_FAILED</w:t>
             </w:r>
           </w:p>
@@ -7045,7 +7493,7 @@
                 <w:rFonts w:ascii="맑은 고딕" w:hAnsi="맑은 고딕" w:eastAsia="맑은 고딕" w:cs="맑은 고딕"/>
                 <w:sz w:val="16"/>
               </w:rPr>
-              <w:t>Windows 서비스 관리 권한 → 기존 SamsungSwitchWatchAgent 상태</w:t>
+              <w:t>구버전 호환 서비스 오류 → 새 버전으로 맞춘 뒤 Windows 서비스 상태 확인</w:t>
             </w:r>
           </w:p>
         </w:tc>
@@ -10352,7 +10800,7 @@
         <w:color w:val="64748B"/>
         <w:sz w:val="17"/>
       </w:rPr>
-      <w:t xml:space="preserve">v0.11.6-poc  |  </w:t>
+      <w:t xml:space="preserve">v0.11.7-poc  |  </w:t>
     </w:r>
     <w:r>
       <w:rPr>
@@ -10383,7 +10831,7 @@
         <w:color w:val="64748B"/>
         <w:sz w:val="17"/>
       </w:rPr>
-      <w:t>v0.11.6-poc  |  2026-08-11</w:t>
+      <w:t>v0.11.7-poc  |  2026-08-12</w:t>
     </w:r>
   </w:p>
 </w:ftr>

</xml_diff>

<commit_message>
Stabilize setup and Viewer operations
</commit_message>
<xml_diff>
--- a/docs/SamsungSwitchWatch_User_Manual_KO.docx
+++ b/docs/SamsungSwitchWatch_User_Manual_KO.docx
@@ -168,7 +168,7 @@
       <w:tr>
         <w:trPr>
           <w:tblHeader w:val="true"/>
-          <w:cantSplit w:val="true"/>
+          <w:cantSplit w:val="1"/>
         </w:trPr>
         <w:tc>
           <w:tcPr>
@@ -260,7 +260,7 @@
       </w:tr>
       <w:tr>
         <w:trPr>
-          <w:cantSplit w:val="true"/>
+          <w:cantSplit w:val="1"/>
         </w:trPr>
         <w:tc>
           <w:tcPr>
@@ -340,7 +340,7 @@
       </w:tr>
       <w:tr>
         <w:trPr>
-          <w:cantSplit w:val="true"/>
+          <w:cantSplit w:val="1"/>
         </w:trPr>
         <w:tc>
           <w:tcPr>
@@ -423,7 +423,7 @@
       </w:tr>
       <w:tr>
         <w:trPr>
-          <w:cantSplit w:val="true"/>
+          <w:cantSplit w:val="1"/>
         </w:trPr>
         <w:tc>
           <w:tcPr>
@@ -677,7 +677,7 @@
           <w:color w:val="16324F"/>
           <w:sz w:val="21"/>
         </w:rPr>
-        <w:t>포트 상태와 시스템 로그는 순차적인 개별 세션으로 수집합니다. 명령 시간 초과·출력 한도는 실패한 항목만 확인 불가로 표시하고 다른 항목을 계속 확인합니다. 명령은 30초 동안 새 응답이 없으면 중단하고, 출력이 계속되어도 전체 90초를 넘기지 않습니다. 같은 실패 명령은 현재 주기에서 즉시 재시도하지 않습니다. 인증·enable·TCP·세션 종료는 반복 로그인을 막기 위해 해당 장비 주기를 중단합니다. 이번 POC의 자동 감시 검증·지원 범위는 등록 장비 10대 이하입니다.</w:t>
+        <w:t>포트 상태와 시스템 로그는 순차적인 개별 세션으로 수집합니다. 명령 시간 초과·출력 한도는 실패한 항목만 확인 불가로 표시하고 다른 항목을 계속 확인합니다. 명령은 30초 동안 새 응답이 없으면 중단하고, 출력이 계속되어도 전체 90초를 넘기지 않습니다. 같은 실패 명령은 현재 주기에서 즉시 재시도하지 않습니다. COMMAND_TIMEOUT 또는 QUERY_TIMEOUT이면 다음 점검 주기에 다음 읽기 전용 후보를 한 번 시도합니다. 인증·enable·TCP·세션 종료는 반복 로그인을 막기 위해 해당 장비 주기를 중단합니다. 이번 POC의 자동 감시 검증·지원 범위는 등록 장비 10대 이하입니다.</w:t>
       </w:r>
     </w:p>
     <w:p>
@@ -743,7 +743,7 @@
       <w:tr>
         <w:trPr>
           <w:tblHeader w:val="true"/>
-          <w:cantSplit w:val="true"/>
+          <w:cantSplit w:val="1"/>
         </w:trPr>
         <w:tc>
           <w:tcPr>
@@ -835,7 +835,7 @@
       </w:tr>
       <w:tr>
         <w:trPr>
-          <w:cantSplit w:val="true"/>
+          <w:cantSplit w:val="1"/>
         </w:trPr>
         <w:tc>
           <w:tcPr>
@@ -915,7 +915,7 @@
       </w:tr>
       <w:tr>
         <w:trPr>
-          <w:cantSplit w:val="true"/>
+          <w:cantSplit w:val="1"/>
         </w:trPr>
         <w:tc>
           <w:tcPr>
@@ -1159,7 +1159,7 @@
           <w:color w:val="16324F"/>
           <w:sz w:val="21"/>
         </w:rPr>
-        <w:t>0.11.7-poc는 코드 서명되지 않은 시험판입니다. 압축을 풀기 전에 Agent와 Viewer ZIP의 SHA-256을 해당 GitHub Release 본문에 표시된 값과 비교하고 사내 보안 반입 절차를 완료하세요. SmartScreen 또는 EDR 경고를 우회하지 않습니다.</w:t>
+        <w:t>0.11.8-poc는 코드 서명되지 않은 시험판입니다. 압축을 풀기 전에 Agent와 Viewer ZIP의 SHA-256을 해당 GitHub Release 본문에 표시된 값과 비교하고 사내 보안 반입 절차를 완료하세요. SmartScreen 또는 EDR 경고를 우회하지 않습니다.</w:t>
       </w:r>
     </w:p>
     <w:p>
@@ -1647,7 +1647,7 @@
           <w:color w:val="16324F"/>
           <w:sz w:val="21"/>
         </w:rPr>
-        <w:t>Setup은 BUILD-MANIFEST.json과 Agent 실행 파일 SHA-256을 확인하고, Program Files의 임시 staging에 복사한 파일을 다시 검사한 뒤 교체합니다. 패키지·파일·서비스 변경 자체가 실패한 경우에만 설치 전 상태로 되돌리기를 시도합니다. 서비스가 설치·시작된 뒤 로컬 HTTPS/API/버전 또는 방화벽 준비 상태를 확인하지 못한 경우에는 설치를 되돌리지 않고 AGENT_LOCAL_CONNECTION_UNCONFIRMED 경고로 남깁니다. 다음 실행에서 완료되지 않은 journal이 남아 있으면 자동 복구하지 않고 별도의 '이전 상태 복구' 작업을 요구합니다. 검사 중에는 현재 서비스 PID와 TCP/18443 소유를 매번 다시 확인합니다. rollback 전에는 관찰한 서비스 프로세스 종료를 확인하고 프로그램 폴더의 일시적 잠금만 최대 5회 제한적으로 재시도합니다. staging·backup·failed·journal 정리가 잠시 실패하면 정확히 검증된 대상만 최대 3회 시도하고 실패한 시도 사이 250ms 대기한 뒤 삭제 결과를 확인합니다. 변경 자체의 복구까지 실패하면 최초 설치 실패 코드를 별도로 유지하고 SETUP_ROLLBACK_FAILED와 실패한 ROLLBACK_* 단계를 함께 표시합니다.</w:t>
+        <w:t>Setup은 BUILD-MANIFEST.json과 Agent 실행 파일 SHA-256을 확인하고, Program Files의 임시 staging에 복사한 파일을 다시 검사한 뒤 교체합니다. 패키지·파일·서비스 변경 자체가 실패한 경우에만 설치 전 상태로 되돌리기를 시도합니다. 서비스가 설치·시작된 뒤 로컬 HTTPS/API/버전 또는 방화벽 준비 상태를 확인하지 못한 경우에는 설치를 되돌리지 않고 AGENT_LOCAL_CONNECTION_UNCONFIRMED 경고로 남깁니다. 다음 실행에서 완료되지 않은 journal이 남아 있으면 자동 복구하지 않고 별도의 '이전 상태 복구' 작업을 요구합니다. 검사 중에는 현재 서비스 PID와 TCP/18443 소유를 매번 다시 확인합니다. rollback 전에는 관찰한 서비스 프로세스 종료를 확인하고 프로그램 폴더의 일시적 잠금만 최대 5회 제한적으로 재시도합니다. staging·backup·failed·journal 정리가 잠시 실패하면 정확히 검증된 대상만 최대 3회 시도하고 실패한 시도 사이 250ms 대기한 뒤 삭제 결과를 확인합니다. journal은 원자적으로 교체하며 교체가 완료된 뒤 임시 파일 정리만 실패해도 저장 완료를 실패로 되돌리지 않습니다. 새 ProgramData 제품 루트는 원자적 생성에 성공한 경우에만 ACL과 파일을 쓰므로 검사 직후 다른 프로세스가 만든 폴더는 수정하지 않습니다. 변경 자체의 복구까지 실패하면 최초 설치 실패 코드를 별도로 유지하고 SETUP_ROLLBACK_FAILED와 실패한 ROLLBACK_* 단계를 함께 표시합니다.</w:t>
       </w:r>
     </w:p>
     <w:p>
@@ -1705,7 +1705,7 @@
           <w:color w:val="16324F"/>
           <w:sz w:val="21"/>
         </w:rPr>
-        <w:t>설치/업데이트는 별도 사전 점검과 배포에서 같은 서비스 정보를 중복 조회하지 않습니다. 초기 조회가 일시적으로 실패하면 200ms 뒤 한 번만 다시 확인합니다. 계속 실패하면 파일·서비스·방화벽 변경 전에 SETUP_SERVICE_CAPTURE_FAILED로 중단합니다. 기존 서비스의 실행 경로·시작 유형·계정 계약 불일치는 SETUP_SERVICE_CONTRACT_FAILED, 기존 서비스 중지는 SETUP_SERVICE_STOP_FAILED, 실행 경로·자동 시작·가상 계정 같은 핵심 구성은 SETUP_SERVICE_CONFIG_FAILED, 실제 시작은 SETUP_SERVICE_START_FAILED로 구분합니다. 이 단계들은 Agent 구동에 필요하므로 실패하면 fail-closed로 중단합니다. 서비스 설명, 자동 복구 정책 또는 제한 DACL 적용만 실패하면 SETUP_SERVICE_DESCRIPTION_WARNING, SETUP_SERVICE_RECOVERY_POLICY_WARNING 또는 SETUP_SERVICE_DACL_WARNING을 남기고 계속합니다. 이 경우에도 핵심 구성과 Running 상태는 반드시 확인합니다.</w:t>
+        <w:t>설치/업데이트는 별도 사전 점검과 배포에서 같은 서비스 정보를 중복 조회하지 않습니다. 초기 조회가 일시적으로 실패하면 200ms 뒤 한 번만 다시 확인합니다. 계속 실패하면 파일·서비스·방화벽 변경 전에 SETUP_SERVICE_CAPTURE_FAILED로 중단합니다. 기존 서비스의 실행 경로·시작 유형·계정 계약 불일치는 SETUP_SERVICE_CONTRACT_FAILED, 기존 서비스 중지는 SETUP_SERVICE_STOP_FAILED, 실행 경로·자동 시작·가상 계정 같은 핵심 구성은 SETUP_SERVICE_CONFIG_FAILED, 실제 시작은 SETUP_SERVICE_START_FAILED로 구분합니다. 이 단계들은 Agent 구동에 필요하므로 실패하면 fail-closed로 중단합니다. 서비스 설명, 자동 복구 정책 또는 제한 DACL 적용만 실패하면 SETUP_SERVICE_DESCRIPTION_WARNING, SETUP_SERVICE_RECOVERY_POLICY_WARNING 또는 SETUP_SERVICE_DACL_WARNING을 남기고 계속합니다. 이 경우에도 핵심 구성과 Running 상태는 반드시 확인합니다. START_PENDING은 중복 시작 없이 기다리고, STOP_PENDING은 중지가 끝난 뒤 한 번만 시작합니다. 시스템 시각 변경의 영향을 받지 않는 제한 시간 안에 완료되지 않으면 SETUP_SERVICE_START_FAILED로 중단합니다.</w:t>
       </w:r>
     </w:p>
     <w:p>
@@ -1788,7 +1788,7 @@
       <w:tr>
         <w:trPr>
           <w:tblHeader w:val="true"/>
-          <w:cantSplit w:val="true"/>
+          <w:cantSplit w:val="1"/>
         </w:trPr>
         <w:tc>
           <w:tcPr>
@@ -1851,7 +1851,7 @@
       </w:tr>
       <w:tr>
         <w:trPr>
-          <w:cantSplit w:val="true"/>
+          <w:cantSplit w:val="1"/>
         </w:trPr>
         <w:tc>
           <w:tcPr>
@@ -1906,7 +1906,7 @@
       </w:tr>
       <w:tr>
         <w:trPr>
-          <w:cantSplit w:val="true"/>
+          <w:cantSplit w:val="1"/>
         </w:trPr>
         <w:tc>
           <w:tcPr>
@@ -1963,7 +1963,7 @@
       </w:tr>
       <w:tr>
         <w:trPr>
-          <w:cantSplit w:val="true"/>
+          <w:cantSplit w:val="1"/>
         </w:trPr>
         <w:tc>
           <w:tcPr>
@@ -2018,7 +2018,7 @@
       </w:tr>
       <w:tr>
         <w:trPr>
-          <w:cantSplit w:val="true"/>
+          <w:cantSplit w:val="1"/>
         </w:trPr>
         <w:tc>
           <w:tcPr>
@@ -2075,7 +2075,7 @@
       </w:tr>
       <w:tr>
         <w:trPr>
-          <w:cantSplit w:val="true"/>
+          <w:cantSplit w:val="1"/>
         </w:trPr>
         <w:tc>
           <w:tcPr>
@@ -2130,7 +2130,7 @@
       </w:tr>
       <w:tr>
         <w:trPr>
-          <w:cantSplit w:val="true"/>
+          <w:cantSplit w:val="1"/>
         </w:trPr>
         <w:tc>
           <w:tcPr>
@@ -2381,7 +2381,7 @@
           <w:color w:val="16324F"/>
           <w:sz w:val="21"/>
         </w:rPr>
-        <w:t>Agent Setup에 AGENT_LOCAL_CONNECTION_UNCONFIRMED 또는 FIREWALL_REMOTE_ACCESS_UNCONFIRMED가 표시되면 Agent 서비스와 프로그램은 설치됐지만 연결 준비를 확인하지 못했다는 뜻입니다. Viewer에서 연결 테스트를 실행하고, TCP/18443이 실패할 때 Windows 관리자에게 확인하세요. 규칙을 AGENT_CONNECTION_REFUSED가 보이면 Viewer에 스위치 IP나 localhost가 아니라 Agent를 설치한 PC의 실제 주소를 입력했는지 먼저 확인하세요. 같은 PC 시험에서는 해당 PC의 사설 IPv4 또는 localhost를 사용할 수 있습니다. 그 다음 Windows 서비스에서 SamsungSwitchWatchAgent가 Running인지 확인하고 TCP/18443을 점검합니다. TCP 단계는 성공하고 HTTPS 단계가 실패하면 방화벽이 아니라 Agent PC의 로컬 HTTPS/TLS 준비 상태를 확인합니다. AGENT_CLIENT_NOT_ALLOWED이면 Viewer 주소가 RFC1918 사설 범위인지 확인합니다. 서비스를 수동 등록하지 말고 0.11.7-poc Agent Setup을 사용하세요.</w:t>
+        <w:t>Agent Setup에 AGENT_LOCAL_CONNECTION_UNCONFIRMED 또는 FIREWALL_REMOTE_ACCESS_UNCONFIRMED가 표시되면 Agent 서비스와 프로그램은 설치됐지만 연결 준비를 확인하지 못했다는 뜻입니다. Viewer에서 연결 테스트를 실행하고, TCP/18443이 실패할 때 Windows 관리자에게 확인하세요. 규칙을 AGENT_CONNECTION_REFUSED가 보이면 Viewer에 스위치 IP나 localhost가 아니라 Agent를 설치한 PC의 실제 주소를 입력했는지 먼저 확인하세요. 같은 PC 시험에서는 해당 PC의 사설 IPv4 또는 localhost를 사용할 수 있습니다. 그 다음 Windows 서비스에서 SamsungSwitchWatchAgent가 Running인지 확인하고 TCP/18443을 점검합니다. TCP 단계는 성공하고 HTTPS 단계가 실패하면 방화벽이 아니라 Agent PC의 로컬 HTTPS/TLS 준비 상태를 확인합니다. AGENT_CLIENT_NOT_ALLOWED이면 Viewer 주소가 RFC1918 사설 범위인지 확인합니다. 서비스를 수동 등록하지 말고 0.11.8-poc Agent Setup을 사용하세요.</w:t>
       </w:r>
     </w:p>
     <w:p>
@@ -2543,7 +2543,7 @@
           <w:color w:val="16324F"/>
           <w:sz w:val="21"/>
         </w:rPr>
-        <w:t>0.11.7-poc는 코드 서명되지 않아 SmartScreen이나 사내 EDR이 차단할 수 있습니다. ZIP을 완전히 압축 해제하고 Setup, Viewer EXE와 제공된 DLL이 같은 폴더에 있는지 확인하세요. EDR·AppLocker·WDAC가 차단하면 우회하지 말고 공식 ZIP의 버전·해시와 차단 기록을 보안 담당자에게 전달하세요.</w:t>
+        <w:t>0.11.8-poc는 코드 서명되지 않아 SmartScreen이나 사내 EDR이 차단할 수 있습니다. ZIP을 완전히 압축 해제하고 Setup, Viewer EXE와 제공된 DLL이 같은 폴더에 있는지 확인하세요. EDR·AppLocker·WDAC가 차단하면 우회하지 말고 공식 ZIP의 버전·해시와 차단 기록을 보안 담당자에게 전달하세요.</w:t>
       </w:r>
     </w:p>
     <w:p>
@@ -3005,6 +3005,35 @@
     </w:p>
     <w:p>
       <w:pPr>
+        <w:keepLines/>
+        <w:pageBreakBefore w:val="0"/>
+        <w:spacing w:before="80" w:after="160" w:line="283" w:lineRule="auto"/>
+        <w:ind w:left="115" w:right="58"/>
+        <w:shd w:fill="E8EEF5"/>
+        <w:pBdr>
+          <w:left w:val="single" w:sz="16" w:space="8" w:color="2E74B5"/>
+        </w:pBdr>
+      </w:pPr>
+      <w:r>
+        <w:rPr>
+          <w:rFonts w:ascii="맑은 고딕" w:hAnsi="맑은 고딕" w:eastAsia="맑은 고딕" w:cs="맑은 고딕"/>
+          <w:b/>
+          <w:color w:val="2E74B5"/>
+          <w:sz w:val="21"/>
+        </w:rPr>
+        <w:t xml:space="preserve">중복 실행과 창 닫기  </w:t>
+      </w:r>
+      <w:r>
+        <w:rPr>
+          <w:rFonts w:ascii="맑은 고딕" w:hAnsi="맑은 고딕" w:eastAsia="맑은 고딕" w:cs="맑은 고딕"/>
+          <w:color w:val="16324F"/>
+          <w:sz w:val="21"/>
+        </w:rPr>
+        <w:t>포트 상태/시스템 로그 수동 점검과 직접 입력한 읽기 전용 명령은 동시에 하나만 실행됩니다. 하나가 실행 중이면 다른 실행 버튼은 잠시 비활성화되며 뒤에서 다시 실행되지 않습니다. 장비 관리 창을 닫으면 진행 중인 연결을 취소하고 화면의 로그인 PW와 enable PW를 즉시 지웁니다.</w:t>
+      </w:r>
+    </w:p>
+    <w:p>
+      <w:pPr>
         <w:pStyle w:val="Heading3"/>
         <w:pageBreakBefore/>
       </w:pPr>
@@ -3041,7 +3070,7 @@
       <w:tr>
         <w:trPr>
           <w:tblHeader w:val="true"/>
-          <w:cantSplit w:val="true"/>
+          <w:cantSplit w:val="1"/>
         </w:trPr>
         <w:tc>
           <w:tcPr>
@@ -3133,7 +3162,7 @@
       </w:tr>
       <w:tr>
         <w:trPr>
-          <w:cantSplit w:val="true"/>
+          <w:cantSplit w:val="1"/>
         </w:trPr>
         <w:tc>
           <w:tcPr>
@@ -3213,7 +3242,7 @@
       </w:tr>
       <w:tr>
         <w:trPr>
-          <w:cantSplit w:val="true"/>
+          <w:cantSplit w:val="1"/>
         </w:trPr>
         <w:tc>
           <w:tcPr>
@@ -3296,7 +3325,7 @@
       </w:tr>
       <w:tr>
         <w:trPr>
-          <w:cantSplit w:val="true"/>
+          <w:cantSplit w:val="1"/>
         </w:trPr>
         <w:tc>
           <w:tcPr>
@@ -3376,7 +3405,7 @@
       </w:tr>
       <w:tr>
         <w:trPr>
-          <w:cantSplit w:val="true"/>
+          <w:cantSplit w:val="1"/>
         </w:trPr>
         <w:tc>
           <w:tcPr>
@@ -3459,7 +3488,7 @@
       </w:tr>
       <w:tr>
         <w:trPr>
-          <w:cantSplit w:val="true"/>
+          <w:cantSplit w:val="1"/>
         </w:trPr>
         <w:tc>
           <w:tcPr>
@@ -3539,7 +3568,7 @@
       </w:tr>
       <w:tr>
         <w:trPr>
-          <w:cantSplit w:val="true"/>
+          <w:cantSplit w:val="1"/>
         </w:trPr>
         <w:tc>
           <w:tcPr>
@@ -3622,7 +3651,7 @@
       </w:tr>
       <w:tr>
         <w:trPr>
-          <w:cantSplit w:val="true"/>
+          <w:cantSplit w:val="1"/>
         </w:trPr>
         <w:tc>
           <w:tcPr>
@@ -3838,7 +3867,7 @@
       <w:tr>
         <w:trPr>
           <w:tblHeader w:val="true"/>
-          <w:cantSplit w:val="true"/>
+          <w:cantSplit w:val="1"/>
         </w:trPr>
         <w:tc>
           <w:tcPr>
@@ -3930,7 +3959,7 @@
       </w:tr>
       <w:tr>
         <w:trPr>
-          <w:cantSplit w:val="true"/>
+          <w:cantSplit w:val="1"/>
         </w:trPr>
         <w:tc>
           <w:tcPr>
@@ -4010,7 +4039,7 @@
       </w:tr>
       <w:tr>
         <w:trPr>
-          <w:cantSplit w:val="true"/>
+          <w:cantSplit w:val="1"/>
         </w:trPr>
         <w:tc>
           <w:tcPr>
@@ -4093,7 +4122,7 @@
       </w:tr>
       <w:tr>
         <w:trPr>
-          <w:cantSplit w:val="true"/>
+          <w:cantSplit w:val="1"/>
         </w:trPr>
         <w:tc>
           <w:tcPr>
@@ -4308,7 +4337,7 @@
       <w:tr>
         <w:trPr>
           <w:tblHeader w:val="true"/>
-          <w:cantSplit w:val="true"/>
+          <w:cantSplit w:val="1"/>
         </w:trPr>
         <w:tc>
           <w:tcPr>
@@ -4400,7 +4429,7 @@
       </w:tr>
       <w:tr>
         <w:trPr>
-          <w:cantSplit w:val="true"/>
+          <w:cantSplit w:val="1"/>
         </w:trPr>
         <w:tc>
           <w:tcPr>
@@ -4480,7 +4509,7 @@
       </w:tr>
       <w:tr>
         <w:trPr>
-          <w:cantSplit w:val="true"/>
+          <w:cantSplit w:val="1"/>
         </w:trPr>
         <w:tc>
           <w:tcPr>
@@ -4932,7 +4961,7 @@
       <w:tr>
         <w:trPr>
           <w:tblHeader w:val="true"/>
-          <w:cantSplit w:val="true"/>
+          <w:cantSplit w:val="1"/>
         </w:trPr>
         <w:tc>
           <w:tcPr>
@@ -4995,7 +5024,7 @@
       </w:tr>
       <w:tr>
         <w:trPr>
-          <w:cantSplit w:val="true"/>
+          <w:cantSplit w:val="1"/>
         </w:trPr>
         <w:tc>
           <w:tcPr>
@@ -5050,7 +5079,7 @@
       </w:tr>
       <w:tr>
         <w:trPr>
-          <w:cantSplit w:val="true"/>
+          <w:cantSplit w:val="1"/>
         </w:trPr>
         <w:tc>
           <w:tcPr>
@@ -5107,7 +5136,7 @@
       </w:tr>
       <w:tr>
         <w:trPr>
-          <w:cantSplit w:val="true"/>
+          <w:cantSplit w:val="1"/>
         </w:trPr>
         <w:tc>
           <w:tcPr>
@@ -5162,7 +5191,7 @@
       </w:tr>
       <w:tr>
         <w:trPr>
-          <w:cantSplit w:val="true"/>
+          <w:cantSplit w:val="1"/>
         </w:trPr>
         <w:tc>
           <w:tcPr>
@@ -5219,7 +5248,7 @@
       </w:tr>
       <w:tr>
         <w:trPr>
-          <w:cantSplit w:val="true"/>
+          <w:cantSplit w:val="1"/>
         </w:trPr>
         <w:tc>
           <w:tcPr>
@@ -5274,7 +5303,7 @@
       </w:tr>
       <w:tr>
         <w:trPr>
-          <w:cantSplit w:val="true"/>
+          <w:cantSplit w:val="1"/>
         </w:trPr>
         <w:tc>
           <w:tcPr>
@@ -5618,7 +5647,7 @@
       <w:tr>
         <w:trPr>
           <w:tblHeader w:val="true"/>
-          <w:cantSplit w:val="true"/>
+          <w:cantSplit w:val="1"/>
         </w:trPr>
         <w:tc>
           <w:tcPr>
@@ -5710,7 +5739,7 @@
       </w:tr>
       <w:tr>
         <w:trPr>
-          <w:cantSplit w:val="true"/>
+          <w:cantSplit w:val="1"/>
         </w:trPr>
         <w:tc>
           <w:tcPr>
@@ -5792,7 +5821,7 @@
       </w:tr>
       <w:tr>
         <w:trPr>
-          <w:cantSplit w:val="true"/>
+          <w:cantSplit w:val="1"/>
         </w:trPr>
         <w:tc>
           <w:tcPr>
@@ -5875,7 +5904,7 @@
       </w:tr>
       <w:tr>
         <w:trPr>
-          <w:cantSplit w:val="true"/>
+          <w:cantSplit w:val="1"/>
         </w:trPr>
         <w:tc>
           <w:tcPr>
@@ -5955,7 +5984,7 @@
       </w:tr>
       <w:tr>
         <w:trPr>
-          <w:cantSplit w:val="true"/>
+          <w:cantSplit w:val="1"/>
         </w:trPr>
         <w:tc>
           <w:tcPr>
@@ -6038,7 +6067,7 @@
       </w:tr>
       <w:tr>
         <w:trPr>
-          <w:cantSplit w:val="true"/>
+          <w:cantSplit w:val="1"/>
         </w:trPr>
         <w:tc>
           <w:tcPr>
@@ -6118,7 +6147,7 @@
       </w:tr>
       <w:tr>
         <w:trPr>
-          <w:cantSplit w:val="true"/>
+          <w:cantSplit w:val="1"/>
         </w:trPr>
         <w:tc>
           <w:tcPr>
@@ -6201,7 +6230,7 @@
       </w:tr>
       <w:tr>
         <w:trPr>
-          <w:cantSplit w:val="true"/>
+          <w:cantSplit w:val="1"/>
         </w:trPr>
         <w:tc>
           <w:tcPr>
@@ -6281,7 +6310,7 @@
       </w:tr>
       <w:tr>
         <w:trPr>
-          <w:cantSplit w:val="true"/>
+          <w:cantSplit w:val="1"/>
         </w:trPr>
         <w:tc>
           <w:tcPr>
@@ -6486,7 +6515,7 @@
       <w:tr>
         <w:trPr>
           <w:tblHeader w:val="true"/>
-          <w:cantSplit w:val="true"/>
+          <w:cantSplit w:val="1"/>
         </w:trPr>
         <w:tc>
           <w:tcPr>
@@ -6549,7 +6578,7 @@
       </w:tr>
       <w:tr>
         <w:trPr>
-          <w:cantSplit w:val="true"/>
+          <w:cantSplit w:val="1"/>
         </w:trPr>
         <w:tc>
           <w:tcPr>
@@ -6604,7 +6633,7 @@
       </w:tr>
       <w:tr>
         <w:trPr>
-          <w:cantSplit w:val="true"/>
+          <w:cantSplit w:val="1"/>
         </w:trPr>
         <w:tc>
           <w:tcPr>
@@ -6661,7 +6690,7 @@
       </w:tr>
       <w:tr>
         <w:trPr>
-          <w:cantSplit w:val="true"/>
+          <w:cantSplit w:val="1"/>
         </w:trPr>
         <w:tc>
           <w:tcPr>
@@ -6716,7 +6745,7 @@
       </w:tr>
       <w:tr>
         <w:trPr>
-          <w:cantSplit w:val="true"/>
+          <w:cantSplit w:val="1"/>
         </w:trPr>
         <w:tc>
           <w:tcPr>
@@ -6773,7 +6802,7 @@
       </w:tr>
       <w:tr>
         <w:trPr>
-          <w:cantSplit w:val="true"/>
+          <w:cantSplit w:val="1"/>
         </w:trPr>
         <w:tc>
           <w:tcPr>
@@ -6828,7 +6857,7 @@
       </w:tr>
       <w:tr>
         <w:trPr>
-          <w:cantSplit w:val="true"/>
+          <w:cantSplit w:val="1"/>
         </w:trPr>
         <w:tc>
           <w:tcPr>
@@ -6885,7 +6914,7 @@
       </w:tr>
       <w:tr>
         <w:trPr>
-          <w:cantSplit w:val="true"/>
+          <w:cantSplit w:val="1"/>
         </w:trPr>
         <w:tc>
           <w:tcPr>
@@ -6940,7 +6969,7 @@
       </w:tr>
       <w:tr>
         <w:trPr>
-          <w:cantSplit w:val="true"/>
+          <w:cantSplit w:val="1"/>
         </w:trPr>
         <w:tc>
           <w:tcPr>
@@ -6997,7 +7026,7 @@
       </w:tr>
       <w:tr>
         <w:trPr>
-          <w:cantSplit w:val="true"/>
+          <w:cantSplit w:val="1"/>
         </w:trPr>
         <w:tc>
           <w:tcPr>
@@ -7052,7 +7081,7 @@
       </w:tr>
       <w:tr>
         <w:trPr>
-          <w:cantSplit w:val="true"/>
+          <w:cantSplit w:val="1"/>
         </w:trPr>
         <w:tc>
           <w:tcPr>
@@ -7109,7 +7138,7 @@
       </w:tr>
       <w:tr>
         <w:trPr>
-          <w:cantSplit w:val="true"/>
+          <w:cantSplit w:val="1"/>
         </w:trPr>
         <w:tc>
           <w:tcPr>
@@ -7164,7 +7193,7 @@
       </w:tr>
       <w:tr>
         <w:trPr>
-          <w:cantSplit w:val="true"/>
+          <w:cantSplit w:val="1"/>
         </w:trPr>
         <w:tc>
           <w:tcPr>
@@ -7221,7 +7250,7 @@
       </w:tr>
       <w:tr>
         <w:trPr>
-          <w:cantSplit w:val="true"/>
+          <w:cantSplit w:val="1"/>
         </w:trPr>
         <w:tc>
           <w:tcPr>
@@ -7276,7 +7305,7 @@
       </w:tr>
       <w:tr>
         <w:trPr>
-          <w:cantSplit w:val="true"/>
+          <w:cantSplit w:val="1"/>
         </w:trPr>
         <w:tc>
           <w:tcPr>
@@ -7333,7 +7362,7 @@
       </w:tr>
       <w:tr>
         <w:trPr>
-          <w:cantSplit w:val="true"/>
+          <w:cantSplit w:val="1"/>
         </w:trPr>
         <w:tc>
           <w:tcPr>
@@ -7388,7 +7417,7 @@
       </w:tr>
       <w:tr>
         <w:trPr>
-          <w:cantSplit w:val="true"/>
+          <w:cantSplit w:val="1"/>
         </w:trPr>
         <w:tc>
           <w:tcPr>
@@ -7445,7 +7474,7 @@
       </w:tr>
       <w:tr>
         <w:trPr>
-          <w:cantSplit w:val="true"/>
+          <w:cantSplit w:val="1"/>
         </w:trPr>
         <w:tc>
           <w:tcPr>
@@ -7500,7 +7529,7 @@
       </w:tr>
       <w:tr>
         <w:trPr>
-          <w:cantSplit w:val="true"/>
+          <w:cantSplit w:val="1"/>
         </w:trPr>
         <w:tc>
           <w:tcPr>
@@ -7557,7 +7586,7 @@
       </w:tr>
       <w:tr>
         <w:trPr>
-          <w:cantSplit w:val="true"/>
+          <w:cantSplit w:val="1"/>
         </w:trPr>
         <w:tc>
           <w:tcPr>
@@ -7612,7 +7641,7 @@
       </w:tr>
       <w:tr>
         <w:trPr>
-          <w:cantSplit w:val="true"/>
+          <w:cantSplit w:val="1"/>
         </w:trPr>
         <w:tc>
           <w:tcPr>
@@ -7669,7 +7698,7 @@
       </w:tr>
       <w:tr>
         <w:trPr>
-          <w:cantSplit w:val="true"/>
+          <w:cantSplit w:val="1"/>
         </w:trPr>
         <w:tc>
           <w:tcPr>
@@ -7724,7 +7753,7 @@
       </w:tr>
       <w:tr>
         <w:trPr>
-          <w:cantSplit w:val="true"/>
+          <w:cantSplit w:val="1"/>
         </w:trPr>
         <w:tc>
           <w:tcPr>
@@ -7781,7 +7810,7 @@
       </w:tr>
       <w:tr>
         <w:trPr>
-          <w:cantSplit w:val="true"/>
+          <w:cantSplit w:val="1"/>
         </w:trPr>
         <w:tc>
           <w:tcPr>
@@ -7836,7 +7865,7 @@
       </w:tr>
       <w:tr>
         <w:trPr>
-          <w:cantSplit w:val="true"/>
+          <w:cantSplit w:val="1"/>
         </w:trPr>
         <w:tc>
           <w:tcPr>
@@ -7893,7 +7922,7 @@
       </w:tr>
       <w:tr>
         <w:trPr>
-          <w:cantSplit w:val="true"/>
+          <w:cantSplit w:val="1"/>
         </w:trPr>
         <w:tc>
           <w:tcPr>
@@ -7948,7 +7977,7 @@
       </w:tr>
       <w:tr>
         <w:trPr>
-          <w:cantSplit w:val="true"/>
+          <w:cantSplit w:val="1"/>
         </w:trPr>
         <w:tc>
           <w:tcPr>
@@ -8005,7 +8034,7 @@
       </w:tr>
       <w:tr>
         <w:trPr>
-          <w:cantSplit w:val="true"/>
+          <w:cantSplit w:val="1"/>
         </w:trPr>
         <w:tc>
           <w:tcPr>
@@ -8060,7 +8089,7 @@
       </w:tr>
       <w:tr>
         <w:trPr>
-          <w:cantSplit w:val="true"/>
+          <w:cantSplit w:val="1"/>
         </w:trPr>
         <w:tc>
           <w:tcPr>
@@ -8117,7 +8146,7 @@
       </w:tr>
       <w:tr>
         <w:trPr>
-          <w:cantSplit w:val="true"/>
+          <w:cantSplit w:val="1"/>
         </w:trPr>
         <w:tc>
           <w:tcPr>
@@ -8172,7 +8201,7 @@
       </w:tr>
       <w:tr>
         <w:trPr>
-          <w:cantSplit w:val="true"/>
+          <w:cantSplit w:val="1"/>
         </w:trPr>
         <w:tc>
           <w:tcPr>
@@ -8229,7 +8258,7 @@
       </w:tr>
       <w:tr>
         <w:trPr>
-          <w:cantSplit w:val="true"/>
+          <w:cantSplit w:val="1"/>
         </w:trPr>
         <w:tc>
           <w:tcPr>
@@ -8284,7 +8313,7 @@
       </w:tr>
       <w:tr>
         <w:trPr>
-          <w:cantSplit w:val="true"/>
+          <w:cantSplit w:val="1"/>
         </w:trPr>
         <w:tc>
           <w:tcPr>
@@ -8341,7 +8370,7 @@
       </w:tr>
       <w:tr>
         <w:trPr>
-          <w:cantSplit w:val="true"/>
+          <w:cantSplit w:val="1"/>
         </w:trPr>
         <w:tc>
           <w:tcPr>
@@ -8396,7 +8425,7 @@
       </w:tr>
       <w:tr>
         <w:trPr>
-          <w:cantSplit w:val="true"/>
+          <w:cantSplit w:val="1"/>
         </w:trPr>
         <w:tc>
           <w:tcPr>
@@ -8453,7 +8482,7 @@
       </w:tr>
       <w:tr>
         <w:trPr>
-          <w:cantSplit w:val="true"/>
+          <w:cantSplit w:val="1"/>
         </w:trPr>
         <w:tc>
           <w:tcPr>
@@ -8508,7 +8537,7 @@
       </w:tr>
       <w:tr>
         <w:trPr>
-          <w:cantSplit w:val="true"/>
+          <w:cantSplit w:val="1"/>
         </w:trPr>
         <w:tc>
           <w:tcPr>
@@ -8565,7 +8594,7 @@
       </w:tr>
       <w:tr>
         <w:trPr>
-          <w:cantSplit w:val="true"/>
+          <w:cantSplit w:val="1"/>
         </w:trPr>
         <w:tc>
           <w:tcPr>
@@ -8620,7 +8649,7 @@
       </w:tr>
       <w:tr>
         <w:trPr>
-          <w:cantSplit w:val="true"/>
+          <w:cantSplit w:val="1"/>
         </w:trPr>
         <w:tc>
           <w:tcPr>
@@ -8677,7 +8706,7 @@
       </w:tr>
       <w:tr>
         <w:trPr>
-          <w:cantSplit w:val="true"/>
+          <w:cantSplit w:val="1"/>
         </w:trPr>
         <w:tc>
           <w:tcPr>
@@ -8732,7 +8761,7 @@
       </w:tr>
       <w:tr>
         <w:trPr>
-          <w:cantSplit w:val="true"/>
+          <w:cantSplit w:val="1"/>
         </w:trPr>
         <w:tc>
           <w:tcPr>
@@ -8789,7 +8818,7 @@
       </w:tr>
       <w:tr>
         <w:trPr>
-          <w:cantSplit w:val="true"/>
+          <w:cantSplit w:val="1"/>
         </w:trPr>
         <w:tc>
           <w:tcPr>
@@ -8844,7 +8873,7 @@
       </w:tr>
       <w:tr>
         <w:trPr>
-          <w:cantSplit w:val="true"/>
+          <w:cantSplit w:val="1"/>
         </w:trPr>
         <w:tc>
           <w:tcPr>
@@ -8901,7 +8930,7 @@
       </w:tr>
       <w:tr>
         <w:trPr>
-          <w:cantSplit w:val="true"/>
+          <w:cantSplit w:val="1"/>
         </w:trPr>
         <w:tc>
           <w:tcPr>
@@ -8956,7 +8985,7 @@
       </w:tr>
       <w:tr>
         <w:trPr>
-          <w:cantSplit w:val="true"/>
+          <w:cantSplit w:val="1"/>
         </w:trPr>
         <w:tc>
           <w:tcPr>
@@ -9013,7 +9042,7 @@
       </w:tr>
       <w:tr>
         <w:trPr>
-          <w:cantSplit w:val="true"/>
+          <w:cantSplit w:val="1"/>
         </w:trPr>
         <w:tc>
           <w:tcPr>
@@ -9068,7 +9097,7 @@
       </w:tr>
       <w:tr>
         <w:trPr>
-          <w:cantSplit w:val="true"/>
+          <w:cantSplit w:val="1"/>
         </w:trPr>
         <w:tc>
           <w:tcPr>
@@ -9125,7 +9154,7 @@
       </w:tr>
       <w:tr>
         <w:trPr>
-          <w:cantSplit w:val="true"/>
+          <w:cantSplit w:val="1"/>
         </w:trPr>
         <w:tc>
           <w:tcPr>
@@ -9180,7 +9209,7 @@
       </w:tr>
       <w:tr>
         <w:trPr>
-          <w:cantSplit w:val="true"/>
+          <w:cantSplit w:val="1"/>
         </w:trPr>
         <w:tc>
           <w:tcPr>
@@ -9237,7 +9266,7 @@
       </w:tr>
       <w:tr>
         <w:trPr>
-          <w:cantSplit w:val="true"/>
+          <w:cantSplit w:val="1"/>
         </w:trPr>
         <w:tc>
           <w:tcPr>
@@ -9292,7 +9321,7 @@
       </w:tr>
       <w:tr>
         <w:trPr>
-          <w:cantSplit w:val="true"/>
+          <w:cantSplit w:val="1"/>
         </w:trPr>
         <w:tc>
           <w:tcPr>
@@ -9349,7 +9378,7 @@
       </w:tr>
       <w:tr>
         <w:trPr>
-          <w:cantSplit w:val="true"/>
+          <w:cantSplit w:val="1"/>
         </w:trPr>
         <w:tc>
           <w:tcPr>
@@ -9404,7 +9433,7 @@
       </w:tr>
       <w:tr>
         <w:trPr>
-          <w:cantSplit w:val="true"/>
+          <w:cantSplit w:val="1"/>
         </w:trPr>
         <w:tc>
           <w:tcPr>
@@ -9461,7 +9490,7 @@
       </w:tr>
       <w:tr>
         <w:trPr>
-          <w:cantSplit w:val="true"/>
+          <w:cantSplit w:val="1"/>
         </w:trPr>
         <w:tc>
           <w:tcPr>
@@ -9516,7 +9545,7 @@
       </w:tr>
       <w:tr>
         <w:trPr>
-          <w:cantSplit w:val="true"/>
+          <w:cantSplit w:val="1"/>
         </w:trPr>
         <w:tc>
           <w:tcPr>
@@ -9573,7 +9602,7 @@
       </w:tr>
       <w:tr>
         <w:trPr>
-          <w:cantSplit w:val="true"/>
+          <w:cantSplit w:val="1"/>
         </w:trPr>
         <w:tc>
           <w:tcPr>
@@ -9628,7 +9657,7 @@
       </w:tr>
       <w:tr>
         <w:trPr>
-          <w:cantSplit w:val="true"/>
+          <w:cantSplit w:val="1"/>
         </w:trPr>
         <w:tc>
           <w:tcPr>
@@ -9685,7 +9714,7 @@
       </w:tr>
       <w:tr>
         <w:trPr>
-          <w:cantSplit w:val="true"/>
+          <w:cantSplit w:val="1"/>
         </w:trPr>
         <w:tc>
           <w:tcPr>
@@ -9738,14 +9767,102 @@
           </w:p>
         </w:tc>
       </w:tr>
+    </w:tbl>
+    <w:p>
+      <w:pPr>
+        <w:spacing w:after="60"/>
+      </w:pPr>
+    </w:p>
+    <w:tbl>
+      <w:tblPr>
+        <w:tblW w:type="dxa" w:w="9360"/>
+        <w:tblLayout w:type="fixed"/>
+        <w:tblLook w:firstColumn="1" w:firstRow="1" w:lastColumn="0" w:lastRow="0" w:noHBand="0" w:noVBand="1" w:val="04A0"/>
+        <w:tblInd w:w="120" w:type="dxa"/>
+        <w:tblBorders>
+          <w:top w:val="single" w:sz="6" w:space="0" w:color="CBD5E1"/>
+          <w:left w:val="single" w:sz="6" w:space="0" w:color="CBD5E1"/>
+          <w:bottom w:val="single" w:sz="6" w:space="0" w:color="CBD5E1"/>
+          <w:right w:val="single" w:sz="6" w:space="0" w:color="CBD5E1"/>
+          <w:insideH w:val="single" w:sz="6" w:space="0" w:color="CBD5E1"/>
+          <w:insideV w:val="single" w:sz="6" w:space="0" w:color="CBD5E1"/>
+        </w:tblBorders>
+      </w:tblPr>
+      <w:tblGrid>
+        <w:gridCol w:w="4300"/>
+        <w:gridCol w:w="5060"/>
+      </w:tblGrid>
       <w:tr>
         <w:trPr>
-          <w:cantSplit w:val="true"/>
+          <w:tblHeader w:val="true"/>
+          <w:cantSplit w:val="1"/>
         </w:trPr>
         <w:tc>
           <w:tcPr>
             <w:tcW w:type="dxa" w:w="4300"/>
-            <w:shd w:fill="FAFBFC"/>
+            <w:tcMar>
+              <w:top w:w="80" w:type="dxa"/>
+              <w:start w:w="120" w:type="dxa"/>
+              <w:bottom w:w="80" w:type="dxa"/>
+              <w:end w:w="120" w:type="dxa"/>
+            </w:tcMar>
+            <w:vAlign w:val="center"/>
+            <w:shd w:fill="E8EEF5"/>
+          </w:tcPr>
+          <w:p>
+            <w:pPr>
+              <w:keepNext/>
+              <w:spacing w:before="0" w:after="0" w:line="264" w:lineRule="auto"/>
+              <w:jc w:val="center"/>
+            </w:pPr>
+            <w:r>
+              <w:rPr>
+                <w:rFonts w:ascii="맑은 고딕" w:hAnsi="맑은 고딕" w:eastAsia="맑은 고딕" w:cs="맑은 고딕"/>
+                <w:b/>
+                <w:color w:val="16324F"/>
+                <w:sz w:val="17"/>
+              </w:rPr>
+              <w:t>표시 코드/증상</w:t>
+            </w:r>
+          </w:p>
+        </w:tc>
+        <w:tc>
+          <w:tcPr>
+            <w:tcW w:type="dxa" w:w="5060"/>
+            <w:tcMar>
+              <w:top w:w="80" w:type="dxa"/>
+              <w:start w:w="120" w:type="dxa"/>
+              <w:bottom w:w="80" w:type="dxa"/>
+              <w:end w:w="120" w:type="dxa"/>
+            </w:tcMar>
+            <w:vAlign w:val="center"/>
+            <w:shd w:fill="E8EEF5"/>
+          </w:tcPr>
+          <w:p>
+            <w:pPr>
+              <w:keepNext/>
+              <w:spacing w:before="0" w:after="0" w:line="264" w:lineRule="auto"/>
+              <w:jc w:val="center"/>
+            </w:pPr>
+            <w:r>
+              <w:rPr>
+                <w:rFonts w:ascii="맑은 고딕" w:hAnsi="맑은 고딕" w:eastAsia="맑은 고딕" w:cs="맑은 고딕"/>
+                <w:b/>
+                <w:color w:val="16324F"/>
+                <w:sz w:val="17"/>
+              </w:rPr>
+              <w:t>확인 순서</w:t>
+            </w:r>
+          </w:p>
+        </w:tc>
+      </w:tr>
+      <w:tr>
+        <w:trPr>
+          <w:cantSplit w:val="1"/>
+        </w:trPr>
+        <w:tc>
+          <w:tcPr>
+            <w:tcW w:type="dxa" w:w="4300"/>
             <w:tcMar>
               <w:top w:w="80" w:type="dxa"/>
               <w:start w:w="120" w:type="dxa"/>
@@ -9771,7 +9888,6 @@
         <w:tc>
           <w:tcPr>
             <w:tcW w:type="dxa" w:w="5060"/>
-            <w:shd w:fill="FAFBFC"/>
             <w:tcMar>
               <w:top w:w="80" w:type="dxa"/>
               <w:start w:w="120" w:type="dxa"/>
@@ -9797,11 +9913,12 @@
       </w:tr>
       <w:tr>
         <w:trPr>
-          <w:cantSplit w:val="true"/>
+          <w:cantSplit w:val="1"/>
         </w:trPr>
         <w:tc>
           <w:tcPr>
             <w:tcW w:type="dxa" w:w="4300"/>
+            <w:shd w:fill="FAFBFC"/>
             <w:tcMar>
               <w:top w:w="80" w:type="dxa"/>
               <w:start w:w="120" w:type="dxa"/>
@@ -9827,6 +9944,7 @@
         <w:tc>
           <w:tcPr>
             <w:tcW w:type="dxa" w:w="5060"/>
+            <w:shd w:fill="FAFBFC"/>
             <w:tcMar>
               <w:top w:w="80" w:type="dxa"/>
               <w:start w:w="120" w:type="dxa"/>
@@ -9852,12 +9970,11 @@
       </w:tr>
       <w:tr>
         <w:trPr>
-          <w:cantSplit w:val="true"/>
+          <w:cantSplit w:val="1"/>
         </w:trPr>
         <w:tc>
           <w:tcPr>
             <w:tcW w:type="dxa" w:w="4300"/>
-            <w:shd w:fill="FAFBFC"/>
             <w:tcMar>
               <w:top w:w="80" w:type="dxa"/>
               <w:start w:w="120" w:type="dxa"/>
@@ -9883,7 +10000,6 @@
         <w:tc>
           <w:tcPr>
             <w:tcW w:type="dxa" w:w="5060"/>
-            <w:shd w:fill="FAFBFC"/>
             <w:tcMar>
               <w:top w:w="80" w:type="dxa"/>
               <w:start w:w="120" w:type="dxa"/>
@@ -9909,11 +10025,12 @@
       </w:tr>
       <w:tr>
         <w:trPr>
-          <w:cantSplit w:val="true"/>
+          <w:cantSplit w:val="1"/>
         </w:trPr>
         <w:tc>
           <w:tcPr>
             <w:tcW w:type="dxa" w:w="4300"/>
+            <w:shd w:fill="FAFBFC"/>
             <w:tcMar>
               <w:top w:w="80" w:type="dxa"/>
               <w:start w:w="120" w:type="dxa"/>
@@ -9939,6 +10056,7 @@
         <w:tc>
           <w:tcPr>
             <w:tcW w:type="dxa" w:w="5060"/>
+            <w:shd w:fill="FAFBFC"/>
             <w:tcMar>
               <w:top w:w="80" w:type="dxa"/>
               <w:start w:w="120" w:type="dxa"/>
@@ -9964,12 +10082,11 @@
       </w:tr>
       <w:tr>
         <w:trPr>
-          <w:cantSplit w:val="true"/>
+          <w:cantSplit w:val="1"/>
         </w:trPr>
         <w:tc>
           <w:tcPr>
             <w:tcW w:type="dxa" w:w="4300"/>
-            <w:shd w:fill="FAFBFC"/>
             <w:tcMar>
               <w:top w:w="80" w:type="dxa"/>
               <w:start w:w="120" w:type="dxa"/>
@@ -9995,7 +10112,6 @@
         <w:tc>
           <w:tcPr>
             <w:tcW w:type="dxa" w:w="5060"/>
-            <w:shd w:fill="FAFBFC"/>
             <w:tcMar>
               <w:top w:w="80" w:type="dxa"/>
               <w:start w:w="120" w:type="dxa"/>
@@ -10199,7 +10315,7 @@
       <w:tr>
         <w:trPr>
           <w:tblHeader w:val="true"/>
-          <w:cantSplit w:val="true"/>
+          <w:cantSplit w:val="1"/>
         </w:trPr>
         <w:tc>
           <w:tcPr>
@@ -10262,7 +10378,7 @@
       </w:tr>
       <w:tr>
         <w:trPr>
-          <w:cantSplit w:val="true"/>
+          <w:cantSplit w:val="1"/>
         </w:trPr>
         <w:tc>
           <w:tcPr>
@@ -10317,7 +10433,7 @@
       </w:tr>
       <w:tr>
         <w:trPr>
-          <w:cantSplit w:val="true"/>
+          <w:cantSplit w:val="1"/>
         </w:trPr>
         <w:tc>
           <w:tcPr>
@@ -10374,7 +10490,7 @@
       </w:tr>
       <w:tr>
         <w:trPr>
-          <w:cantSplit w:val="true"/>
+          <w:cantSplit w:val="1"/>
         </w:trPr>
         <w:tc>
           <w:tcPr>
@@ -10429,7 +10545,7 @@
       </w:tr>
       <w:tr>
         <w:trPr>
-          <w:cantSplit w:val="true"/>
+          <w:cantSplit w:val="1"/>
         </w:trPr>
         <w:tc>
           <w:tcPr>
@@ -10800,7 +10916,7 @@
         <w:color w:val="64748B"/>
         <w:sz w:val="17"/>
       </w:rPr>
-      <w:t xml:space="preserve">v0.11.7-poc  |  </w:t>
+      <w:t xml:space="preserve">v0.11.8-poc  |  </w:t>
     </w:r>
     <w:r>
       <w:rPr>
@@ -10831,7 +10947,7 @@
         <w:color w:val="64748B"/>
         <w:sz w:val="17"/>
       </w:rPr>
-      <w:t>v0.11.7-poc  |  2026-08-12</w:t>
+      <w:t>v0.11.8-poc  |  2026-08-12</w:t>
     </w:r>
   </w:p>
 </w:ftr>

</xml_diff>

<commit_message>
Stabilize setup and Viewer operations (#61)
* Stabilize setup and Viewer operations

* Stabilize WPF smoke on shared runners

* Bound WPF dispatcher smoke drain
</commit_message>
<xml_diff>
--- a/docs/SamsungSwitchWatch_User_Manual_KO.docx
+++ b/docs/SamsungSwitchWatch_User_Manual_KO.docx
@@ -168,7 +168,7 @@
       <w:tr>
         <w:trPr>
           <w:tblHeader w:val="true"/>
-          <w:cantSplit w:val="true"/>
+          <w:cantSplit w:val="1"/>
         </w:trPr>
         <w:tc>
           <w:tcPr>
@@ -260,7 +260,7 @@
       </w:tr>
       <w:tr>
         <w:trPr>
-          <w:cantSplit w:val="true"/>
+          <w:cantSplit w:val="1"/>
         </w:trPr>
         <w:tc>
           <w:tcPr>
@@ -340,7 +340,7 @@
       </w:tr>
       <w:tr>
         <w:trPr>
-          <w:cantSplit w:val="true"/>
+          <w:cantSplit w:val="1"/>
         </w:trPr>
         <w:tc>
           <w:tcPr>
@@ -423,7 +423,7 @@
       </w:tr>
       <w:tr>
         <w:trPr>
-          <w:cantSplit w:val="true"/>
+          <w:cantSplit w:val="1"/>
         </w:trPr>
         <w:tc>
           <w:tcPr>
@@ -677,7 +677,7 @@
           <w:color w:val="16324F"/>
           <w:sz w:val="21"/>
         </w:rPr>
-        <w:t>포트 상태와 시스템 로그는 순차적인 개별 세션으로 수집합니다. 명령 시간 초과·출력 한도는 실패한 항목만 확인 불가로 표시하고 다른 항목을 계속 확인합니다. 명령은 30초 동안 새 응답이 없으면 중단하고, 출력이 계속되어도 전체 90초를 넘기지 않습니다. 같은 실패 명령은 현재 주기에서 즉시 재시도하지 않습니다. 인증·enable·TCP·세션 종료는 반복 로그인을 막기 위해 해당 장비 주기를 중단합니다. 이번 POC의 자동 감시 검증·지원 범위는 등록 장비 10대 이하입니다.</w:t>
+        <w:t>포트 상태와 시스템 로그는 순차적인 개별 세션으로 수집합니다. 명령 시간 초과·출력 한도는 실패한 항목만 확인 불가로 표시하고 다른 항목을 계속 확인합니다. 명령은 30초 동안 새 응답이 없으면 중단하고, 출력이 계속되어도 전체 90초를 넘기지 않습니다. 같은 실패 명령은 현재 주기에서 즉시 재시도하지 않습니다. COMMAND_TIMEOUT 또는 QUERY_TIMEOUT이면 다음 점검 주기에 다음 읽기 전용 후보를 한 번 시도합니다. 인증·enable·TCP·세션 종료는 반복 로그인을 막기 위해 해당 장비 주기를 중단합니다. 이번 POC의 자동 감시 검증·지원 범위는 등록 장비 10대 이하입니다.</w:t>
       </w:r>
     </w:p>
     <w:p>
@@ -743,7 +743,7 @@
       <w:tr>
         <w:trPr>
           <w:tblHeader w:val="true"/>
-          <w:cantSplit w:val="true"/>
+          <w:cantSplit w:val="1"/>
         </w:trPr>
         <w:tc>
           <w:tcPr>
@@ -835,7 +835,7 @@
       </w:tr>
       <w:tr>
         <w:trPr>
-          <w:cantSplit w:val="true"/>
+          <w:cantSplit w:val="1"/>
         </w:trPr>
         <w:tc>
           <w:tcPr>
@@ -915,7 +915,7 @@
       </w:tr>
       <w:tr>
         <w:trPr>
-          <w:cantSplit w:val="true"/>
+          <w:cantSplit w:val="1"/>
         </w:trPr>
         <w:tc>
           <w:tcPr>
@@ -1159,7 +1159,7 @@
           <w:color w:val="16324F"/>
           <w:sz w:val="21"/>
         </w:rPr>
-        <w:t>0.11.7-poc는 코드 서명되지 않은 시험판입니다. 압축을 풀기 전에 Agent와 Viewer ZIP의 SHA-256을 해당 GitHub Release 본문에 표시된 값과 비교하고 사내 보안 반입 절차를 완료하세요. SmartScreen 또는 EDR 경고를 우회하지 않습니다.</w:t>
+        <w:t>0.11.8-poc는 코드 서명되지 않은 시험판입니다. 압축을 풀기 전에 Agent와 Viewer ZIP의 SHA-256을 해당 GitHub Release 본문에 표시된 값과 비교하고 사내 보안 반입 절차를 완료하세요. SmartScreen 또는 EDR 경고를 우회하지 않습니다.</w:t>
       </w:r>
     </w:p>
     <w:p>
@@ -1647,7 +1647,7 @@
           <w:color w:val="16324F"/>
           <w:sz w:val="21"/>
         </w:rPr>
-        <w:t>Setup은 BUILD-MANIFEST.json과 Agent 실행 파일 SHA-256을 확인하고, Program Files의 임시 staging에 복사한 파일을 다시 검사한 뒤 교체합니다. 패키지·파일·서비스 변경 자체가 실패한 경우에만 설치 전 상태로 되돌리기를 시도합니다. 서비스가 설치·시작된 뒤 로컬 HTTPS/API/버전 또는 방화벽 준비 상태를 확인하지 못한 경우에는 설치를 되돌리지 않고 AGENT_LOCAL_CONNECTION_UNCONFIRMED 경고로 남깁니다. 다음 실행에서 완료되지 않은 journal이 남아 있으면 자동 복구하지 않고 별도의 '이전 상태 복구' 작업을 요구합니다. 검사 중에는 현재 서비스 PID와 TCP/18443 소유를 매번 다시 확인합니다. rollback 전에는 관찰한 서비스 프로세스 종료를 확인하고 프로그램 폴더의 일시적 잠금만 최대 5회 제한적으로 재시도합니다. staging·backup·failed·journal 정리가 잠시 실패하면 정확히 검증된 대상만 최대 3회 시도하고 실패한 시도 사이 250ms 대기한 뒤 삭제 결과를 확인합니다. 변경 자체의 복구까지 실패하면 최초 설치 실패 코드를 별도로 유지하고 SETUP_ROLLBACK_FAILED와 실패한 ROLLBACK_* 단계를 함께 표시합니다.</w:t>
+        <w:t>Setup은 BUILD-MANIFEST.json과 Agent 실행 파일 SHA-256을 확인하고, Program Files의 임시 staging에 복사한 파일을 다시 검사한 뒤 교체합니다. 패키지·파일·서비스 변경 자체가 실패한 경우에만 설치 전 상태로 되돌리기를 시도합니다. 서비스가 설치·시작된 뒤 로컬 HTTPS/API/버전 또는 방화벽 준비 상태를 확인하지 못한 경우에는 설치를 되돌리지 않고 AGENT_LOCAL_CONNECTION_UNCONFIRMED 경고로 남깁니다. 다음 실행에서 완료되지 않은 journal이 남아 있으면 자동 복구하지 않고 별도의 '이전 상태 복구' 작업을 요구합니다. 검사 중에는 현재 서비스 PID와 TCP/18443 소유를 매번 다시 확인합니다. rollback 전에는 관찰한 서비스 프로세스 종료를 확인하고 프로그램 폴더의 일시적 잠금만 최대 5회 제한적으로 재시도합니다. staging·backup·failed·journal 정리가 잠시 실패하면 정확히 검증된 대상만 최대 3회 시도하고 실패한 시도 사이 250ms 대기한 뒤 삭제 결과를 확인합니다. journal은 원자적으로 교체하며 교체가 완료된 뒤 임시 파일 정리만 실패해도 저장 완료를 실패로 되돌리지 않습니다. 새 ProgramData 제품 루트는 원자적 생성에 성공한 경우에만 ACL과 파일을 쓰므로 검사 직후 다른 프로세스가 만든 폴더는 수정하지 않습니다. 변경 자체의 복구까지 실패하면 최초 설치 실패 코드를 별도로 유지하고 SETUP_ROLLBACK_FAILED와 실패한 ROLLBACK_* 단계를 함께 표시합니다.</w:t>
       </w:r>
     </w:p>
     <w:p>
@@ -1705,7 +1705,7 @@
           <w:color w:val="16324F"/>
           <w:sz w:val="21"/>
         </w:rPr>
-        <w:t>설치/업데이트는 별도 사전 점검과 배포에서 같은 서비스 정보를 중복 조회하지 않습니다. 초기 조회가 일시적으로 실패하면 200ms 뒤 한 번만 다시 확인합니다. 계속 실패하면 파일·서비스·방화벽 변경 전에 SETUP_SERVICE_CAPTURE_FAILED로 중단합니다. 기존 서비스의 실행 경로·시작 유형·계정 계약 불일치는 SETUP_SERVICE_CONTRACT_FAILED, 기존 서비스 중지는 SETUP_SERVICE_STOP_FAILED, 실행 경로·자동 시작·가상 계정 같은 핵심 구성은 SETUP_SERVICE_CONFIG_FAILED, 실제 시작은 SETUP_SERVICE_START_FAILED로 구분합니다. 이 단계들은 Agent 구동에 필요하므로 실패하면 fail-closed로 중단합니다. 서비스 설명, 자동 복구 정책 또는 제한 DACL 적용만 실패하면 SETUP_SERVICE_DESCRIPTION_WARNING, SETUP_SERVICE_RECOVERY_POLICY_WARNING 또는 SETUP_SERVICE_DACL_WARNING을 남기고 계속합니다. 이 경우에도 핵심 구성과 Running 상태는 반드시 확인합니다.</w:t>
+        <w:t>설치/업데이트는 별도 사전 점검과 배포에서 같은 서비스 정보를 중복 조회하지 않습니다. 초기 조회가 일시적으로 실패하면 200ms 뒤 한 번만 다시 확인합니다. 계속 실패하면 파일·서비스·방화벽 변경 전에 SETUP_SERVICE_CAPTURE_FAILED로 중단합니다. 기존 서비스의 실행 경로·시작 유형·계정 계약 불일치는 SETUP_SERVICE_CONTRACT_FAILED, 기존 서비스 중지는 SETUP_SERVICE_STOP_FAILED, 실행 경로·자동 시작·가상 계정 같은 핵심 구성은 SETUP_SERVICE_CONFIG_FAILED, 실제 시작은 SETUP_SERVICE_START_FAILED로 구분합니다. 이 단계들은 Agent 구동에 필요하므로 실패하면 fail-closed로 중단합니다. 서비스 설명, 자동 복구 정책 또는 제한 DACL 적용만 실패하면 SETUP_SERVICE_DESCRIPTION_WARNING, SETUP_SERVICE_RECOVERY_POLICY_WARNING 또는 SETUP_SERVICE_DACL_WARNING을 남기고 계속합니다. 이 경우에도 핵심 구성과 Running 상태는 반드시 확인합니다. START_PENDING은 중복 시작 없이 기다리고, STOP_PENDING은 중지가 끝난 뒤 한 번만 시작합니다. 시스템 시각 변경의 영향을 받지 않는 제한 시간 안에 완료되지 않으면 SETUP_SERVICE_START_FAILED로 중단합니다.</w:t>
       </w:r>
     </w:p>
     <w:p>
@@ -1788,7 +1788,7 @@
       <w:tr>
         <w:trPr>
           <w:tblHeader w:val="true"/>
-          <w:cantSplit w:val="true"/>
+          <w:cantSplit w:val="1"/>
         </w:trPr>
         <w:tc>
           <w:tcPr>
@@ -1851,7 +1851,7 @@
       </w:tr>
       <w:tr>
         <w:trPr>
-          <w:cantSplit w:val="true"/>
+          <w:cantSplit w:val="1"/>
         </w:trPr>
         <w:tc>
           <w:tcPr>
@@ -1906,7 +1906,7 @@
       </w:tr>
       <w:tr>
         <w:trPr>
-          <w:cantSplit w:val="true"/>
+          <w:cantSplit w:val="1"/>
         </w:trPr>
         <w:tc>
           <w:tcPr>
@@ -1963,7 +1963,7 @@
       </w:tr>
       <w:tr>
         <w:trPr>
-          <w:cantSplit w:val="true"/>
+          <w:cantSplit w:val="1"/>
         </w:trPr>
         <w:tc>
           <w:tcPr>
@@ -2018,7 +2018,7 @@
       </w:tr>
       <w:tr>
         <w:trPr>
-          <w:cantSplit w:val="true"/>
+          <w:cantSplit w:val="1"/>
         </w:trPr>
         <w:tc>
           <w:tcPr>
@@ -2075,7 +2075,7 @@
       </w:tr>
       <w:tr>
         <w:trPr>
-          <w:cantSplit w:val="true"/>
+          <w:cantSplit w:val="1"/>
         </w:trPr>
         <w:tc>
           <w:tcPr>
@@ -2130,7 +2130,7 @@
       </w:tr>
       <w:tr>
         <w:trPr>
-          <w:cantSplit w:val="true"/>
+          <w:cantSplit w:val="1"/>
         </w:trPr>
         <w:tc>
           <w:tcPr>
@@ -2381,7 +2381,7 @@
           <w:color w:val="16324F"/>
           <w:sz w:val="21"/>
         </w:rPr>
-        <w:t>Agent Setup에 AGENT_LOCAL_CONNECTION_UNCONFIRMED 또는 FIREWALL_REMOTE_ACCESS_UNCONFIRMED가 표시되면 Agent 서비스와 프로그램은 설치됐지만 연결 준비를 확인하지 못했다는 뜻입니다. Viewer에서 연결 테스트를 실행하고, TCP/18443이 실패할 때 Windows 관리자에게 확인하세요. 규칙을 AGENT_CONNECTION_REFUSED가 보이면 Viewer에 스위치 IP나 localhost가 아니라 Agent를 설치한 PC의 실제 주소를 입력했는지 먼저 확인하세요. 같은 PC 시험에서는 해당 PC의 사설 IPv4 또는 localhost를 사용할 수 있습니다. 그 다음 Windows 서비스에서 SamsungSwitchWatchAgent가 Running인지 확인하고 TCP/18443을 점검합니다. TCP 단계는 성공하고 HTTPS 단계가 실패하면 방화벽이 아니라 Agent PC의 로컬 HTTPS/TLS 준비 상태를 확인합니다. AGENT_CLIENT_NOT_ALLOWED이면 Viewer 주소가 RFC1918 사설 범위인지 확인합니다. 서비스를 수동 등록하지 말고 0.11.7-poc Agent Setup을 사용하세요.</w:t>
+        <w:t>Agent Setup에 AGENT_LOCAL_CONNECTION_UNCONFIRMED 또는 FIREWALL_REMOTE_ACCESS_UNCONFIRMED가 표시되면 Agent 서비스와 프로그램은 설치됐지만 연결 준비를 확인하지 못했다는 뜻입니다. Viewer에서 연결 테스트를 실행하고, TCP/18443이 실패할 때 Windows 관리자에게 확인하세요. 규칙을 AGENT_CONNECTION_REFUSED가 보이면 Viewer에 스위치 IP나 localhost가 아니라 Agent를 설치한 PC의 실제 주소를 입력했는지 먼저 확인하세요. 같은 PC 시험에서는 해당 PC의 사설 IPv4 또는 localhost를 사용할 수 있습니다. 그 다음 Windows 서비스에서 SamsungSwitchWatchAgent가 Running인지 확인하고 TCP/18443을 점검합니다. TCP 단계는 성공하고 HTTPS 단계가 실패하면 방화벽이 아니라 Agent PC의 로컬 HTTPS/TLS 준비 상태를 확인합니다. AGENT_CLIENT_NOT_ALLOWED이면 Viewer 주소가 RFC1918 사설 범위인지 확인합니다. 서비스를 수동 등록하지 말고 0.11.8-poc Agent Setup을 사용하세요.</w:t>
       </w:r>
     </w:p>
     <w:p>
@@ -2543,7 +2543,7 @@
           <w:color w:val="16324F"/>
           <w:sz w:val="21"/>
         </w:rPr>
-        <w:t>0.11.7-poc는 코드 서명되지 않아 SmartScreen이나 사내 EDR이 차단할 수 있습니다. ZIP을 완전히 압축 해제하고 Setup, Viewer EXE와 제공된 DLL이 같은 폴더에 있는지 확인하세요. EDR·AppLocker·WDAC가 차단하면 우회하지 말고 공식 ZIP의 버전·해시와 차단 기록을 보안 담당자에게 전달하세요.</w:t>
+        <w:t>0.11.8-poc는 코드 서명되지 않아 SmartScreen이나 사내 EDR이 차단할 수 있습니다. ZIP을 완전히 압축 해제하고 Setup, Viewer EXE와 제공된 DLL이 같은 폴더에 있는지 확인하세요. EDR·AppLocker·WDAC가 차단하면 우회하지 말고 공식 ZIP의 버전·해시와 차단 기록을 보안 담당자에게 전달하세요.</w:t>
       </w:r>
     </w:p>
     <w:p>
@@ -3005,6 +3005,35 @@
     </w:p>
     <w:p>
       <w:pPr>
+        <w:keepLines/>
+        <w:pageBreakBefore w:val="0"/>
+        <w:spacing w:before="80" w:after="160" w:line="283" w:lineRule="auto"/>
+        <w:ind w:left="115" w:right="58"/>
+        <w:shd w:fill="E8EEF5"/>
+        <w:pBdr>
+          <w:left w:val="single" w:sz="16" w:space="8" w:color="2E74B5"/>
+        </w:pBdr>
+      </w:pPr>
+      <w:r>
+        <w:rPr>
+          <w:rFonts w:ascii="맑은 고딕" w:hAnsi="맑은 고딕" w:eastAsia="맑은 고딕" w:cs="맑은 고딕"/>
+          <w:b/>
+          <w:color w:val="2E74B5"/>
+          <w:sz w:val="21"/>
+        </w:rPr>
+        <w:t xml:space="preserve">중복 실행과 창 닫기  </w:t>
+      </w:r>
+      <w:r>
+        <w:rPr>
+          <w:rFonts w:ascii="맑은 고딕" w:hAnsi="맑은 고딕" w:eastAsia="맑은 고딕" w:cs="맑은 고딕"/>
+          <w:color w:val="16324F"/>
+          <w:sz w:val="21"/>
+        </w:rPr>
+        <w:t>포트 상태/시스템 로그 수동 점검과 직접 입력한 읽기 전용 명령은 동시에 하나만 실행됩니다. 하나가 실행 중이면 다른 실행 버튼은 잠시 비활성화되며 뒤에서 다시 실행되지 않습니다. 장비 관리 창을 닫으면 진행 중인 연결을 취소하고 화면의 로그인 PW와 enable PW를 즉시 지웁니다.</w:t>
+      </w:r>
+    </w:p>
+    <w:p>
+      <w:pPr>
         <w:pStyle w:val="Heading3"/>
         <w:pageBreakBefore/>
       </w:pPr>
@@ -3041,7 +3070,7 @@
       <w:tr>
         <w:trPr>
           <w:tblHeader w:val="true"/>
-          <w:cantSplit w:val="true"/>
+          <w:cantSplit w:val="1"/>
         </w:trPr>
         <w:tc>
           <w:tcPr>
@@ -3133,7 +3162,7 @@
       </w:tr>
       <w:tr>
         <w:trPr>
-          <w:cantSplit w:val="true"/>
+          <w:cantSplit w:val="1"/>
         </w:trPr>
         <w:tc>
           <w:tcPr>
@@ -3213,7 +3242,7 @@
       </w:tr>
       <w:tr>
         <w:trPr>
-          <w:cantSplit w:val="true"/>
+          <w:cantSplit w:val="1"/>
         </w:trPr>
         <w:tc>
           <w:tcPr>
@@ -3296,7 +3325,7 @@
       </w:tr>
       <w:tr>
         <w:trPr>
-          <w:cantSplit w:val="true"/>
+          <w:cantSplit w:val="1"/>
         </w:trPr>
         <w:tc>
           <w:tcPr>
@@ -3376,7 +3405,7 @@
       </w:tr>
       <w:tr>
         <w:trPr>
-          <w:cantSplit w:val="true"/>
+          <w:cantSplit w:val="1"/>
         </w:trPr>
         <w:tc>
           <w:tcPr>
@@ -3459,7 +3488,7 @@
       </w:tr>
       <w:tr>
         <w:trPr>
-          <w:cantSplit w:val="true"/>
+          <w:cantSplit w:val="1"/>
         </w:trPr>
         <w:tc>
           <w:tcPr>
@@ -3539,7 +3568,7 @@
       </w:tr>
       <w:tr>
         <w:trPr>
-          <w:cantSplit w:val="true"/>
+          <w:cantSplit w:val="1"/>
         </w:trPr>
         <w:tc>
           <w:tcPr>
@@ -3622,7 +3651,7 @@
       </w:tr>
       <w:tr>
         <w:trPr>
-          <w:cantSplit w:val="true"/>
+          <w:cantSplit w:val="1"/>
         </w:trPr>
         <w:tc>
           <w:tcPr>
@@ -3838,7 +3867,7 @@
       <w:tr>
         <w:trPr>
           <w:tblHeader w:val="true"/>
-          <w:cantSplit w:val="true"/>
+          <w:cantSplit w:val="1"/>
         </w:trPr>
         <w:tc>
           <w:tcPr>
@@ -3930,7 +3959,7 @@
       </w:tr>
       <w:tr>
         <w:trPr>
-          <w:cantSplit w:val="true"/>
+          <w:cantSplit w:val="1"/>
         </w:trPr>
         <w:tc>
           <w:tcPr>
@@ -4010,7 +4039,7 @@
       </w:tr>
       <w:tr>
         <w:trPr>
-          <w:cantSplit w:val="true"/>
+          <w:cantSplit w:val="1"/>
         </w:trPr>
         <w:tc>
           <w:tcPr>
@@ -4093,7 +4122,7 @@
       </w:tr>
       <w:tr>
         <w:trPr>
-          <w:cantSplit w:val="true"/>
+          <w:cantSplit w:val="1"/>
         </w:trPr>
         <w:tc>
           <w:tcPr>
@@ -4308,7 +4337,7 @@
       <w:tr>
         <w:trPr>
           <w:tblHeader w:val="true"/>
-          <w:cantSplit w:val="true"/>
+          <w:cantSplit w:val="1"/>
         </w:trPr>
         <w:tc>
           <w:tcPr>
@@ -4400,7 +4429,7 @@
       </w:tr>
       <w:tr>
         <w:trPr>
-          <w:cantSplit w:val="true"/>
+          <w:cantSplit w:val="1"/>
         </w:trPr>
         <w:tc>
           <w:tcPr>
@@ -4480,7 +4509,7 @@
       </w:tr>
       <w:tr>
         <w:trPr>
-          <w:cantSplit w:val="true"/>
+          <w:cantSplit w:val="1"/>
         </w:trPr>
         <w:tc>
           <w:tcPr>
@@ -4932,7 +4961,7 @@
       <w:tr>
         <w:trPr>
           <w:tblHeader w:val="true"/>
-          <w:cantSplit w:val="true"/>
+          <w:cantSplit w:val="1"/>
         </w:trPr>
         <w:tc>
           <w:tcPr>
@@ -4995,7 +5024,7 @@
       </w:tr>
       <w:tr>
         <w:trPr>
-          <w:cantSplit w:val="true"/>
+          <w:cantSplit w:val="1"/>
         </w:trPr>
         <w:tc>
           <w:tcPr>
@@ -5050,7 +5079,7 @@
       </w:tr>
       <w:tr>
         <w:trPr>
-          <w:cantSplit w:val="true"/>
+          <w:cantSplit w:val="1"/>
         </w:trPr>
         <w:tc>
           <w:tcPr>
@@ -5107,7 +5136,7 @@
       </w:tr>
       <w:tr>
         <w:trPr>
-          <w:cantSplit w:val="true"/>
+          <w:cantSplit w:val="1"/>
         </w:trPr>
         <w:tc>
           <w:tcPr>
@@ -5162,7 +5191,7 @@
       </w:tr>
       <w:tr>
         <w:trPr>
-          <w:cantSplit w:val="true"/>
+          <w:cantSplit w:val="1"/>
         </w:trPr>
         <w:tc>
           <w:tcPr>
@@ -5219,7 +5248,7 @@
       </w:tr>
       <w:tr>
         <w:trPr>
-          <w:cantSplit w:val="true"/>
+          <w:cantSplit w:val="1"/>
         </w:trPr>
         <w:tc>
           <w:tcPr>
@@ -5274,7 +5303,7 @@
       </w:tr>
       <w:tr>
         <w:trPr>
-          <w:cantSplit w:val="true"/>
+          <w:cantSplit w:val="1"/>
         </w:trPr>
         <w:tc>
           <w:tcPr>
@@ -5618,7 +5647,7 @@
       <w:tr>
         <w:trPr>
           <w:tblHeader w:val="true"/>
-          <w:cantSplit w:val="true"/>
+          <w:cantSplit w:val="1"/>
         </w:trPr>
         <w:tc>
           <w:tcPr>
@@ -5710,7 +5739,7 @@
       </w:tr>
       <w:tr>
         <w:trPr>
-          <w:cantSplit w:val="true"/>
+          <w:cantSplit w:val="1"/>
         </w:trPr>
         <w:tc>
           <w:tcPr>
@@ -5792,7 +5821,7 @@
       </w:tr>
       <w:tr>
         <w:trPr>
-          <w:cantSplit w:val="true"/>
+          <w:cantSplit w:val="1"/>
         </w:trPr>
         <w:tc>
           <w:tcPr>
@@ -5875,7 +5904,7 @@
       </w:tr>
       <w:tr>
         <w:trPr>
-          <w:cantSplit w:val="true"/>
+          <w:cantSplit w:val="1"/>
         </w:trPr>
         <w:tc>
           <w:tcPr>
@@ -5955,7 +5984,7 @@
       </w:tr>
       <w:tr>
         <w:trPr>
-          <w:cantSplit w:val="true"/>
+          <w:cantSplit w:val="1"/>
         </w:trPr>
         <w:tc>
           <w:tcPr>
@@ -6038,7 +6067,7 @@
       </w:tr>
       <w:tr>
         <w:trPr>
-          <w:cantSplit w:val="true"/>
+          <w:cantSplit w:val="1"/>
         </w:trPr>
         <w:tc>
           <w:tcPr>
@@ -6118,7 +6147,7 @@
       </w:tr>
       <w:tr>
         <w:trPr>
-          <w:cantSplit w:val="true"/>
+          <w:cantSplit w:val="1"/>
         </w:trPr>
         <w:tc>
           <w:tcPr>
@@ -6201,7 +6230,7 @@
       </w:tr>
       <w:tr>
         <w:trPr>
-          <w:cantSplit w:val="true"/>
+          <w:cantSplit w:val="1"/>
         </w:trPr>
         <w:tc>
           <w:tcPr>
@@ -6281,7 +6310,7 @@
       </w:tr>
       <w:tr>
         <w:trPr>
-          <w:cantSplit w:val="true"/>
+          <w:cantSplit w:val="1"/>
         </w:trPr>
         <w:tc>
           <w:tcPr>
@@ -6486,7 +6515,7 @@
       <w:tr>
         <w:trPr>
           <w:tblHeader w:val="true"/>
-          <w:cantSplit w:val="true"/>
+          <w:cantSplit w:val="1"/>
         </w:trPr>
         <w:tc>
           <w:tcPr>
@@ -6549,7 +6578,7 @@
       </w:tr>
       <w:tr>
         <w:trPr>
-          <w:cantSplit w:val="true"/>
+          <w:cantSplit w:val="1"/>
         </w:trPr>
         <w:tc>
           <w:tcPr>
@@ -6604,7 +6633,7 @@
       </w:tr>
       <w:tr>
         <w:trPr>
-          <w:cantSplit w:val="true"/>
+          <w:cantSplit w:val="1"/>
         </w:trPr>
         <w:tc>
           <w:tcPr>
@@ -6661,7 +6690,7 @@
       </w:tr>
       <w:tr>
         <w:trPr>
-          <w:cantSplit w:val="true"/>
+          <w:cantSplit w:val="1"/>
         </w:trPr>
         <w:tc>
           <w:tcPr>
@@ -6716,7 +6745,7 @@
       </w:tr>
       <w:tr>
         <w:trPr>
-          <w:cantSplit w:val="true"/>
+          <w:cantSplit w:val="1"/>
         </w:trPr>
         <w:tc>
           <w:tcPr>
@@ -6773,7 +6802,7 @@
       </w:tr>
       <w:tr>
         <w:trPr>
-          <w:cantSplit w:val="true"/>
+          <w:cantSplit w:val="1"/>
         </w:trPr>
         <w:tc>
           <w:tcPr>
@@ -6828,7 +6857,7 @@
       </w:tr>
       <w:tr>
         <w:trPr>
-          <w:cantSplit w:val="true"/>
+          <w:cantSplit w:val="1"/>
         </w:trPr>
         <w:tc>
           <w:tcPr>
@@ -6885,7 +6914,7 @@
       </w:tr>
       <w:tr>
         <w:trPr>
-          <w:cantSplit w:val="true"/>
+          <w:cantSplit w:val="1"/>
         </w:trPr>
         <w:tc>
           <w:tcPr>
@@ -6940,7 +6969,7 @@
       </w:tr>
       <w:tr>
         <w:trPr>
-          <w:cantSplit w:val="true"/>
+          <w:cantSplit w:val="1"/>
         </w:trPr>
         <w:tc>
           <w:tcPr>
@@ -6997,7 +7026,7 @@
       </w:tr>
       <w:tr>
         <w:trPr>
-          <w:cantSplit w:val="true"/>
+          <w:cantSplit w:val="1"/>
         </w:trPr>
         <w:tc>
           <w:tcPr>
@@ -7052,7 +7081,7 @@
       </w:tr>
       <w:tr>
         <w:trPr>
-          <w:cantSplit w:val="true"/>
+          <w:cantSplit w:val="1"/>
         </w:trPr>
         <w:tc>
           <w:tcPr>
@@ -7109,7 +7138,7 @@
       </w:tr>
       <w:tr>
         <w:trPr>
-          <w:cantSplit w:val="true"/>
+          <w:cantSplit w:val="1"/>
         </w:trPr>
         <w:tc>
           <w:tcPr>
@@ -7164,7 +7193,7 @@
       </w:tr>
       <w:tr>
         <w:trPr>
-          <w:cantSplit w:val="true"/>
+          <w:cantSplit w:val="1"/>
         </w:trPr>
         <w:tc>
           <w:tcPr>
@@ -7221,7 +7250,7 @@
       </w:tr>
       <w:tr>
         <w:trPr>
-          <w:cantSplit w:val="true"/>
+          <w:cantSplit w:val="1"/>
         </w:trPr>
         <w:tc>
           <w:tcPr>
@@ -7276,7 +7305,7 @@
       </w:tr>
       <w:tr>
         <w:trPr>
-          <w:cantSplit w:val="true"/>
+          <w:cantSplit w:val="1"/>
         </w:trPr>
         <w:tc>
           <w:tcPr>
@@ -7333,7 +7362,7 @@
       </w:tr>
       <w:tr>
         <w:trPr>
-          <w:cantSplit w:val="true"/>
+          <w:cantSplit w:val="1"/>
         </w:trPr>
         <w:tc>
           <w:tcPr>
@@ -7388,7 +7417,7 @@
       </w:tr>
       <w:tr>
         <w:trPr>
-          <w:cantSplit w:val="true"/>
+          <w:cantSplit w:val="1"/>
         </w:trPr>
         <w:tc>
           <w:tcPr>
@@ -7445,7 +7474,7 @@
       </w:tr>
       <w:tr>
         <w:trPr>
-          <w:cantSplit w:val="true"/>
+          <w:cantSplit w:val="1"/>
         </w:trPr>
         <w:tc>
           <w:tcPr>
@@ -7500,7 +7529,7 @@
       </w:tr>
       <w:tr>
         <w:trPr>
-          <w:cantSplit w:val="true"/>
+          <w:cantSplit w:val="1"/>
         </w:trPr>
         <w:tc>
           <w:tcPr>
@@ -7557,7 +7586,7 @@
       </w:tr>
       <w:tr>
         <w:trPr>
-          <w:cantSplit w:val="true"/>
+          <w:cantSplit w:val="1"/>
         </w:trPr>
         <w:tc>
           <w:tcPr>
@@ -7612,7 +7641,7 @@
       </w:tr>
       <w:tr>
         <w:trPr>
-          <w:cantSplit w:val="true"/>
+          <w:cantSplit w:val="1"/>
         </w:trPr>
         <w:tc>
           <w:tcPr>
@@ -7669,7 +7698,7 @@
       </w:tr>
       <w:tr>
         <w:trPr>
-          <w:cantSplit w:val="true"/>
+          <w:cantSplit w:val="1"/>
         </w:trPr>
         <w:tc>
           <w:tcPr>
@@ -7724,7 +7753,7 @@
       </w:tr>
       <w:tr>
         <w:trPr>
-          <w:cantSplit w:val="true"/>
+          <w:cantSplit w:val="1"/>
         </w:trPr>
         <w:tc>
           <w:tcPr>
@@ -7781,7 +7810,7 @@
       </w:tr>
       <w:tr>
         <w:trPr>
-          <w:cantSplit w:val="true"/>
+          <w:cantSplit w:val="1"/>
         </w:trPr>
         <w:tc>
           <w:tcPr>
@@ -7836,7 +7865,7 @@
       </w:tr>
       <w:tr>
         <w:trPr>
-          <w:cantSplit w:val="true"/>
+          <w:cantSplit w:val="1"/>
         </w:trPr>
         <w:tc>
           <w:tcPr>
@@ -7893,7 +7922,7 @@
       </w:tr>
       <w:tr>
         <w:trPr>
-          <w:cantSplit w:val="true"/>
+          <w:cantSplit w:val="1"/>
         </w:trPr>
         <w:tc>
           <w:tcPr>
@@ -7948,7 +7977,7 @@
       </w:tr>
       <w:tr>
         <w:trPr>
-          <w:cantSplit w:val="true"/>
+          <w:cantSplit w:val="1"/>
         </w:trPr>
         <w:tc>
           <w:tcPr>
@@ -8005,7 +8034,7 @@
       </w:tr>
       <w:tr>
         <w:trPr>
-          <w:cantSplit w:val="true"/>
+          <w:cantSplit w:val="1"/>
         </w:trPr>
         <w:tc>
           <w:tcPr>
@@ -8060,7 +8089,7 @@
       </w:tr>
       <w:tr>
         <w:trPr>
-          <w:cantSplit w:val="true"/>
+          <w:cantSplit w:val="1"/>
         </w:trPr>
         <w:tc>
           <w:tcPr>
@@ -8117,7 +8146,7 @@
       </w:tr>
       <w:tr>
         <w:trPr>
-          <w:cantSplit w:val="true"/>
+          <w:cantSplit w:val="1"/>
         </w:trPr>
         <w:tc>
           <w:tcPr>
@@ -8172,7 +8201,7 @@
       </w:tr>
       <w:tr>
         <w:trPr>
-          <w:cantSplit w:val="true"/>
+          <w:cantSplit w:val="1"/>
         </w:trPr>
         <w:tc>
           <w:tcPr>
@@ -8229,7 +8258,7 @@
       </w:tr>
       <w:tr>
         <w:trPr>
-          <w:cantSplit w:val="true"/>
+          <w:cantSplit w:val="1"/>
         </w:trPr>
         <w:tc>
           <w:tcPr>
@@ -8284,7 +8313,7 @@
       </w:tr>
       <w:tr>
         <w:trPr>
-          <w:cantSplit w:val="true"/>
+          <w:cantSplit w:val="1"/>
         </w:trPr>
         <w:tc>
           <w:tcPr>
@@ -8341,7 +8370,7 @@
       </w:tr>
       <w:tr>
         <w:trPr>
-          <w:cantSplit w:val="true"/>
+          <w:cantSplit w:val="1"/>
         </w:trPr>
         <w:tc>
           <w:tcPr>
@@ -8396,7 +8425,7 @@
       </w:tr>
       <w:tr>
         <w:trPr>
-          <w:cantSplit w:val="true"/>
+          <w:cantSplit w:val="1"/>
         </w:trPr>
         <w:tc>
           <w:tcPr>
@@ -8453,7 +8482,7 @@
       </w:tr>
       <w:tr>
         <w:trPr>
-          <w:cantSplit w:val="true"/>
+          <w:cantSplit w:val="1"/>
         </w:trPr>
         <w:tc>
           <w:tcPr>
@@ -8508,7 +8537,7 @@
       </w:tr>
       <w:tr>
         <w:trPr>
-          <w:cantSplit w:val="true"/>
+          <w:cantSplit w:val="1"/>
         </w:trPr>
         <w:tc>
           <w:tcPr>
@@ -8565,7 +8594,7 @@
       </w:tr>
       <w:tr>
         <w:trPr>
-          <w:cantSplit w:val="true"/>
+          <w:cantSplit w:val="1"/>
         </w:trPr>
         <w:tc>
           <w:tcPr>
@@ -8620,7 +8649,7 @@
       </w:tr>
       <w:tr>
         <w:trPr>
-          <w:cantSplit w:val="true"/>
+          <w:cantSplit w:val="1"/>
         </w:trPr>
         <w:tc>
           <w:tcPr>
@@ -8677,7 +8706,7 @@
       </w:tr>
       <w:tr>
         <w:trPr>
-          <w:cantSplit w:val="true"/>
+          <w:cantSplit w:val="1"/>
         </w:trPr>
         <w:tc>
           <w:tcPr>
@@ -8732,7 +8761,7 @@
       </w:tr>
       <w:tr>
         <w:trPr>
-          <w:cantSplit w:val="true"/>
+          <w:cantSplit w:val="1"/>
         </w:trPr>
         <w:tc>
           <w:tcPr>
@@ -8789,7 +8818,7 @@
       </w:tr>
       <w:tr>
         <w:trPr>
-          <w:cantSplit w:val="true"/>
+          <w:cantSplit w:val="1"/>
         </w:trPr>
         <w:tc>
           <w:tcPr>
@@ -8844,7 +8873,7 @@
       </w:tr>
       <w:tr>
         <w:trPr>
-          <w:cantSplit w:val="true"/>
+          <w:cantSplit w:val="1"/>
         </w:trPr>
         <w:tc>
           <w:tcPr>
@@ -8901,7 +8930,7 @@
       </w:tr>
       <w:tr>
         <w:trPr>
-          <w:cantSplit w:val="true"/>
+          <w:cantSplit w:val="1"/>
         </w:trPr>
         <w:tc>
           <w:tcPr>
@@ -8956,7 +8985,7 @@
       </w:tr>
       <w:tr>
         <w:trPr>
-          <w:cantSplit w:val="true"/>
+          <w:cantSplit w:val="1"/>
         </w:trPr>
         <w:tc>
           <w:tcPr>
@@ -9013,7 +9042,7 @@
       </w:tr>
       <w:tr>
         <w:trPr>
-          <w:cantSplit w:val="true"/>
+          <w:cantSplit w:val="1"/>
         </w:trPr>
         <w:tc>
           <w:tcPr>
@@ -9068,7 +9097,7 @@
       </w:tr>
       <w:tr>
         <w:trPr>
-          <w:cantSplit w:val="true"/>
+          <w:cantSplit w:val="1"/>
         </w:trPr>
         <w:tc>
           <w:tcPr>
@@ -9125,7 +9154,7 @@
       </w:tr>
       <w:tr>
         <w:trPr>
-          <w:cantSplit w:val="true"/>
+          <w:cantSplit w:val="1"/>
         </w:trPr>
         <w:tc>
           <w:tcPr>
@@ -9180,7 +9209,7 @@
       </w:tr>
       <w:tr>
         <w:trPr>
-          <w:cantSplit w:val="true"/>
+          <w:cantSplit w:val="1"/>
         </w:trPr>
         <w:tc>
           <w:tcPr>
@@ -9237,7 +9266,7 @@
       </w:tr>
       <w:tr>
         <w:trPr>
-          <w:cantSplit w:val="true"/>
+          <w:cantSplit w:val="1"/>
         </w:trPr>
         <w:tc>
           <w:tcPr>
@@ -9292,7 +9321,7 @@
       </w:tr>
       <w:tr>
         <w:trPr>
-          <w:cantSplit w:val="true"/>
+          <w:cantSplit w:val="1"/>
         </w:trPr>
         <w:tc>
           <w:tcPr>
@@ -9349,7 +9378,7 @@
       </w:tr>
       <w:tr>
         <w:trPr>
-          <w:cantSplit w:val="true"/>
+          <w:cantSplit w:val="1"/>
         </w:trPr>
         <w:tc>
           <w:tcPr>
@@ -9404,7 +9433,7 @@
       </w:tr>
       <w:tr>
         <w:trPr>
-          <w:cantSplit w:val="true"/>
+          <w:cantSplit w:val="1"/>
         </w:trPr>
         <w:tc>
           <w:tcPr>
@@ -9461,7 +9490,7 @@
       </w:tr>
       <w:tr>
         <w:trPr>
-          <w:cantSplit w:val="true"/>
+          <w:cantSplit w:val="1"/>
         </w:trPr>
         <w:tc>
           <w:tcPr>
@@ -9516,7 +9545,7 @@
       </w:tr>
       <w:tr>
         <w:trPr>
-          <w:cantSplit w:val="true"/>
+          <w:cantSplit w:val="1"/>
         </w:trPr>
         <w:tc>
           <w:tcPr>
@@ -9573,7 +9602,7 @@
       </w:tr>
       <w:tr>
         <w:trPr>
-          <w:cantSplit w:val="true"/>
+          <w:cantSplit w:val="1"/>
         </w:trPr>
         <w:tc>
           <w:tcPr>
@@ -9628,7 +9657,7 @@
       </w:tr>
       <w:tr>
         <w:trPr>
-          <w:cantSplit w:val="true"/>
+          <w:cantSplit w:val="1"/>
         </w:trPr>
         <w:tc>
           <w:tcPr>
@@ -9685,7 +9714,7 @@
       </w:tr>
       <w:tr>
         <w:trPr>
-          <w:cantSplit w:val="true"/>
+          <w:cantSplit w:val="1"/>
         </w:trPr>
         <w:tc>
           <w:tcPr>
@@ -9738,14 +9767,102 @@
           </w:p>
         </w:tc>
       </w:tr>
+    </w:tbl>
+    <w:p>
+      <w:pPr>
+        <w:spacing w:after="60"/>
+      </w:pPr>
+    </w:p>
+    <w:tbl>
+      <w:tblPr>
+        <w:tblW w:type="dxa" w:w="9360"/>
+        <w:tblLayout w:type="fixed"/>
+        <w:tblLook w:firstColumn="1" w:firstRow="1" w:lastColumn="0" w:lastRow="0" w:noHBand="0" w:noVBand="1" w:val="04A0"/>
+        <w:tblInd w:w="120" w:type="dxa"/>
+        <w:tblBorders>
+          <w:top w:val="single" w:sz="6" w:space="0" w:color="CBD5E1"/>
+          <w:left w:val="single" w:sz="6" w:space="0" w:color="CBD5E1"/>
+          <w:bottom w:val="single" w:sz="6" w:space="0" w:color="CBD5E1"/>
+          <w:right w:val="single" w:sz="6" w:space="0" w:color="CBD5E1"/>
+          <w:insideH w:val="single" w:sz="6" w:space="0" w:color="CBD5E1"/>
+          <w:insideV w:val="single" w:sz="6" w:space="0" w:color="CBD5E1"/>
+        </w:tblBorders>
+      </w:tblPr>
+      <w:tblGrid>
+        <w:gridCol w:w="4300"/>
+        <w:gridCol w:w="5060"/>
+      </w:tblGrid>
       <w:tr>
         <w:trPr>
-          <w:cantSplit w:val="true"/>
+          <w:tblHeader w:val="true"/>
+          <w:cantSplit w:val="1"/>
         </w:trPr>
         <w:tc>
           <w:tcPr>
             <w:tcW w:type="dxa" w:w="4300"/>
-            <w:shd w:fill="FAFBFC"/>
+            <w:tcMar>
+              <w:top w:w="80" w:type="dxa"/>
+              <w:start w:w="120" w:type="dxa"/>
+              <w:bottom w:w="80" w:type="dxa"/>
+              <w:end w:w="120" w:type="dxa"/>
+            </w:tcMar>
+            <w:vAlign w:val="center"/>
+            <w:shd w:fill="E8EEF5"/>
+          </w:tcPr>
+          <w:p>
+            <w:pPr>
+              <w:keepNext/>
+              <w:spacing w:before="0" w:after="0" w:line="264" w:lineRule="auto"/>
+              <w:jc w:val="center"/>
+            </w:pPr>
+            <w:r>
+              <w:rPr>
+                <w:rFonts w:ascii="맑은 고딕" w:hAnsi="맑은 고딕" w:eastAsia="맑은 고딕" w:cs="맑은 고딕"/>
+                <w:b/>
+                <w:color w:val="16324F"/>
+                <w:sz w:val="17"/>
+              </w:rPr>
+              <w:t>표시 코드/증상</w:t>
+            </w:r>
+          </w:p>
+        </w:tc>
+        <w:tc>
+          <w:tcPr>
+            <w:tcW w:type="dxa" w:w="5060"/>
+            <w:tcMar>
+              <w:top w:w="80" w:type="dxa"/>
+              <w:start w:w="120" w:type="dxa"/>
+              <w:bottom w:w="80" w:type="dxa"/>
+              <w:end w:w="120" w:type="dxa"/>
+            </w:tcMar>
+            <w:vAlign w:val="center"/>
+            <w:shd w:fill="E8EEF5"/>
+          </w:tcPr>
+          <w:p>
+            <w:pPr>
+              <w:keepNext/>
+              <w:spacing w:before="0" w:after="0" w:line="264" w:lineRule="auto"/>
+              <w:jc w:val="center"/>
+            </w:pPr>
+            <w:r>
+              <w:rPr>
+                <w:rFonts w:ascii="맑은 고딕" w:hAnsi="맑은 고딕" w:eastAsia="맑은 고딕" w:cs="맑은 고딕"/>
+                <w:b/>
+                <w:color w:val="16324F"/>
+                <w:sz w:val="17"/>
+              </w:rPr>
+              <w:t>확인 순서</w:t>
+            </w:r>
+          </w:p>
+        </w:tc>
+      </w:tr>
+      <w:tr>
+        <w:trPr>
+          <w:cantSplit w:val="1"/>
+        </w:trPr>
+        <w:tc>
+          <w:tcPr>
+            <w:tcW w:type="dxa" w:w="4300"/>
             <w:tcMar>
               <w:top w:w="80" w:type="dxa"/>
               <w:start w:w="120" w:type="dxa"/>
@@ -9771,7 +9888,6 @@
         <w:tc>
           <w:tcPr>
             <w:tcW w:type="dxa" w:w="5060"/>
-            <w:shd w:fill="FAFBFC"/>
             <w:tcMar>
               <w:top w:w="80" w:type="dxa"/>
               <w:start w:w="120" w:type="dxa"/>
@@ -9797,11 +9913,12 @@
       </w:tr>
       <w:tr>
         <w:trPr>
-          <w:cantSplit w:val="true"/>
+          <w:cantSplit w:val="1"/>
         </w:trPr>
         <w:tc>
           <w:tcPr>
             <w:tcW w:type="dxa" w:w="4300"/>
+            <w:shd w:fill="FAFBFC"/>
             <w:tcMar>
               <w:top w:w="80" w:type="dxa"/>
               <w:start w:w="120" w:type="dxa"/>
@@ -9827,6 +9944,7 @@
         <w:tc>
           <w:tcPr>
             <w:tcW w:type="dxa" w:w="5060"/>
+            <w:shd w:fill="FAFBFC"/>
             <w:tcMar>
               <w:top w:w="80" w:type="dxa"/>
               <w:start w:w="120" w:type="dxa"/>
@@ -9852,12 +9970,11 @@
       </w:tr>
       <w:tr>
         <w:trPr>
-          <w:cantSplit w:val="true"/>
+          <w:cantSplit w:val="1"/>
         </w:trPr>
         <w:tc>
           <w:tcPr>
             <w:tcW w:type="dxa" w:w="4300"/>
-            <w:shd w:fill="FAFBFC"/>
             <w:tcMar>
               <w:top w:w="80" w:type="dxa"/>
               <w:start w:w="120" w:type="dxa"/>
@@ -9883,7 +10000,6 @@
         <w:tc>
           <w:tcPr>
             <w:tcW w:type="dxa" w:w="5060"/>
-            <w:shd w:fill="FAFBFC"/>
             <w:tcMar>
               <w:top w:w="80" w:type="dxa"/>
               <w:start w:w="120" w:type="dxa"/>
@@ -9909,11 +10025,12 @@
       </w:tr>
       <w:tr>
         <w:trPr>
-          <w:cantSplit w:val="true"/>
+          <w:cantSplit w:val="1"/>
         </w:trPr>
         <w:tc>
           <w:tcPr>
             <w:tcW w:type="dxa" w:w="4300"/>
+            <w:shd w:fill="FAFBFC"/>
             <w:tcMar>
               <w:top w:w="80" w:type="dxa"/>
               <w:start w:w="120" w:type="dxa"/>
@@ -9939,6 +10056,7 @@
         <w:tc>
           <w:tcPr>
             <w:tcW w:type="dxa" w:w="5060"/>
+            <w:shd w:fill="FAFBFC"/>
             <w:tcMar>
               <w:top w:w="80" w:type="dxa"/>
               <w:start w:w="120" w:type="dxa"/>
@@ -9964,12 +10082,11 @@
       </w:tr>
       <w:tr>
         <w:trPr>
-          <w:cantSplit w:val="true"/>
+          <w:cantSplit w:val="1"/>
         </w:trPr>
         <w:tc>
           <w:tcPr>
             <w:tcW w:type="dxa" w:w="4300"/>
-            <w:shd w:fill="FAFBFC"/>
             <w:tcMar>
               <w:top w:w="80" w:type="dxa"/>
               <w:start w:w="120" w:type="dxa"/>
@@ -9995,7 +10112,6 @@
         <w:tc>
           <w:tcPr>
             <w:tcW w:type="dxa" w:w="5060"/>
-            <w:shd w:fill="FAFBFC"/>
             <w:tcMar>
               <w:top w:w="80" w:type="dxa"/>
               <w:start w:w="120" w:type="dxa"/>
@@ -10199,7 +10315,7 @@
       <w:tr>
         <w:trPr>
           <w:tblHeader w:val="true"/>
-          <w:cantSplit w:val="true"/>
+          <w:cantSplit w:val="1"/>
         </w:trPr>
         <w:tc>
           <w:tcPr>
@@ -10262,7 +10378,7 @@
       </w:tr>
       <w:tr>
         <w:trPr>
-          <w:cantSplit w:val="true"/>
+          <w:cantSplit w:val="1"/>
         </w:trPr>
         <w:tc>
           <w:tcPr>
@@ -10317,7 +10433,7 @@
       </w:tr>
       <w:tr>
         <w:trPr>
-          <w:cantSplit w:val="true"/>
+          <w:cantSplit w:val="1"/>
         </w:trPr>
         <w:tc>
           <w:tcPr>
@@ -10374,7 +10490,7 @@
       </w:tr>
       <w:tr>
         <w:trPr>
-          <w:cantSplit w:val="true"/>
+          <w:cantSplit w:val="1"/>
         </w:trPr>
         <w:tc>
           <w:tcPr>
@@ -10429,7 +10545,7 @@
       </w:tr>
       <w:tr>
         <w:trPr>
-          <w:cantSplit w:val="true"/>
+          <w:cantSplit w:val="1"/>
         </w:trPr>
         <w:tc>
           <w:tcPr>
@@ -10800,7 +10916,7 @@
         <w:color w:val="64748B"/>
         <w:sz w:val="17"/>
       </w:rPr>
-      <w:t xml:space="preserve">v0.11.7-poc  |  </w:t>
+      <w:t xml:space="preserve">v0.11.8-poc  |  </w:t>
     </w:r>
     <w:r>
       <w:rPr>
@@ -10831,7 +10947,7 @@
         <w:color w:val="64748B"/>
         <w:sz w:val="17"/>
       </w:rPr>
-      <w:t>v0.11.7-poc  |  2026-08-12</w:t>
+      <w:t>v0.11.8-poc  |  2026-08-12</w:t>
     </w:r>
   </w:p>
 </w:ftr>

</xml_diff>

<commit_message>
feat: detect Samsung switch models automatically
</commit_message>
<xml_diff>
--- a/docs/SamsungSwitchWatch_User_Manual_KO.docx
+++ b/docs/SamsungSwitchWatch_User_Manual_KO.docx
@@ -1159,7 +1159,7 @@
           <w:color w:val="16324F"/>
           <w:sz w:val="21"/>
         </w:rPr>
-        <w:t>0.11.8-poc는 코드 서명되지 않은 시험판입니다. 압축을 풀기 전에 Agent와 Viewer ZIP의 SHA-256을 해당 GitHub Release 본문에 표시된 값과 비교하고 사내 보안 반입 절차를 완료하세요. SmartScreen 또는 EDR 경고를 우회하지 않습니다.</w:t>
+        <w:t>0.11.9-poc는 코드 서명되지 않은 시험판입니다. 압축을 풀기 전에 Agent와 Viewer ZIP의 SHA-256을 해당 GitHub Release 본문에 표시된 값과 비교하고 사내 보안 반입 절차를 완료하세요. SmartScreen 또는 EDR 경고를 우회하지 않습니다.</w:t>
       </w:r>
     </w:p>
     <w:p>
@@ -2381,7 +2381,7 @@
           <w:color w:val="16324F"/>
           <w:sz w:val="21"/>
         </w:rPr>
-        <w:t>Agent Setup에 AGENT_LOCAL_CONNECTION_UNCONFIRMED 또는 FIREWALL_REMOTE_ACCESS_UNCONFIRMED가 표시되면 Agent 서비스와 프로그램은 설치됐지만 연결 준비를 확인하지 못했다는 뜻입니다. Viewer에서 연결 테스트를 실행하고, TCP/18443이 실패할 때 Windows 관리자에게 확인하세요. 규칙을 AGENT_CONNECTION_REFUSED가 보이면 Viewer에 스위치 IP나 localhost가 아니라 Agent를 설치한 PC의 실제 주소를 입력했는지 먼저 확인하세요. 같은 PC 시험에서는 해당 PC의 사설 IPv4 또는 localhost를 사용할 수 있습니다. 그 다음 Windows 서비스에서 SamsungSwitchWatchAgent가 Running인지 확인하고 TCP/18443을 점검합니다. TCP 단계는 성공하고 HTTPS 단계가 실패하면 방화벽이 아니라 Agent PC의 로컬 HTTPS/TLS 준비 상태를 확인합니다. AGENT_CLIENT_NOT_ALLOWED이면 Viewer 주소가 RFC1918 사설 범위인지 확인합니다. 서비스를 수동 등록하지 말고 0.11.8-poc Agent Setup을 사용하세요.</w:t>
+        <w:t>Agent Setup에 AGENT_LOCAL_CONNECTION_UNCONFIRMED 또는 FIREWALL_REMOTE_ACCESS_UNCONFIRMED가 표시되면 Agent 서비스와 프로그램은 설치됐지만 연결 준비를 확인하지 못했다는 뜻입니다. Viewer에서 연결 테스트를 실행하고, TCP/18443이 실패할 때 Windows 관리자에게 확인하세요. 규칙을 AGENT_CONNECTION_REFUSED가 보이면 Viewer에 스위치 IP나 localhost가 아니라 Agent를 설치한 PC의 실제 주소를 입력했는지 먼저 확인하세요. 같은 PC 시험에서는 해당 PC의 사설 IPv4 또는 localhost를 사용할 수 있습니다. 그 다음 Windows 서비스에서 SamsungSwitchWatchAgent가 Running인지 확인하고 TCP/18443을 점검합니다. TCP 단계는 성공하고 HTTPS 단계가 실패하면 방화벽이 아니라 Agent PC의 로컬 HTTPS/TLS 준비 상태를 확인합니다. AGENT_CLIENT_NOT_ALLOWED이면 Viewer 주소가 RFC1918 사설 범위인지 확인합니다. 서비스를 수동 등록하지 말고 0.11.9-poc Agent Setup을 사용하세요.</w:t>
       </w:r>
     </w:p>
     <w:p>
@@ -2543,7 +2543,7 @@
           <w:color w:val="16324F"/>
           <w:sz w:val="21"/>
         </w:rPr>
-        <w:t>0.11.8-poc는 코드 서명되지 않아 SmartScreen이나 사내 EDR이 차단할 수 있습니다. ZIP을 완전히 압축 해제하고 Setup, Viewer EXE와 제공된 DLL이 같은 폴더에 있는지 확인하세요. EDR·AppLocker·WDAC가 차단하면 우회하지 말고 공식 ZIP의 버전·해시와 차단 기록을 보안 담당자에게 전달하세요.</w:t>
+        <w:t>0.11.9-poc는 코드 서명되지 않아 SmartScreen이나 사내 EDR이 차단할 수 있습니다. ZIP을 완전히 압축 해제하고 Setup, Viewer EXE와 제공된 DLL이 같은 폴더에 있는지 확인하세요. EDR·AppLocker·WDAC가 차단하면 우회하지 말고 공식 ZIP의 버전·해시와 차단 기록을 보안 담당자에게 전달하세요.</w:t>
       </w:r>
     </w:p>
     <w:p>
@@ -2964,7 +2964,7 @@
         <w:drawing>
           <wp:inline xmlns:a="http://schemas.openxmlformats.org/drawingml/2006/main" xmlns:pic="http://schemas.openxmlformats.org/drawingml/2006/picture">
             <wp:extent cx="5029200" cy="3540967"/>
-            <wp:docPr id="6" name="Picture 6" title="장비 관리 창" descr="장비명, 모델, IPv4, 계정 ID, 로그인 비밀번호, enable 비밀번호와 감시 설정을 입력하는 창"/>
+            <wp:docPr id="6" name="Picture 6" title="장비 관리 창" descr="장비명, IPv4, 계정 ID와 비밀번호를 입력하고 자동 판별된 모델과 감시 설정을 확인하는 창"/>
             <wp:cNvGraphicFramePr>
               <a:graphicFrameLocks noChangeAspect="1"/>
             </wp:cNvGraphicFramePr>
@@ -3266,7 +3266,7 @@
                 <w:rFonts w:ascii="맑은 고딕" w:hAnsi="맑은 고딕" w:eastAsia="맑은 고딕" w:cs="맑은 고딕"/>
                 <w:sz w:val="18"/>
               </w:rPr>
-              <w:t>모델</w:t>
+              <w:t>모델 (자동)</w:t>
             </w:r>
           </w:p>
         </w:tc>
@@ -3292,7 +3292,7 @@
                 <w:rFonts w:ascii="맑은 고딕" w:hAnsi="맑은 고딕" w:eastAsia="맑은 고딕" w:cs="맑은 고딕"/>
                 <w:sz w:val="18"/>
               </w:rPr>
-              <w:t>예</w:t>
+              <w:t>자동</w:t>
             </w:r>
           </w:p>
         </w:tc>
@@ -3318,7 +3318,7 @@
                 <w:rFonts w:ascii="맑은 고딕" w:hAnsi="맑은 고딕" w:eastAsia="맑은 고딕" w:cs="맑은 고딕"/>
                 <w:sz w:val="18"/>
               </w:rPr>
-              <w:t>IES4224GP, IES4028XP, IES4226XP</w:t>
+              <w:t>로그인 확인에서 IES4224GP, IES4028XP, IES4226XP 중 판별</w:t>
             </w:r>
           </w:p>
         </w:tc>
@@ -3761,7 +3761,7 @@
           <w:color w:val="16324F"/>
           <w:sz w:val="21"/>
         </w:rPr>
-        <w:t>실패한 장비도 저장할 수 있지만 '로그인 미확인'으로 표시되고 주기 감시는 강제로 꺼집니다. 주소가 사설 대역인지, ID/PW와 enable 필요 여부를 바로잡은 뒤 다시 확인하세요. 성공해도 조회 명령까지 검증된 것은 아니므로 수집 진단을 이어서 실행합니다.</w:t>
+        <w:t>새 장비는 로그인과 모델 자동 판별이 성공한 뒤 저장할 수 있습니다. 기존 장비의 재확인이 실패하면 기존 모델은 유지되지만 주기 감시는 강제로 꺼집니다. 주소가 사설 대역인지, ID/PW와 enable 필요 여부를 바로잡은 뒤 다시 확인하세요. MODEL_NOT_DETECTED 또는 MODEL_AMBIGUOUS이면 실제 show version과 지원 범위를 확인하고, MODEL_DETECTION_UNAVAILABLE이면 Agent와 Viewer를 같은 최신 버전으로 맞추세요. 성공해도 조회 명령까지 검증된 것은 아니므로 수집 진단을 이어서 실행합니다.</w:t>
       </w:r>
     </w:p>
     <w:p>
@@ -9233,6 +9233,174 @@
                 <w:rFonts w:ascii="맑은 고딕" w:hAnsi="맑은 고딕" w:eastAsia="맑은 고딕" w:cs="맑은 고딕"/>
                 <w:sz w:val="16"/>
               </w:rPr>
+              <w:t>MODEL_NOT_DETECTED</w:t>
+            </w:r>
+          </w:p>
+        </w:tc>
+        <w:tc>
+          <w:tcPr>
+            <w:tcW w:type="dxa" w:w="5060"/>
+            <w:shd w:fill="FAFBFC"/>
+            <w:tcMar>
+              <w:top w:w="80" w:type="dxa"/>
+              <w:start w:w="120" w:type="dxa"/>
+              <w:bottom w:w="80" w:type="dxa"/>
+              <w:end w:w="120" w:type="dxa"/>
+            </w:tcMar>
+            <w:vAlign w:val="center"/>
+          </w:tcPr>
+          <w:p>
+            <w:pPr>
+              <w:spacing w:before="0" w:after="0" w:line="240" w:lineRule="auto"/>
+              <w:jc w:val="left"/>
+            </w:pPr>
+            <w:r>
+              <w:rPr>
+                <w:rFonts w:ascii="맑은 고딕" w:hAnsi="맑은 고딕" w:eastAsia="맑은 고딕" w:cs="맑은 고딕"/>
+                <w:sz w:val="16"/>
+              </w:rPr>
+              <w:t>show version에서 지원 모델을 찾지 못함. 장비 전면 모델명과 실제 출력·지원 범위 확인</w:t>
+            </w:r>
+          </w:p>
+        </w:tc>
+      </w:tr>
+      <w:tr>
+        <w:trPr>
+          <w:cantSplit w:val="1"/>
+        </w:trPr>
+        <w:tc>
+          <w:tcPr>
+            <w:tcW w:type="dxa" w:w="4300"/>
+            <w:tcMar>
+              <w:top w:w="80" w:type="dxa"/>
+              <w:start w:w="120" w:type="dxa"/>
+              <w:bottom w:w="80" w:type="dxa"/>
+              <w:end w:w="120" w:type="dxa"/>
+            </w:tcMar>
+            <w:vAlign w:val="center"/>
+          </w:tcPr>
+          <w:p>
+            <w:pPr>
+              <w:spacing w:before="0" w:after="0" w:line="240" w:lineRule="auto"/>
+              <w:jc w:val="left"/>
+            </w:pPr>
+            <w:r>
+              <w:rPr>
+                <w:rFonts w:ascii="맑은 고딕" w:hAnsi="맑은 고딕" w:eastAsia="맑은 고딕" w:cs="맑은 고딕"/>
+                <w:sz w:val="16"/>
+              </w:rPr>
+              <w:t>MODEL_AMBIGUOUS</w:t>
+            </w:r>
+          </w:p>
+        </w:tc>
+        <w:tc>
+          <w:tcPr>
+            <w:tcW w:type="dxa" w:w="5060"/>
+            <w:tcMar>
+              <w:top w:w="80" w:type="dxa"/>
+              <w:start w:w="120" w:type="dxa"/>
+              <w:bottom w:w="80" w:type="dxa"/>
+              <w:end w:w="120" w:type="dxa"/>
+            </w:tcMar>
+            <w:vAlign w:val="center"/>
+          </w:tcPr>
+          <w:p>
+            <w:pPr>
+              <w:spacing w:before="0" w:after="0" w:line="240" w:lineRule="auto"/>
+              <w:jc w:val="left"/>
+            </w:pPr>
+            <w:r>
+              <w:rPr>
+                <w:rFonts w:ascii="맑은 고딕" w:hAnsi="맑은 고딕" w:eastAsia="맑은 고딕" w:cs="맑은 고딕"/>
+                <w:sz w:val="16"/>
+              </w:rPr>
+              <w:t>둘 이상의 지원 모델 토큰이 확인됨. 임의 선택 없이 실제 장비와 출력 형식 확인</w:t>
+            </w:r>
+          </w:p>
+        </w:tc>
+      </w:tr>
+      <w:tr>
+        <w:trPr>
+          <w:cantSplit w:val="1"/>
+        </w:trPr>
+        <w:tc>
+          <w:tcPr>
+            <w:tcW w:type="dxa" w:w="4300"/>
+            <w:shd w:fill="FAFBFC"/>
+            <w:tcMar>
+              <w:top w:w="80" w:type="dxa"/>
+              <w:start w:w="120" w:type="dxa"/>
+              <w:bottom w:w="80" w:type="dxa"/>
+              <w:end w:w="120" w:type="dxa"/>
+            </w:tcMar>
+            <w:vAlign w:val="center"/>
+          </w:tcPr>
+          <w:p>
+            <w:pPr>
+              <w:spacing w:before="0" w:after="0" w:line="240" w:lineRule="auto"/>
+              <w:jc w:val="left"/>
+            </w:pPr>
+            <w:r>
+              <w:rPr>
+                <w:rFonts w:ascii="맑은 고딕" w:hAnsi="맑은 고딕" w:eastAsia="맑은 고딕" w:cs="맑은 고딕"/>
+                <w:sz w:val="16"/>
+              </w:rPr>
+              <w:t>MODEL_DETECTION_UNAVAILABLE</w:t>
+            </w:r>
+          </w:p>
+        </w:tc>
+        <w:tc>
+          <w:tcPr>
+            <w:tcW w:type="dxa" w:w="5060"/>
+            <w:shd w:fill="FAFBFC"/>
+            <w:tcMar>
+              <w:top w:w="80" w:type="dxa"/>
+              <w:start w:w="120" w:type="dxa"/>
+              <w:bottom w:w="80" w:type="dxa"/>
+              <w:end w:w="120" w:type="dxa"/>
+            </w:tcMar>
+            <w:vAlign w:val="center"/>
+          </w:tcPr>
+          <w:p>
+            <w:pPr>
+              <w:spacing w:before="0" w:after="0" w:line="240" w:lineRule="auto"/>
+              <w:jc w:val="left"/>
+            </w:pPr>
+            <w:r>
+              <w:rPr>
+                <w:rFonts w:ascii="맑은 고딕" w:hAnsi="맑은 고딕" w:eastAsia="맑은 고딕" w:cs="맑은 고딕"/>
+                <w:sz w:val="16"/>
+              </w:rPr>
+              <w:t>구형 Agent 응답에 자동 판별값이 없음. Agent와 Viewer를 같은 최신 Release로 업데이트</w:t>
+            </w:r>
+          </w:p>
+        </w:tc>
+      </w:tr>
+      <w:tr>
+        <w:trPr>
+          <w:cantSplit w:val="1"/>
+        </w:trPr>
+        <w:tc>
+          <w:tcPr>
+            <w:tcW w:type="dxa" w:w="4300"/>
+            <w:tcMar>
+              <w:top w:w="80" w:type="dxa"/>
+              <w:start w:w="120" w:type="dxa"/>
+              <w:bottom w:w="80" w:type="dxa"/>
+              <w:end w:w="120" w:type="dxa"/>
+            </w:tcMar>
+            <w:vAlign w:val="center"/>
+          </w:tcPr>
+          <w:p>
+            <w:pPr>
+              <w:spacing w:before="0" w:after="0" w:line="240" w:lineRule="auto"/>
+              <w:jc w:val="left"/>
+            </w:pPr>
+            <w:r>
+              <w:rPr>
+                <w:rFonts w:ascii="맑은 고딕" w:hAnsi="맑은 고딕" w:eastAsia="맑은 고딕" w:cs="맑은 고딕"/>
+                <w:sz w:val="16"/>
+              </w:rPr>
               <w:t>QUERY_COMMAND_BLOCKED</w:t>
             </w:r>
           </w:p>
@@ -9240,7 +9408,6 @@
         <w:tc>
           <w:tcPr>
             <w:tcW w:type="dxa" w:w="5060"/>
-            <w:shd w:fill="FAFBFC"/>
             <w:tcMar>
               <w:top w:w="80" w:type="dxa"/>
               <w:start w:w="120" w:type="dxa"/>
@@ -9271,6 +9438,7 @@
         <w:tc>
           <w:tcPr>
             <w:tcW w:type="dxa" w:w="4300"/>
+            <w:shd w:fill="FAFBFC"/>
             <w:tcMar>
               <w:top w:w="80" w:type="dxa"/>
               <w:start w:w="120" w:type="dxa"/>
@@ -9296,6 +9464,7 @@
         <w:tc>
           <w:tcPr>
             <w:tcW w:type="dxa" w:w="5060"/>
+            <w:shd w:fill="FAFBFC"/>
             <w:tcMar>
               <w:top w:w="80" w:type="dxa"/>
               <w:start w:w="120" w:type="dxa"/>
@@ -9326,7 +9495,6 @@
         <w:tc>
           <w:tcPr>
             <w:tcW w:type="dxa" w:w="4300"/>
-            <w:shd w:fill="FAFBFC"/>
             <w:tcMar>
               <w:top w:w="80" w:type="dxa"/>
               <w:start w:w="120" w:type="dxa"/>
@@ -9352,7 +9520,6 @@
         <w:tc>
           <w:tcPr>
             <w:tcW w:type="dxa" w:w="5060"/>
-            <w:shd w:fill="FAFBFC"/>
             <w:tcMar>
               <w:top w:w="80" w:type="dxa"/>
               <w:start w:w="120" w:type="dxa"/>
@@ -9383,6 +9550,7 @@
         <w:tc>
           <w:tcPr>
             <w:tcW w:type="dxa" w:w="4300"/>
+            <w:shd w:fill="FAFBFC"/>
             <w:tcMar>
               <w:top w:w="80" w:type="dxa"/>
               <w:start w:w="120" w:type="dxa"/>
@@ -9408,6 +9576,7 @@
         <w:tc>
           <w:tcPr>
             <w:tcW w:type="dxa" w:w="5060"/>
+            <w:shd w:fill="FAFBFC"/>
             <w:tcMar>
               <w:top w:w="80" w:type="dxa"/>
               <w:start w:w="120" w:type="dxa"/>
@@ -9438,7 +9607,6 @@
         <w:tc>
           <w:tcPr>
             <w:tcW w:type="dxa" w:w="4300"/>
-            <w:shd w:fill="FAFBFC"/>
             <w:tcMar>
               <w:top w:w="80" w:type="dxa"/>
               <w:start w:w="120" w:type="dxa"/>
@@ -9464,7 +9632,6 @@
         <w:tc>
           <w:tcPr>
             <w:tcW w:type="dxa" w:w="5060"/>
-            <w:shd w:fill="FAFBFC"/>
             <w:tcMar>
               <w:top w:w="80" w:type="dxa"/>
               <w:start w:w="120" w:type="dxa"/>
@@ -9495,6 +9662,7 @@
         <w:tc>
           <w:tcPr>
             <w:tcW w:type="dxa" w:w="4300"/>
+            <w:shd w:fill="FAFBFC"/>
             <w:tcMar>
               <w:top w:w="80" w:type="dxa"/>
               <w:start w:w="120" w:type="dxa"/>
@@ -9520,6 +9688,7 @@
         <w:tc>
           <w:tcPr>
             <w:tcW w:type="dxa" w:w="5060"/>
+            <w:shd w:fill="FAFBFC"/>
             <w:tcMar>
               <w:top w:w="80" w:type="dxa"/>
               <w:start w:w="120" w:type="dxa"/>
@@ -9550,7 +9719,6 @@
         <w:tc>
           <w:tcPr>
             <w:tcW w:type="dxa" w:w="4300"/>
-            <w:shd w:fill="FAFBFC"/>
             <w:tcMar>
               <w:top w:w="80" w:type="dxa"/>
               <w:start w:w="120" w:type="dxa"/>
@@ -9576,7 +9744,6 @@
         <w:tc>
           <w:tcPr>
             <w:tcW w:type="dxa" w:w="5060"/>
-            <w:shd w:fill="FAFBFC"/>
             <w:tcMar>
               <w:top w:w="80" w:type="dxa"/>
               <w:start w:w="120" w:type="dxa"/>
@@ -9607,6 +9774,7 @@
         <w:tc>
           <w:tcPr>
             <w:tcW w:type="dxa" w:w="4300"/>
+            <w:shd w:fill="FAFBFC"/>
             <w:tcMar>
               <w:top w:w="80" w:type="dxa"/>
               <w:start w:w="120" w:type="dxa"/>
@@ -9632,6 +9800,7 @@
         <w:tc>
           <w:tcPr>
             <w:tcW w:type="dxa" w:w="5060"/>
+            <w:shd w:fill="FAFBFC"/>
             <w:tcMar>
               <w:top w:w="80" w:type="dxa"/>
               <w:start w:w="120" w:type="dxa"/>
@@ -9662,7 +9831,6 @@
         <w:tc>
           <w:tcPr>
             <w:tcW w:type="dxa" w:w="4300"/>
-            <w:shd w:fill="FAFBFC"/>
             <w:tcMar>
               <w:top w:w="80" w:type="dxa"/>
               <w:start w:w="120" w:type="dxa"/>
@@ -9688,7 +9856,6 @@
         <w:tc>
           <w:tcPr>
             <w:tcW w:type="dxa" w:w="5060"/>
-            <w:shd w:fill="FAFBFC"/>
             <w:tcMar>
               <w:top w:w="80" w:type="dxa"/>
               <w:start w:w="120" w:type="dxa"/>
@@ -9719,6 +9886,7 @@
         <w:tc>
           <w:tcPr>
             <w:tcW w:type="dxa" w:w="4300"/>
+            <w:shd w:fill="FAFBFC"/>
             <w:tcMar>
               <w:top w:w="80" w:type="dxa"/>
               <w:start w:w="120" w:type="dxa"/>
@@ -9744,6 +9912,7 @@
         <w:tc>
           <w:tcPr>
             <w:tcW w:type="dxa" w:w="5060"/>
+            <w:shd w:fill="FAFBFC"/>
             <w:tcMar>
               <w:top w:w="80" w:type="dxa"/>
               <w:start w:w="120" w:type="dxa"/>
@@ -10916,7 +11085,7 @@
         <w:color w:val="64748B"/>
         <w:sz w:val="17"/>
       </w:rPr>
-      <w:t xml:space="preserve">v0.11.8-poc  |  </w:t>
+      <w:t xml:space="preserve">v0.11.9-poc  |  </w:t>
     </w:r>
     <w:r>
       <w:rPr>
@@ -10947,7 +11116,7 @@
         <w:color w:val="64748B"/>
         <w:sz w:val="17"/>
       </w:rPr>
-      <w:t>v0.11.8-poc  |  2026-08-12</w:t>
+      <w:t>v0.11.9-poc  |  2026-08-12</w:t>
     </w:r>
   </w:p>
 </w:ftr>

</xml_diff>

<commit_message>
feat: detect Samsung switch models automatically (#62)
</commit_message>
<xml_diff>
--- a/docs/SamsungSwitchWatch_User_Manual_KO.docx
+++ b/docs/SamsungSwitchWatch_User_Manual_KO.docx
@@ -1159,7 +1159,7 @@
           <w:color w:val="16324F"/>
           <w:sz w:val="21"/>
         </w:rPr>
-        <w:t>0.11.8-poc는 코드 서명되지 않은 시험판입니다. 압축을 풀기 전에 Agent와 Viewer ZIP의 SHA-256을 해당 GitHub Release 본문에 표시된 값과 비교하고 사내 보안 반입 절차를 완료하세요. SmartScreen 또는 EDR 경고를 우회하지 않습니다.</w:t>
+        <w:t>0.11.9-poc는 코드 서명되지 않은 시험판입니다. 압축을 풀기 전에 Agent와 Viewer ZIP의 SHA-256을 해당 GitHub Release 본문에 표시된 값과 비교하고 사내 보안 반입 절차를 완료하세요. SmartScreen 또는 EDR 경고를 우회하지 않습니다.</w:t>
       </w:r>
     </w:p>
     <w:p>
@@ -2381,7 +2381,7 @@
           <w:color w:val="16324F"/>
           <w:sz w:val="21"/>
         </w:rPr>
-        <w:t>Agent Setup에 AGENT_LOCAL_CONNECTION_UNCONFIRMED 또는 FIREWALL_REMOTE_ACCESS_UNCONFIRMED가 표시되면 Agent 서비스와 프로그램은 설치됐지만 연결 준비를 확인하지 못했다는 뜻입니다. Viewer에서 연결 테스트를 실행하고, TCP/18443이 실패할 때 Windows 관리자에게 확인하세요. 규칙을 AGENT_CONNECTION_REFUSED가 보이면 Viewer에 스위치 IP나 localhost가 아니라 Agent를 설치한 PC의 실제 주소를 입력했는지 먼저 확인하세요. 같은 PC 시험에서는 해당 PC의 사설 IPv4 또는 localhost를 사용할 수 있습니다. 그 다음 Windows 서비스에서 SamsungSwitchWatchAgent가 Running인지 확인하고 TCP/18443을 점검합니다. TCP 단계는 성공하고 HTTPS 단계가 실패하면 방화벽이 아니라 Agent PC의 로컬 HTTPS/TLS 준비 상태를 확인합니다. AGENT_CLIENT_NOT_ALLOWED이면 Viewer 주소가 RFC1918 사설 범위인지 확인합니다. 서비스를 수동 등록하지 말고 0.11.8-poc Agent Setup을 사용하세요.</w:t>
+        <w:t>Agent Setup에 AGENT_LOCAL_CONNECTION_UNCONFIRMED 또는 FIREWALL_REMOTE_ACCESS_UNCONFIRMED가 표시되면 Agent 서비스와 프로그램은 설치됐지만 연결 준비를 확인하지 못했다는 뜻입니다. Viewer에서 연결 테스트를 실행하고, TCP/18443이 실패할 때 Windows 관리자에게 확인하세요. 규칙을 AGENT_CONNECTION_REFUSED가 보이면 Viewer에 스위치 IP나 localhost가 아니라 Agent를 설치한 PC의 실제 주소를 입력했는지 먼저 확인하세요. 같은 PC 시험에서는 해당 PC의 사설 IPv4 또는 localhost를 사용할 수 있습니다. 그 다음 Windows 서비스에서 SamsungSwitchWatchAgent가 Running인지 확인하고 TCP/18443을 점검합니다. TCP 단계는 성공하고 HTTPS 단계가 실패하면 방화벽이 아니라 Agent PC의 로컬 HTTPS/TLS 준비 상태를 확인합니다. AGENT_CLIENT_NOT_ALLOWED이면 Viewer 주소가 RFC1918 사설 범위인지 확인합니다. 서비스를 수동 등록하지 말고 0.11.9-poc Agent Setup을 사용하세요.</w:t>
       </w:r>
     </w:p>
     <w:p>
@@ -2543,7 +2543,7 @@
           <w:color w:val="16324F"/>
           <w:sz w:val="21"/>
         </w:rPr>
-        <w:t>0.11.8-poc는 코드 서명되지 않아 SmartScreen이나 사내 EDR이 차단할 수 있습니다. ZIP을 완전히 압축 해제하고 Setup, Viewer EXE와 제공된 DLL이 같은 폴더에 있는지 확인하세요. EDR·AppLocker·WDAC가 차단하면 우회하지 말고 공식 ZIP의 버전·해시와 차단 기록을 보안 담당자에게 전달하세요.</w:t>
+        <w:t>0.11.9-poc는 코드 서명되지 않아 SmartScreen이나 사내 EDR이 차단할 수 있습니다. ZIP을 완전히 압축 해제하고 Setup, Viewer EXE와 제공된 DLL이 같은 폴더에 있는지 확인하세요. EDR·AppLocker·WDAC가 차단하면 우회하지 말고 공식 ZIP의 버전·해시와 차단 기록을 보안 담당자에게 전달하세요.</w:t>
       </w:r>
     </w:p>
     <w:p>
@@ -2964,7 +2964,7 @@
         <w:drawing>
           <wp:inline xmlns:a="http://schemas.openxmlformats.org/drawingml/2006/main" xmlns:pic="http://schemas.openxmlformats.org/drawingml/2006/picture">
             <wp:extent cx="5029200" cy="3540967"/>
-            <wp:docPr id="6" name="Picture 6" title="장비 관리 창" descr="장비명, 모델, IPv4, 계정 ID, 로그인 비밀번호, enable 비밀번호와 감시 설정을 입력하는 창"/>
+            <wp:docPr id="6" name="Picture 6" title="장비 관리 창" descr="장비명, IPv4, 계정 ID와 비밀번호를 입력하고 자동 판별된 모델과 감시 설정을 확인하는 창"/>
             <wp:cNvGraphicFramePr>
               <a:graphicFrameLocks noChangeAspect="1"/>
             </wp:cNvGraphicFramePr>
@@ -3266,7 +3266,7 @@
                 <w:rFonts w:ascii="맑은 고딕" w:hAnsi="맑은 고딕" w:eastAsia="맑은 고딕" w:cs="맑은 고딕"/>
                 <w:sz w:val="18"/>
               </w:rPr>
-              <w:t>모델</w:t>
+              <w:t>모델 (자동)</w:t>
             </w:r>
           </w:p>
         </w:tc>
@@ -3292,7 +3292,7 @@
                 <w:rFonts w:ascii="맑은 고딕" w:hAnsi="맑은 고딕" w:eastAsia="맑은 고딕" w:cs="맑은 고딕"/>
                 <w:sz w:val="18"/>
               </w:rPr>
-              <w:t>예</w:t>
+              <w:t>자동</w:t>
             </w:r>
           </w:p>
         </w:tc>
@@ -3318,7 +3318,7 @@
                 <w:rFonts w:ascii="맑은 고딕" w:hAnsi="맑은 고딕" w:eastAsia="맑은 고딕" w:cs="맑은 고딕"/>
                 <w:sz w:val="18"/>
               </w:rPr>
-              <w:t>IES4224GP, IES4028XP, IES4226XP</w:t>
+              <w:t>로그인 확인에서 IES4224GP, IES4028XP, IES4226XP 중 판별</w:t>
             </w:r>
           </w:p>
         </w:tc>
@@ -3761,7 +3761,7 @@
           <w:color w:val="16324F"/>
           <w:sz w:val="21"/>
         </w:rPr>
-        <w:t>실패한 장비도 저장할 수 있지만 '로그인 미확인'으로 표시되고 주기 감시는 강제로 꺼집니다. 주소가 사설 대역인지, ID/PW와 enable 필요 여부를 바로잡은 뒤 다시 확인하세요. 성공해도 조회 명령까지 검증된 것은 아니므로 수집 진단을 이어서 실행합니다.</w:t>
+        <w:t>새 장비는 로그인과 모델 자동 판별이 성공한 뒤 저장할 수 있습니다. 기존 장비의 재확인이 실패하면 기존 모델은 유지되지만 주기 감시는 강제로 꺼집니다. 주소가 사설 대역인지, ID/PW와 enable 필요 여부를 바로잡은 뒤 다시 확인하세요. MODEL_NOT_DETECTED 또는 MODEL_AMBIGUOUS이면 실제 show version과 지원 범위를 확인하고, MODEL_DETECTION_UNAVAILABLE이면 Agent와 Viewer를 같은 최신 버전으로 맞추세요. 성공해도 조회 명령까지 검증된 것은 아니므로 수집 진단을 이어서 실행합니다.</w:t>
       </w:r>
     </w:p>
     <w:p>
@@ -9233,6 +9233,174 @@
                 <w:rFonts w:ascii="맑은 고딕" w:hAnsi="맑은 고딕" w:eastAsia="맑은 고딕" w:cs="맑은 고딕"/>
                 <w:sz w:val="16"/>
               </w:rPr>
+              <w:t>MODEL_NOT_DETECTED</w:t>
+            </w:r>
+          </w:p>
+        </w:tc>
+        <w:tc>
+          <w:tcPr>
+            <w:tcW w:type="dxa" w:w="5060"/>
+            <w:shd w:fill="FAFBFC"/>
+            <w:tcMar>
+              <w:top w:w="80" w:type="dxa"/>
+              <w:start w:w="120" w:type="dxa"/>
+              <w:bottom w:w="80" w:type="dxa"/>
+              <w:end w:w="120" w:type="dxa"/>
+            </w:tcMar>
+            <w:vAlign w:val="center"/>
+          </w:tcPr>
+          <w:p>
+            <w:pPr>
+              <w:spacing w:before="0" w:after="0" w:line="240" w:lineRule="auto"/>
+              <w:jc w:val="left"/>
+            </w:pPr>
+            <w:r>
+              <w:rPr>
+                <w:rFonts w:ascii="맑은 고딕" w:hAnsi="맑은 고딕" w:eastAsia="맑은 고딕" w:cs="맑은 고딕"/>
+                <w:sz w:val="16"/>
+              </w:rPr>
+              <w:t>show version에서 지원 모델을 찾지 못함. 장비 전면 모델명과 실제 출력·지원 범위 확인</w:t>
+            </w:r>
+          </w:p>
+        </w:tc>
+      </w:tr>
+      <w:tr>
+        <w:trPr>
+          <w:cantSplit w:val="1"/>
+        </w:trPr>
+        <w:tc>
+          <w:tcPr>
+            <w:tcW w:type="dxa" w:w="4300"/>
+            <w:tcMar>
+              <w:top w:w="80" w:type="dxa"/>
+              <w:start w:w="120" w:type="dxa"/>
+              <w:bottom w:w="80" w:type="dxa"/>
+              <w:end w:w="120" w:type="dxa"/>
+            </w:tcMar>
+            <w:vAlign w:val="center"/>
+          </w:tcPr>
+          <w:p>
+            <w:pPr>
+              <w:spacing w:before="0" w:after="0" w:line="240" w:lineRule="auto"/>
+              <w:jc w:val="left"/>
+            </w:pPr>
+            <w:r>
+              <w:rPr>
+                <w:rFonts w:ascii="맑은 고딕" w:hAnsi="맑은 고딕" w:eastAsia="맑은 고딕" w:cs="맑은 고딕"/>
+                <w:sz w:val="16"/>
+              </w:rPr>
+              <w:t>MODEL_AMBIGUOUS</w:t>
+            </w:r>
+          </w:p>
+        </w:tc>
+        <w:tc>
+          <w:tcPr>
+            <w:tcW w:type="dxa" w:w="5060"/>
+            <w:tcMar>
+              <w:top w:w="80" w:type="dxa"/>
+              <w:start w:w="120" w:type="dxa"/>
+              <w:bottom w:w="80" w:type="dxa"/>
+              <w:end w:w="120" w:type="dxa"/>
+            </w:tcMar>
+            <w:vAlign w:val="center"/>
+          </w:tcPr>
+          <w:p>
+            <w:pPr>
+              <w:spacing w:before="0" w:after="0" w:line="240" w:lineRule="auto"/>
+              <w:jc w:val="left"/>
+            </w:pPr>
+            <w:r>
+              <w:rPr>
+                <w:rFonts w:ascii="맑은 고딕" w:hAnsi="맑은 고딕" w:eastAsia="맑은 고딕" w:cs="맑은 고딕"/>
+                <w:sz w:val="16"/>
+              </w:rPr>
+              <w:t>둘 이상의 지원 모델 토큰이 확인됨. 임의 선택 없이 실제 장비와 출력 형식 확인</w:t>
+            </w:r>
+          </w:p>
+        </w:tc>
+      </w:tr>
+      <w:tr>
+        <w:trPr>
+          <w:cantSplit w:val="1"/>
+        </w:trPr>
+        <w:tc>
+          <w:tcPr>
+            <w:tcW w:type="dxa" w:w="4300"/>
+            <w:shd w:fill="FAFBFC"/>
+            <w:tcMar>
+              <w:top w:w="80" w:type="dxa"/>
+              <w:start w:w="120" w:type="dxa"/>
+              <w:bottom w:w="80" w:type="dxa"/>
+              <w:end w:w="120" w:type="dxa"/>
+            </w:tcMar>
+            <w:vAlign w:val="center"/>
+          </w:tcPr>
+          <w:p>
+            <w:pPr>
+              <w:spacing w:before="0" w:after="0" w:line="240" w:lineRule="auto"/>
+              <w:jc w:val="left"/>
+            </w:pPr>
+            <w:r>
+              <w:rPr>
+                <w:rFonts w:ascii="맑은 고딕" w:hAnsi="맑은 고딕" w:eastAsia="맑은 고딕" w:cs="맑은 고딕"/>
+                <w:sz w:val="16"/>
+              </w:rPr>
+              <w:t>MODEL_DETECTION_UNAVAILABLE</w:t>
+            </w:r>
+          </w:p>
+        </w:tc>
+        <w:tc>
+          <w:tcPr>
+            <w:tcW w:type="dxa" w:w="5060"/>
+            <w:shd w:fill="FAFBFC"/>
+            <w:tcMar>
+              <w:top w:w="80" w:type="dxa"/>
+              <w:start w:w="120" w:type="dxa"/>
+              <w:bottom w:w="80" w:type="dxa"/>
+              <w:end w:w="120" w:type="dxa"/>
+            </w:tcMar>
+            <w:vAlign w:val="center"/>
+          </w:tcPr>
+          <w:p>
+            <w:pPr>
+              <w:spacing w:before="0" w:after="0" w:line="240" w:lineRule="auto"/>
+              <w:jc w:val="left"/>
+            </w:pPr>
+            <w:r>
+              <w:rPr>
+                <w:rFonts w:ascii="맑은 고딕" w:hAnsi="맑은 고딕" w:eastAsia="맑은 고딕" w:cs="맑은 고딕"/>
+                <w:sz w:val="16"/>
+              </w:rPr>
+              <w:t>구형 Agent 응답에 자동 판별값이 없음. Agent와 Viewer를 같은 최신 Release로 업데이트</w:t>
+            </w:r>
+          </w:p>
+        </w:tc>
+      </w:tr>
+      <w:tr>
+        <w:trPr>
+          <w:cantSplit w:val="1"/>
+        </w:trPr>
+        <w:tc>
+          <w:tcPr>
+            <w:tcW w:type="dxa" w:w="4300"/>
+            <w:tcMar>
+              <w:top w:w="80" w:type="dxa"/>
+              <w:start w:w="120" w:type="dxa"/>
+              <w:bottom w:w="80" w:type="dxa"/>
+              <w:end w:w="120" w:type="dxa"/>
+            </w:tcMar>
+            <w:vAlign w:val="center"/>
+          </w:tcPr>
+          <w:p>
+            <w:pPr>
+              <w:spacing w:before="0" w:after="0" w:line="240" w:lineRule="auto"/>
+              <w:jc w:val="left"/>
+            </w:pPr>
+            <w:r>
+              <w:rPr>
+                <w:rFonts w:ascii="맑은 고딕" w:hAnsi="맑은 고딕" w:eastAsia="맑은 고딕" w:cs="맑은 고딕"/>
+                <w:sz w:val="16"/>
+              </w:rPr>
               <w:t>QUERY_COMMAND_BLOCKED</w:t>
             </w:r>
           </w:p>
@@ -9240,7 +9408,6 @@
         <w:tc>
           <w:tcPr>
             <w:tcW w:type="dxa" w:w="5060"/>
-            <w:shd w:fill="FAFBFC"/>
             <w:tcMar>
               <w:top w:w="80" w:type="dxa"/>
               <w:start w:w="120" w:type="dxa"/>
@@ -9271,6 +9438,7 @@
         <w:tc>
           <w:tcPr>
             <w:tcW w:type="dxa" w:w="4300"/>
+            <w:shd w:fill="FAFBFC"/>
             <w:tcMar>
               <w:top w:w="80" w:type="dxa"/>
               <w:start w:w="120" w:type="dxa"/>
@@ -9296,6 +9464,7 @@
         <w:tc>
           <w:tcPr>
             <w:tcW w:type="dxa" w:w="5060"/>
+            <w:shd w:fill="FAFBFC"/>
             <w:tcMar>
               <w:top w:w="80" w:type="dxa"/>
               <w:start w:w="120" w:type="dxa"/>
@@ -9326,7 +9495,6 @@
         <w:tc>
           <w:tcPr>
             <w:tcW w:type="dxa" w:w="4300"/>
-            <w:shd w:fill="FAFBFC"/>
             <w:tcMar>
               <w:top w:w="80" w:type="dxa"/>
               <w:start w:w="120" w:type="dxa"/>
@@ -9352,7 +9520,6 @@
         <w:tc>
           <w:tcPr>
             <w:tcW w:type="dxa" w:w="5060"/>
-            <w:shd w:fill="FAFBFC"/>
             <w:tcMar>
               <w:top w:w="80" w:type="dxa"/>
               <w:start w:w="120" w:type="dxa"/>
@@ -9383,6 +9550,7 @@
         <w:tc>
           <w:tcPr>
             <w:tcW w:type="dxa" w:w="4300"/>
+            <w:shd w:fill="FAFBFC"/>
             <w:tcMar>
               <w:top w:w="80" w:type="dxa"/>
               <w:start w:w="120" w:type="dxa"/>
@@ -9408,6 +9576,7 @@
         <w:tc>
           <w:tcPr>
             <w:tcW w:type="dxa" w:w="5060"/>
+            <w:shd w:fill="FAFBFC"/>
             <w:tcMar>
               <w:top w:w="80" w:type="dxa"/>
               <w:start w:w="120" w:type="dxa"/>
@@ -9438,7 +9607,6 @@
         <w:tc>
           <w:tcPr>
             <w:tcW w:type="dxa" w:w="4300"/>
-            <w:shd w:fill="FAFBFC"/>
             <w:tcMar>
               <w:top w:w="80" w:type="dxa"/>
               <w:start w:w="120" w:type="dxa"/>
@@ -9464,7 +9632,6 @@
         <w:tc>
           <w:tcPr>
             <w:tcW w:type="dxa" w:w="5060"/>
-            <w:shd w:fill="FAFBFC"/>
             <w:tcMar>
               <w:top w:w="80" w:type="dxa"/>
               <w:start w:w="120" w:type="dxa"/>
@@ -9495,6 +9662,7 @@
         <w:tc>
           <w:tcPr>
             <w:tcW w:type="dxa" w:w="4300"/>
+            <w:shd w:fill="FAFBFC"/>
             <w:tcMar>
               <w:top w:w="80" w:type="dxa"/>
               <w:start w:w="120" w:type="dxa"/>
@@ -9520,6 +9688,7 @@
         <w:tc>
           <w:tcPr>
             <w:tcW w:type="dxa" w:w="5060"/>
+            <w:shd w:fill="FAFBFC"/>
             <w:tcMar>
               <w:top w:w="80" w:type="dxa"/>
               <w:start w:w="120" w:type="dxa"/>
@@ -9550,7 +9719,6 @@
         <w:tc>
           <w:tcPr>
             <w:tcW w:type="dxa" w:w="4300"/>
-            <w:shd w:fill="FAFBFC"/>
             <w:tcMar>
               <w:top w:w="80" w:type="dxa"/>
               <w:start w:w="120" w:type="dxa"/>
@@ -9576,7 +9744,6 @@
         <w:tc>
           <w:tcPr>
             <w:tcW w:type="dxa" w:w="5060"/>
-            <w:shd w:fill="FAFBFC"/>
             <w:tcMar>
               <w:top w:w="80" w:type="dxa"/>
               <w:start w:w="120" w:type="dxa"/>
@@ -9607,6 +9774,7 @@
         <w:tc>
           <w:tcPr>
             <w:tcW w:type="dxa" w:w="4300"/>
+            <w:shd w:fill="FAFBFC"/>
             <w:tcMar>
               <w:top w:w="80" w:type="dxa"/>
               <w:start w:w="120" w:type="dxa"/>
@@ -9632,6 +9800,7 @@
         <w:tc>
           <w:tcPr>
             <w:tcW w:type="dxa" w:w="5060"/>
+            <w:shd w:fill="FAFBFC"/>
             <w:tcMar>
               <w:top w:w="80" w:type="dxa"/>
               <w:start w:w="120" w:type="dxa"/>
@@ -9662,7 +9831,6 @@
         <w:tc>
           <w:tcPr>
             <w:tcW w:type="dxa" w:w="4300"/>
-            <w:shd w:fill="FAFBFC"/>
             <w:tcMar>
               <w:top w:w="80" w:type="dxa"/>
               <w:start w:w="120" w:type="dxa"/>
@@ -9688,7 +9856,6 @@
         <w:tc>
           <w:tcPr>
             <w:tcW w:type="dxa" w:w="5060"/>
-            <w:shd w:fill="FAFBFC"/>
             <w:tcMar>
               <w:top w:w="80" w:type="dxa"/>
               <w:start w:w="120" w:type="dxa"/>
@@ -9719,6 +9886,7 @@
         <w:tc>
           <w:tcPr>
             <w:tcW w:type="dxa" w:w="4300"/>
+            <w:shd w:fill="FAFBFC"/>
             <w:tcMar>
               <w:top w:w="80" w:type="dxa"/>
               <w:start w:w="120" w:type="dxa"/>
@@ -9744,6 +9912,7 @@
         <w:tc>
           <w:tcPr>
             <w:tcW w:type="dxa" w:w="5060"/>
+            <w:shd w:fill="FAFBFC"/>
             <w:tcMar>
               <w:top w:w="80" w:type="dxa"/>
               <w:start w:w="120" w:type="dxa"/>
@@ -10916,7 +11085,7 @@
         <w:color w:val="64748B"/>
         <w:sz w:val="17"/>
       </w:rPr>
-      <w:t xml:space="preserve">v0.11.8-poc  |  </w:t>
+      <w:t xml:space="preserve">v0.11.9-poc  |  </w:t>
     </w:r>
     <w:r>
       <w:rPr>
@@ -10947,7 +11116,7 @@
         <w:color w:val="64748B"/>
         <w:sz w:val="17"/>
       </w:rPr>
-      <w:t>v0.11.8-poc  |  2026-08-12</w:t>
+      <w:t>v0.11.9-poc  |  2026-08-12</w:t>
     </w:r>
   </w:p>
 </w:ftr>

</xml_diff>

<commit_message>
Stabilize offline monitoring and recovery for v0.11.10
</commit_message>
<xml_diff>
--- a/docs/SamsungSwitchWatch_User_Manual_KO.docx
+++ b/docs/SamsungSwitchWatch_User_Manual_KO.docx
@@ -677,7 +677,7 @@
           <w:color w:val="16324F"/>
           <w:sz w:val="21"/>
         </w:rPr>
-        <w:t>포트 상태와 시스템 로그는 순차적인 개별 세션으로 수집합니다. 명령 시간 초과·출력 한도는 실패한 항목만 확인 불가로 표시하고 다른 항목을 계속 확인합니다. 명령은 30초 동안 새 응답이 없으면 중단하고, 출력이 계속되어도 전체 90초를 넘기지 않습니다. 같은 실패 명령은 현재 주기에서 즉시 재시도하지 않습니다. COMMAND_TIMEOUT 또는 QUERY_TIMEOUT이면 다음 점검 주기에 다음 읽기 전용 후보를 한 번 시도합니다. 인증·enable·TCP·세션 종료는 반복 로그인을 막기 위해 해당 장비 주기를 중단합니다. 이번 POC의 자동 감시 검증·지원 범위는 등록 장비 10대 이하입니다.</w:t>
+        <w:t>포트 상태와 시스템 로그는 순차적인 개별 세션으로 수집합니다. 명령 시간 초과·출력 한도는 실패한 항목만 확인 불가로 표시하고 다른 항목을 계속 확인합니다. 명령은 30초 동안 새 응답이 없으면 중단하고, 출력이 계속되어도 전체 90초를 넘기지 않습니다. 같은 실패 명령은 현재 주기에서 즉시 재시도하지 않습니다. COMMAND_TIMEOUT 또는 QUERY_TIMEOUT이면 다음 점검 주기에 다음 읽기 전용 후보를 한 번 시도합니다. 인증·enable·TCP·세션 종료는 반복 로그인을 막기 위해 해당 장비 주기를 중단합니다. 로그인과 enable도 각각 별도의 제한된 시간·바이트 예산을 사용합니다. Samsung 장비의 Latin-1 문자와 Telnet IAC 협상 바이트를 처리하되 끝없는 응답은 상한에서 중단합니다. 이번 POC의 자동 감시 검증·지원 범위는 등록 장비 10대 이하입니다.</w:t>
       </w:r>
     </w:p>
     <w:p>
@@ -1098,7 +1098,7 @@
     <w:p>
       <w:pPr>
         <w:pStyle w:val="Heading1"/>
-        <w:pageBreakBefore/>
+        <w:pageBreakBefore w:val="0"/>
         <w:numPr>
           <w:ilvl w:val="0"/>
           <w:numId w:val="11"/>
@@ -1159,7 +1159,7 @@
           <w:color w:val="16324F"/>
           <w:sz w:val="21"/>
         </w:rPr>
-        <w:t>0.11.9-poc는 코드 서명되지 않은 시험판입니다. 압축을 풀기 전에 Agent와 Viewer ZIP의 SHA-256을 해당 GitHub Release 본문에 표시된 값과 비교하고 사내 보안 반입 절차를 완료하세요. SmartScreen 또는 EDR 경고를 우회하지 않습니다.</w:t>
+        <w:t>0.11.10-poc는 코드 서명되지 않은 시험판입니다. 압축을 풀기 전에 Agent와 Viewer ZIP의 SHA-256을 해당 GitHub Release 본문에 표시된 값과 비교하고 사내 보안 반입 절차를 완료하세요. SmartScreen 또는 EDR 경고를 우회하지 않습니다.</w:t>
       </w:r>
     </w:p>
     <w:p>
@@ -1647,7 +1647,7 @@
           <w:color w:val="16324F"/>
           <w:sz w:val="21"/>
         </w:rPr>
-        <w:t>Setup은 BUILD-MANIFEST.json과 Agent 실행 파일 SHA-256을 확인하고, Program Files의 임시 staging에 복사한 파일을 다시 검사한 뒤 교체합니다. 패키지·파일·서비스 변경 자체가 실패한 경우에만 설치 전 상태로 되돌리기를 시도합니다. 서비스가 설치·시작된 뒤 로컬 HTTPS/API/버전 또는 방화벽 준비 상태를 확인하지 못한 경우에는 설치를 되돌리지 않고 AGENT_LOCAL_CONNECTION_UNCONFIRMED 경고로 남깁니다. 다음 실행에서 완료되지 않은 journal이 남아 있으면 자동 복구하지 않고 별도의 '이전 상태 복구' 작업을 요구합니다. 검사 중에는 현재 서비스 PID와 TCP/18443 소유를 매번 다시 확인합니다. rollback 전에는 관찰한 서비스 프로세스 종료를 확인하고 프로그램 폴더의 일시적 잠금만 최대 5회 제한적으로 재시도합니다. staging·backup·failed·journal 정리가 잠시 실패하면 정확히 검증된 대상만 최대 3회 시도하고 실패한 시도 사이 250ms 대기한 뒤 삭제 결과를 확인합니다. journal은 원자적으로 교체하며 교체가 완료된 뒤 임시 파일 정리만 실패해도 저장 완료를 실패로 되돌리지 않습니다. 새 ProgramData 제품 루트는 원자적 생성에 성공한 경우에만 ACL과 파일을 쓰므로 검사 직후 다른 프로세스가 만든 폴더는 수정하지 않습니다. 변경 자체의 복구까지 실패하면 최초 설치 실패 코드를 별도로 유지하고 SETUP_ROLLBACK_FAILED와 실패한 ROLLBACK_* 단계를 함께 표시합니다.</w:t>
+        <w:t>Setup은 BUILD-MANIFEST.json과 Agent 실행 파일 SHA-256을 확인하고, Program Files의 임시 staging에 복사한 파일을 다시 검사한 뒤 교체합니다. 패키지·파일·서비스 변경 자체가 실패한 경우에만 설치 전 상태로 되돌리기를 시도합니다. 서비스가 설치·시작된 뒤 로컬 HTTPS/API/버전 또는 방화벽 준비 상태를 확인하지 못한 경우에는 설치를 되돌리지 않고 AGENT_LOCAL_CONNECTION_UNCONFIRMED 경고로 남깁니다. 다음 실행에서 완료되지 않은 journal이 남아 있으면 자동 복구하지 않고 별도의 '이전 상태 복구' 작업을 요구합니다. 검사 중에는 현재 서비스 PID와 TCP/18443 소유를 매번 다시 확인합니다. rollback 전에는 관찰한 서비스 프로세스 종료를 확인하고 프로그램 폴더의 일시적 잠금만 최대 5회 제한적으로 재시도합니다. staging·backup·failed·journal 정리가 잠시 실패하면 정확히 검증된 대상만 최대 3회 시도하고 실패한 시도 사이 250ms 대기한 뒤 삭제 결과를 확인합니다. manifest는 엄격한 UTF-8과 2 MiB 상한으로 읽고 읽기 중 변경, 선언 크기·SHA-256, Windows 대소문자 중복, 실제 최상위 파일 집합과 하위 폴더 부재를 확인합니다. journal은 원자적으로 교체하며 교체가 완료된 뒤 임시 파일 정리나 destination 재확인만 EDR에 막혀도 저장 완료를 실패로 되돌리지 않습니다. 새 ProgramData 제품 루트는 원자적 생성에 성공한 경우에만 ACL과 파일을 쓰므로 검사 직후 다른 프로세스가 만든 폴더는 수정하지 않습니다. 변경 자체의 복구까지 실패하면 최초 설치 실패 코드를 별도로 유지하고 SETUP_ROLLBACK_FAILED와 실패한 ROLLBACK_* 단계를 함께 표시합니다.</w:t>
       </w:r>
     </w:p>
     <w:p>
@@ -2381,7 +2381,7 @@
           <w:color w:val="16324F"/>
           <w:sz w:val="21"/>
         </w:rPr>
-        <w:t>Agent Setup에 AGENT_LOCAL_CONNECTION_UNCONFIRMED 또는 FIREWALL_REMOTE_ACCESS_UNCONFIRMED가 표시되면 Agent 서비스와 프로그램은 설치됐지만 연결 준비를 확인하지 못했다는 뜻입니다. Viewer에서 연결 테스트를 실행하고, TCP/18443이 실패할 때 Windows 관리자에게 확인하세요. 규칙을 AGENT_CONNECTION_REFUSED가 보이면 Viewer에 스위치 IP나 localhost가 아니라 Agent를 설치한 PC의 실제 주소를 입력했는지 먼저 확인하세요. 같은 PC 시험에서는 해당 PC의 사설 IPv4 또는 localhost를 사용할 수 있습니다. 그 다음 Windows 서비스에서 SamsungSwitchWatchAgent가 Running인지 확인하고 TCP/18443을 점검합니다. TCP 단계는 성공하고 HTTPS 단계가 실패하면 방화벽이 아니라 Agent PC의 로컬 HTTPS/TLS 준비 상태를 확인합니다. AGENT_CLIENT_NOT_ALLOWED이면 Viewer 주소가 RFC1918 사설 범위인지 확인합니다. 서비스를 수동 등록하지 말고 0.11.9-poc Agent Setup을 사용하세요.</w:t>
+        <w:t>Agent Setup에 AGENT_LOCAL_CONNECTION_UNCONFIRMED 또는 FIREWALL_REMOTE_ACCESS_UNCONFIRMED가 표시되면 Agent 서비스와 프로그램은 설치됐지만 연결 준비를 확인하지 못했다는 뜻입니다. Viewer에서 연결 테스트를 실행하고, TCP/18443이 실패할 때 Windows 관리자에게 확인하세요. 규칙을 AGENT_CONNECTION_REFUSED가 보이면 Viewer에 스위치 IP나 localhost가 아니라 Agent를 설치한 PC의 실제 주소를 입력했는지 먼저 확인하세요. 같은 PC 시험에서는 해당 PC의 사설 IPv4 또는 localhost를 사용할 수 있습니다. 그 다음 Windows 서비스에서 SamsungSwitchWatchAgent가 Running인지 확인하고 TCP/18443을 점검합니다. TCP 단계는 성공하고 HTTPS 단계가 실패하면 방화벽이 아니라 Agent PC의 로컬 HTTPS/TLS 준비 상태를 확인합니다. AGENT_CLIENT_NOT_ALLOWED이면 Viewer 주소가 RFC1918 사설 범위인지 확인합니다. 서비스를 수동 등록하지 말고 0.11.10-poc Agent Setup을 사용하세요.</w:t>
       </w:r>
     </w:p>
     <w:p>
@@ -2514,7 +2514,7 @@
           <w:color w:val="16324F"/>
           <w:sz w:val="21"/>
         </w:rPr>
-        <w:t>Viewer 프로그램은 %LOCALAPPDATA%\Programs\SamsungSwitchWatch\Viewer에 설치합니다. 장비 목록, DPAPI 자격 증명, 감시 이력과 화면 설정은 별도 데이터 경로인 %LOCALAPPDATA%\SamsungSwitchWatch에 보존됩니다. Viewer를 업데이트해도 자료는 유지되지만 문제 재현과 지원을 단순하게 하려면 Agent와 같은 Release 사용을 권장합니다. API v4가 호환되면 세부 버전이 달라도 연결은 유지되고 경고만 표시됩니다.</w:t>
+        <w:t>Viewer 프로그램은 %LOCALAPPDATA%\Programs\SamsungSwitchWatch\Viewer에 설치합니다. 장비 목록, DPAPI 자격 증명, 감시 이력과 화면 설정은 별도 데이터 경로인 %LOCALAPPDATA%\SamsungSwitchWatch에 보존됩니다. Viewer를 업데이트해도 자료는 유지되지만 각 JSON 파일은 크기 상한과 형식 검사를 적용하며 원자 교체 뒤 백신·EDR의 재확인 잠금만으로 완료된 저장을 실패로 오판하지 않습니다. 문제 재현과 지원을 단순하게 하려면 Agent와 같은 Release 사용을 권장합니다. API v4가 호환되면 세부 버전이 달라도 연결은 유지되고 경고만 표시됩니다.</w:t>
       </w:r>
     </w:p>
     <w:p>
@@ -2543,7 +2543,7 @@
           <w:color w:val="16324F"/>
           <w:sz w:val="21"/>
         </w:rPr>
-        <w:t>0.11.9-poc는 코드 서명되지 않아 SmartScreen이나 사내 EDR이 차단할 수 있습니다. ZIP을 완전히 압축 해제하고 Setup, Viewer EXE와 제공된 DLL이 같은 폴더에 있는지 확인하세요. EDR·AppLocker·WDAC가 차단하면 우회하지 말고 공식 ZIP의 버전·해시와 차단 기록을 보안 담당자에게 전달하세요.</w:t>
+        <w:t>0.11.10-poc는 코드 서명되지 않아 SmartScreen이나 사내 EDR이 차단할 수 있습니다. ZIP을 완전히 압축 해제하고 Setup, Viewer EXE와 제공된 DLL이 같은 폴더에 있는지 확인하세요. EDR·AppLocker·WDAC가 차단하면 우회하지 말고 공식 ZIP의 버전·해시와 차단 기록을 보안 담당자에게 전달하세요.</w:t>
       </w:r>
     </w:p>
     <w:p>
@@ -2601,7 +2601,7 @@
           <w:color w:val="16324F"/>
           <w:sz w:val="21"/>
         </w:rPr>
-        <w:t>Setup이 미완료 journal을 찾으면 설치/업데이트를 잠급니다. '이전 상태 복구'를 눌러 복구 완료를 확인한 다음 설치/업데이트를 별도로 다시 누르세요. 복구 성공이 설치를 자동으로 시작하지는 않습니다. 장비·연결·DPAPI·감시 데이터는 보존되고 Setup 전용 journal과 증거 파일만 정리됩니다.</w:t>
+        <w:t>Setup이 미완료 journal을 찾으면 설치/업데이트를 잠급니다. '이전 상태 복구'를 눌러 복구 완료를 확인한 다음 설치/업데이트를 별도로 다시 누르세요. 복구 성공이 설치를 자동으로 시작하지는 않습니다. 장비·연결·DPAPI·감시 데이터는 보존되고 Setup 전용 journal과 증거 파일만 정리됩니다. 활성화·복구 파일 이동과 삭제는 취소 가능한 제한 재시도로 일시적인 EDR 잠금을 처리합니다. commit 전 새 Viewer가 손상된 경우에는 해당 세대를 failed 위치로 격리한 뒤 검증된 이전 설치를 복구하고 다시 확인합니다.</w:t>
       </w:r>
     </w:p>
     <w:p>
@@ -4694,6 +4694,22 @@
     </w:p>
     <w:p>
       <w:pPr>
+        <w:numPr>
+          <w:ilvl w:val="0"/>
+          <w:numId w:val="10"/>
+        </w:numPr>
+        <w:spacing w:before="0" w:after="120" w:line="300" w:lineRule="auto"/>
+      </w:pPr>
+      <w:r>
+        <w:rPr>
+          <w:rFonts w:ascii="맑은 고딕" w:hAnsi="맑은 고딕" w:eastAsia="맑은 고딕" w:cs="맑은 고딕"/>
+          <w:sz w:val="22"/>
+        </w:rPr>
+        <w:t>이벤트 feed는 제한된 용량에서 같은 변경을 합치며, 교체된 이전 Agent 연결이 늦게 돌려준 결과는 현재 상태에 반영하지 않습니다.</w:t>
+      </w:r>
+    </w:p>
+    <w:p>
+      <w:pPr>
         <w:keepLines/>
         <w:pageBreakBefore w:val="0"/>
         <w:spacing w:before="80" w:after="160" w:line="283" w:lineRule="auto"/>
@@ -5424,7 +5440,7 @@
         <w:rPr>
           <w:rFonts w:ascii="맑은 고딕" w:hAnsi="맑은 고딕" w:eastAsia="맑은 고딕" w:cs="맑은 고딕"/>
         </w:rPr>
-        <w:t>평소에는 미니 창을 항상 위에 두고 문제 수와 마지막 점검 시각만 확인할 수 있습니다. 장애가 새로 발생하면 별도의 팝업이 나타나며 클릭하면 해당 이벤트로 이동합니다.</w:t>
+        <w:t>평소에는 미니 창을 항상 위에 두고 문제 수와 마지막 점검 시각만 확인할 수 있습니다. 장애가 새로 발생하면 별도의 팝업이 나타나며 클릭하면 해당 이벤트로 이동합니다. 작은 작업 영역에서는 대시보드를 스크롤하고 저장된 창 위치·크기를 현재 화면 안으로 보정합니다.</w:t>
       </w:r>
     </w:p>
     <w:p>
@@ -6411,6 +6427,22 @@
           <w:sz w:val="22"/>
         </w:rPr>
         <w:t>Viewer 설정을 다른 PC나 Windows 사용자에게 복사해도 계정은 복호화되지 않으며, 진단 파일에는 IP·ID·비밀번호·호스트명·수동 명령 원문을 넣지 않습니다.</w:t>
+      </w:r>
+    </w:p>
+    <w:p>
+      <w:pPr>
+        <w:numPr>
+          <w:ilvl w:val="0"/>
+          <w:numId w:val="10"/>
+        </w:numPr>
+        <w:spacing w:before="0" w:after="120" w:line="300" w:lineRule="auto"/>
+      </w:pPr>
+      <w:r>
+        <w:rPr>
+          <w:rFonts w:ascii="맑은 고딕" w:hAnsi="맑은 고딕" w:eastAsia="맑은 고딕" w:cs="맑은 고딕"/>
+          <w:sz w:val="22"/>
+        </w:rPr>
+        <w:t>Agent 신원 입력과 Viewer 로컬 JSON은 크기 상한을 넘거나 손상되면 안전하게 거부하며 이전 상태를 정상으로 가장하지 않습니다.</w:t>
       </w:r>
     </w:p>
     <w:p>
@@ -8535,6 +8567,95 @@
           </w:p>
         </w:tc>
       </w:tr>
+    </w:tbl>
+    <w:p>
+      <w:pPr>
+        <w:spacing w:after="60"/>
+      </w:pPr>
+    </w:p>
+    <w:tbl>
+      <w:tblPr>
+        <w:tblW w:type="dxa" w:w="9360"/>
+        <w:tblLayout w:type="fixed"/>
+        <w:tblLook w:firstColumn="1" w:firstRow="1" w:lastColumn="0" w:lastRow="0" w:noHBand="0" w:noVBand="1" w:val="04A0"/>
+        <w:tblInd w:w="120" w:type="dxa"/>
+        <w:tblBorders>
+          <w:top w:val="single" w:sz="6" w:space="0" w:color="CBD5E1"/>
+          <w:left w:val="single" w:sz="6" w:space="0" w:color="CBD5E1"/>
+          <w:bottom w:val="single" w:sz="6" w:space="0" w:color="CBD5E1"/>
+          <w:right w:val="single" w:sz="6" w:space="0" w:color="CBD5E1"/>
+          <w:insideH w:val="single" w:sz="6" w:space="0" w:color="CBD5E1"/>
+          <w:insideV w:val="single" w:sz="6" w:space="0" w:color="CBD5E1"/>
+        </w:tblBorders>
+      </w:tblPr>
+      <w:tblGrid>
+        <w:gridCol w:w="4300"/>
+        <w:gridCol w:w="5060"/>
+      </w:tblGrid>
+      <w:tr>
+        <w:trPr>
+          <w:tblHeader w:val="true"/>
+          <w:cantSplit w:val="1"/>
+        </w:trPr>
+        <w:tc>
+          <w:tcPr>
+            <w:tcW w:type="dxa" w:w="4300"/>
+            <w:tcMar>
+              <w:top w:w="80" w:type="dxa"/>
+              <w:start w:w="120" w:type="dxa"/>
+              <w:bottom w:w="80" w:type="dxa"/>
+              <w:end w:w="120" w:type="dxa"/>
+            </w:tcMar>
+            <w:vAlign w:val="center"/>
+            <w:shd w:fill="E8EEF5"/>
+          </w:tcPr>
+          <w:p>
+            <w:pPr>
+              <w:keepNext/>
+              <w:spacing w:before="0" w:after="0" w:line="264" w:lineRule="auto"/>
+              <w:jc w:val="center"/>
+            </w:pPr>
+            <w:r>
+              <w:rPr>
+                <w:rFonts w:ascii="맑은 고딕" w:hAnsi="맑은 고딕" w:eastAsia="맑은 고딕" w:cs="맑은 고딕"/>
+                <w:b/>
+                <w:color w:val="16324F"/>
+                <w:sz w:val="17"/>
+              </w:rPr>
+              <w:t>표시 코드/증상</w:t>
+            </w:r>
+          </w:p>
+        </w:tc>
+        <w:tc>
+          <w:tcPr>
+            <w:tcW w:type="dxa" w:w="5060"/>
+            <w:tcMar>
+              <w:top w:w="80" w:type="dxa"/>
+              <w:start w:w="120" w:type="dxa"/>
+              <w:bottom w:w="80" w:type="dxa"/>
+              <w:end w:w="120" w:type="dxa"/>
+            </w:tcMar>
+            <w:vAlign w:val="center"/>
+            <w:shd w:fill="E8EEF5"/>
+          </w:tcPr>
+          <w:p>
+            <w:pPr>
+              <w:keepNext/>
+              <w:spacing w:before="0" w:after="0" w:line="264" w:lineRule="auto"/>
+              <w:jc w:val="center"/>
+            </w:pPr>
+            <w:r>
+              <w:rPr>
+                <w:rFonts w:ascii="맑은 고딕" w:hAnsi="맑은 고딕" w:eastAsia="맑은 고딕" w:cs="맑은 고딕"/>
+                <w:b/>
+                <w:color w:val="16324F"/>
+                <w:sz w:val="17"/>
+              </w:rPr>
+              <w:t>확인 순서</w:t>
+            </w:r>
+          </w:p>
+        </w:tc>
+      </w:tr>
       <w:tr>
         <w:trPr>
           <w:cantSplit w:val="1"/>
@@ -8542,7 +8663,6 @@
         <w:tc>
           <w:tcPr>
             <w:tcW w:type="dxa" w:w="4300"/>
-            <w:shd w:fill="FAFBFC"/>
             <w:tcMar>
               <w:top w:w="80" w:type="dxa"/>
               <w:start w:w="120" w:type="dxa"/>
@@ -8568,7 +8688,6 @@
         <w:tc>
           <w:tcPr>
             <w:tcW w:type="dxa" w:w="5060"/>
-            <w:shd w:fill="FAFBFC"/>
             <w:tcMar>
               <w:top w:w="80" w:type="dxa"/>
               <w:start w:w="120" w:type="dxa"/>
@@ -8599,6 +8718,7 @@
         <w:tc>
           <w:tcPr>
             <w:tcW w:type="dxa" w:w="4300"/>
+            <w:shd w:fill="FAFBFC"/>
             <w:tcMar>
               <w:top w:w="80" w:type="dxa"/>
               <w:start w:w="120" w:type="dxa"/>
@@ -8624,6 +8744,7 @@
         <w:tc>
           <w:tcPr>
             <w:tcW w:type="dxa" w:w="5060"/>
+            <w:shd w:fill="FAFBFC"/>
             <w:tcMar>
               <w:top w:w="80" w:type="dxa"/>
               <w:start w:w="120" w:type="dxa"/>
@@ -8654,7 +8775,6 @@
         <w:tc>
           <w:tcPr>
             <w:tcW w:type="dxa" w:w="4300"/>
-            <w:shd w:fill="FAFBFC"/>
             <w:tcMar>
               <w:top w:w="80" w:type="dxa"/>
               <w:start w:w="120" w:type="dxa"/>
@@ -8680,7 +8800,6 @@
         <w:tc>
           <w:tcPr>
             <w:tcW w:type="dxa" w:w="5060"/>
-            <w:shd w:fill="FAFBFC"/>
             <w:tcMar>
               <w:top w:w="80" w:type="dxa"/>
               <w:start w:w="120" w:type="dxa"/>
@@ -8711,6 +8830,7 @@
         <w:tc>
           <w:tcPr>
             <w:tcW w:type="dxa" w:w="4300"/>
+            <w:shd w:fill="FAFBFC"/>
             <w:tcMar>
               <w:top w:w="80" w:type="dxa"/>
               <w:start w:w="120" w:type="dxa"/>
@@ -8736,6 +8856,7 @@
         <w:tc>
           <w:tcPr>
             <w:tcW w:type="dxa" w:w="5060"/>
+            <w:shd w:fill="FAFBFC"/>
             <w:tcMar>
               <w:top w:w="80" w:type="dxa"/>
               <w:start w:w="120" w:type="dxa"/>
@@ -8766,7 +8887,6 @@
         <w:tc>
           <w:tcPr>
             <w:tcW w:type="dxa" w:w="4300"/>
-            <w:shd w:fill="FAFBFC"/>
             <w:tcMar>
               <w:top w:w="80" w:type="dxa"/>
               <w:start w:w="120" w:type="dxa"/>
@@ -8792,7 +8912,6 @@
         <w:tc>
           <w:tcPr>
             <w:tcW w:type="dxa" w:w="5060"/>
-            <w:shd w:fill="FAFBFC"/>
             <w:tcMar>
               <w:top w:w="80" w:type="dxa"/>
               <w:start w:w="120" w:type="dxa"/>
@@ -8823,6 +8942,7 @@
         <w:tc>
           <w:tcPr>
             <w:tcW w:type="dxa" w:w="4300"/>
+            <w:shd w:fill="FAFBFC"/>
             <w:tcMar>
               <w:top w:w="80" w:type="dxa"/>
               <w:start w:w="120" w:type="dxa"/>
@@ -8848,6 +8968,7 @@
         <w:tc>
           <w:tcPr>
             <w:tcW w:type="dxa" w:w="5060"/>
+            <w:shd w:fill="FAFBFC"/>
             <w:tcMar>
               <w:top w:w="80" w:type="dxa"/>
               <w:start w:w="120" w:type="dxa"/>
@@ -8878,7 +8999,6 @@
         <w:tc>
           <w:tcPr>
             <w:tcW w:type="dxa" w:w="4300"/>
-            <w:shd w:fill="FAFBFC"/>
             <w:tcMar>
               <w:top w:w="80" w:type="dxa"/>
               <w:start w:w="120" w:type="dxa"/>
@@ -8904,7 +9024,6 @@
         <w:tc>
           <w:tcPr>
             <w:tcW w:type="dxa" w:w="5060"/>
-            <w:shd w:fill="FAFBFC"/>
             <w:tcMar>
               <w:top w:w="80" w:type="dxa"/>
               <w:start w:w="120" w:type="dxa"/>
@@ -8935,6 +9054,7 @@
         <w:tc>
           <w:tcPr>
             <w:tcW w:type="dxa" w:w="4300"/>
+            <w:shd w:fill="FAFBFC"/>
             <w:tcMar>
               <w:top w:w="80" w:type="dxa"/>
               <w:start w:w="120" w:type="dxa"/>
@@ -8960,6 +9080,7 @@
         <w:tc>
           <w:tcPr>
             <w:tcW w:type="dxa" w:w="5060"/>
+            <w:shd w:fill="FAFBFC"/>
             <w:tcMar>
               <w:top w:w="80" w:type="dxa"/>
               <w:start w:w="120" w:type="dxa"/>
@@ -8990,7 +9111,6 @@
         <w:tc>
           <w:tcPr>
             <w:tcW w:type="dxa" w:w="4300"/>
-            <w:shd w:fill="FAFBFC"/>
             <w:tcMar>
               <w:top w:w="80" w:type="dxa"/>
               <w:start w:w="120" w:type="dxa"/>
@@ -9016,7 +9136,6 @@
         <w:tc>
           <w:tcPr>
             <w:tcW w:type="dxa" w:w="5060"/>
-            <w:shd w:fill="FAFBFC"/>
             <w:tcMar>
               <w:top w:w="80" w:type="dxa"/>
               <w:start w:w="120" w:type="dxa"/>
@@ -9047,6 +9166,7 @@
         <w:tc>
           <w:tcPr>
             <w:tcW w:type="dxa" w:w="4300"/>
+            <w:shd w:fill="FAFBFC"/>
             <w:tcMar>
               <w:top w:w="80" w:type="dxa"/>
               <w:start w:w="120" w:type="dxa"/>
@@ -9072,6 +9192,7 @@
         <w:tc>
           <w:tcPr>
             <w:tcW w:type="dxa" w:w="5060"/>
+            <w:shd w:fill="FAFBFC"/>
             <w:tcMar>
               <w:top w:w="80" w:type="dxa"/>
               <w:start w:w="120" w:type="dxa"/>
@@ -9102,7 +9223,6 @@
         <w:tc>
           <w:tcPr>
             <w:tcW w:type="dxa" w:w="4300"/>
-            <w:shd w:fill="FAFBFC"/>
             <w:tcMar>
               <w:top w:w="80" w:type="dxa"/>
               <w:start w:w="120" w:type="dxa"/>
@@ -9128,7 +9248,6 @@
         <w:tc>
           <w:tcPr>
             <w:tcW w:type="dxa" w:w="5060"/>
-            <w:shd w:fill="FAFBFC"/>
             <w:tcMar>
               <w:top w:w="80" w:type="dxa"/>
               <w:start w:w="120" w:type="dxa"/>
@@ -9159,6 +9278,7 @@
         <w:tc>
           <w:tcPr>
             <w:tcW w:type="dxa" w:w="4300"/>
+            <w:shd w:fill="FAFBFC"/>
             <w:tcMar>
               <w:top w:w="80" w:type="dxa"/>
               <w:start w:w="120" w:type="dxa"/>
@@ -9184,6 +9304,7 @@
         <w:tc>
           <w:tcPr>
             <w:tcW w:type="dxa" w:w="5060"/>
+            <w:shd w:fill="FAFBFC"/>
             <w:tcMar>
               <w:top w:w="80" w:type="dxa"/>
               <w:start w:w="120" w:type="dxa"/>
@@ -9214,7 +9335,6 @@
         <w:tc>
           <w:tcPr>
             <w:tcW w:type="dxa" w:w="4300"/>
-            <w:shd w:fill="FAFBFC"/>
             <w:tcMar>
               <w:top w:w="80" w:type="dxa"/>
               <w:start w:w="120" w:type="dxa"/>
@@ -9240,7 +9360,6 @@
         <w:tc>
           <w:tcPr>
             <w:tcW w:type="dxa" w:w="5060"/>
-            <w:shd w:fill="FAFBFC"/>
             <w:tcMar>
               <w:top w:w="80" w:type="dxa"/>
               <w:start w:w="120" w:type="dxa"/>
@@ -9271,6 +9390,7 @@
         <w:tc>
           <w:tcPr>
             <w:tcW w:type="dxa" w:w="4300"/>
+            <w:shd w:fill="FAFBFC"/>
             <w:tcMar>
               <w:top w:w="80" w:type="dxa"/>
               <w:start w:w="120" w:type="dxa"/>
@@ -9296,6 +9416,7 @@
         <w:tc>
           <w:tcPr>
             <w:tcW w:type="dxa" w:w="5060"/>
+            <w:shd w:fill="FAFBFC"/>
             <w:tcMar>
               <w:top w:w="80" w:type="dxa"/>
               <w:start w:w="120" w:type="dxa"/>
@@ -9326,7 +9447,6 @@
         <w:tc>
           <w:tcPr>
             <w:tcW w:type="dxa" w:w="4300"/>
-            <w:shd w:fill="FAFBFC"/>
             <w:tcMar>
               <w:top w:w="80" w:type="dxa"/>
               <w:start w:w="120" w:type="dxa"/>
@@ -9352,7 +9472,6 @@
         <w:tc>
           <w:tcPr>
             <w:tcW w:type="dxa" w:w="5060"/>
-            <w:shd w:fill="FAFBFC"/>
             <w:tcMar>
               <w:top w:w="80" w:type="dxa"/>
               <w:start w:w="120" w:type="dxa"/>
@@ -9383,6 +9502,7 @@
         <w:tc>
           <w:tcPr>
             <w:tcW w:type="dxa" w:w="4300"/>
+            <w:shd w:fill="FAFBFC"/>
             <w:tcMar>
               <w:top w:w="80" w:type="dxa"/>
               <w:start w:w="120" w:type="dxa"/>
@@ -9408,6 +9528,7 @@
         <w:tc>
           <w:tcPr>
             <w:tcW w:type="dxa" w:w="5060"/>
+            <w:shd w:fill="FAFBFC"/>
             <w:tcMar>
               <w:top w:w="80" w:type="dxa"/>
               <w:start w:w="120" w:type="dxa"/>
@@ -9438,7 +9559,6 @@
         <w:tc>
           <w:tcPr>
             <w:tcW w:type="dxa" w:w="4300"/>
-            <w:shd w:fill="FAFBFC"/>
             <w:tcMar>
               <w:top w:w="80" w:type="dxa"/>
               <w:start w:w="120" w:type="dxa"/>
@@ -9464,7 +9584,6 @@
         <w:tc>
           <w:tcPr>
             <w:tcW w:type="dxa" w:w="5060"/>
-            <w:shd w:fill="FAFBFC"/>
             <w:tcMar>
               <w:top w:w="80" w:type="dxa"/>
               <w:start w:w="120" w:type="dxa"/>
@@ -9495,6 +9614,7 @@
         <w:tc>
           <w:tcPr>
             <w:tcW w:type="dxa" w:w="4300"/>
+            <w:shd w:fill="FAFBFC"/>
             <w:tcMar>
               <w:top w:w="80" w:type="dxa"/>
               <w:start w:w="120" w:type="dxa"/>
@@ -9520,6 +9640,7 @@
         <w:tc>
           <w:tcPr>
             <w:tcW w:type="dxa" w:w="5060"/>
+            <w:shd w:fill="FAFBFC"/>
             <w:tcMar>
               <w:top w:w="80" w:type="dxa"/>
               <w:start w:w="120" w:type="dxa"/>
@@ -9550,7 +9671,6 @@
         <w:tc>
           <w:tcPr>
             <w:tcW w:type="dxa" w:w="4300"/>
-            <w:shd w:fill="FAFBFC"/>
             <w:tcMar>
               <w:top w:w="80" w:type="dxa"/>
               <w:start w:w="120" w:type="dxa"/>
@@ -9576,7 +9696,6 @@
         <w:tc>
           <w:tcPr>
             <w:tcW w:type="dxa" w:w="5060"/>
-            <w:shd w:fill="FAFBFC"/>
             <w:tcMar>
               <w:top w:w="80" w:type="dxa"/>
               <w:start w:w="120" w:type="dxa"/>
@@ -9596,6 +9715,95 @@
                 <w:sz w:val="16"/>
               </w:rPr>
               <w:t>로그인 후 &gt; 또는 # 프롬프트 형식을 확인</w:t>
+            </w:r>
+          </w:p>
+        </w:tc>
+      </w:tr>
+    </w:tbl>
+    <w:p>
+      <w:pPr>
+        <w:spacing w:after="60"/>
+      </w:pPr>
+    </w:p>
+    <w:tbl>
+      <w:tblPr>
+        <w:tblW w:type="dxa" w:w="9360"/>
+        <w:tblLayout w:type="fixed"/>
+        <w:tblLook w:firstColumn="1" w:firstRow="1" w:lastColumn="0" w:lastRow="0" w:noHBand="0" w:noVBand="1" w:val="04A0"/>
+        <w:tblInd w:w="120" w:type="dxa"/>
+        <w:tblBorders>
+          <w:top w:val="single" w:sz="6" w:space="0" w:color="CBD5E1"/>
+          <w:left w:val="single" w:sz="6" w:space="0" w:color="CBD5E1"/>
+          <w:bottom w:val="single" w:sz="6" w:space="0" w:color="CBD5E1"/>
+          <w:right w:val="single" w:sz="6" w:space="0" w:color="CBD5E1"/>
+          <w:insideH w:val="single" w:sz="6" w:space="0" w:color="CBD5E1"/>
+          <w:insideV w:val="single" w:sz="6" w:space="0" w:color="CBD5E1"/>
+        </w:tblBorders>
+      </w:tblPr>
+      <w:tblGrid>
+        <w:gridCol w:w="4300"/>
+        <w:gridCol w:w="5060"/>
+      </w:tblGrid>
+      <w:tr>
+        <w:trPr>
+          <w:tblHeader w:val="true"/>
+          <w:cantSplit w:val="1"/>
+        </w:trPr>
+        <w:tc>
+          <w:tcPr>
+            <w:tcW w:type="dxa" w:w="4300"/>
+            <w:tcMar>
+              <w:top w:w="80" w:type="dxa"/>
+              <w:start w:w="120" w:type="dxa"/>
+              <w:bottom w:w="80" w:type="dxa"/>
+              <w:end w:w="120" w:type="dxa"/>
+            </w:tcMar>
+            <w:vAlign w:val="center"/>
+            <w:shd w:fill="E8EEF5"/>
+          </w:tcPr>
+          <w:p>
+            <w:pPr>
+              <w:keepNext/>
+              <w:spacing w:before="0" w:after="0" w:line="264" w:lineRule="auto"/>
+              <w:jc w:val="center"/>
+            </w:pPr>
+            <w:r>
+              <w:rPr>
+                <w:rFonts w:ascii="맑은 고딕" w:hAnsi="맑은 고딕" w:eastAsia="맑은 고딕" w:cs="맑은 고딕"/>
+                <w:b/>
+                <w:color w:val="16324F"/>
+                <w:sz w:val="17"/>
+              </w:rPr>
+              <w:t>표시 코드/증상</w:t>
+            </w:r>
+          </w:p>
+        </w:tc>
+        <w:tc>
+          <w:tcPr>
+            <w:tcW w:type="dxa" w:w="5060"/>
+            <w:tcMar>
+              <w:top w:w="80" w:type="dxa"/>
+              <w:start w:w="120" w:type="dxa"/>
+              <w:bottom w:w="80" w:type="dxa"/>
+              <w:end w:w="120" w:type="dxa"/>
+            </w:tcMar>
+            <w:vAlign w:val="center"/>
+            <w:shd w:fill="E8EEF5"/>
+          </w:tcPr>
+          <w:p>
+            <w:pPr>
+              <w:keepNext/>
+              <w:spacing w:before="0" w:after="0" w:line="264" w:lineRule="auto"/>
+              <w:jc w:val="center"/>
+            </w:pPr>
+            <w:r>
+              <w:rPr>
+                <w:rFonts w:ascii="맑은 고딕" w:hAnsi="맑은 고딕" w:eastAsia="맑은 고딕" w:cs="맑은 고딕"/>
+                <w:b/>
+                <w:color w:val="16324F"/>
+                <w:sz w:val="17"/>
+              </w:rPr>
+              <w:t>확인 순서</w:t>
             </w:r>
           </w:p>
         </w:tc>
@@ -11085,7 +11293,7 @@
         <w:color w:val="64748B"/>
         <w:sz w:val="17"/>
       </w:rPr>
-      <w:t xml:space="preserve">v0.11.9-poc  |  </w:t>
+      <w:t xml:space="preserve">v0.11.10-poc  |  </w:t>
     </w:r>
     <w:r>
       <w:rPr>
@@ -11116,7 +11324,7 @@
         <w:color w:val="64748B"/>
         <w:sz w:val="17"/>
       </w:rPr>
-      <w:t>v0.11.9-poc  |  2026-08-12</w:t>
+      <w:t>v0.11.10-poc  |  2026-08-13</w:t>
     </w:r>
   </w:p>
 </w:ftr>

</xml_diff>

<commit_message>
fix: recover invalid Viewer installations
</commit_message>
<xml_diff>
--- a/docs/SamsungSwitchWatch_User_Manual_KO.docx
+++ b/docs/SamsungSwitchWatch_User_Manual_KO.docx
@@ -1159,7 +1159,7 @@
           <w:color w:val="16324F"/>
           <w:sz w:val="21"/>
         </w:rPr>
-        <w:t>0.11.10-poc는 코드 서명되지 않은 시험판입니다. 압축을 풀기 전에 Agent와 Viewer ZIP의 SHA-256을 해당 GitHub Release 본문에 표시된 값과 비교하고 사내 보안 반입 절차를 완료하세요. SmartScreen 또는 EDR 경고를 우회하지 않습니다.</w:t>
+        <w:t>0.11.11-poc는 코드 서명되지 않은 시험판입니다. 압축을 풀기 전에 Agent와 Viewer ZIP의 SHA-256을 해당 GitHub Release 본문에 표시된 값과 비교하고 사내 보안 반입 절차를 완료하세요. SmartScreen 또는 EDR 경고를 우회하지 않습니다.</w:t>
       </w:r>
     </w:p>
     <w:p>
@@ -2381,7 +2381,7 @@
           <w:color w:val="16324F"/>
           <w:sz w:val="21"/>
         </w:rPr>
-        <w:t>Agent Setup에 AGENT_LOCAL_CONNECTION_UNCONFIRMED 또는 FIREWALL_REMOTE_ACCESS_UNCONFIRMED가 표시되면 Agent 서비스와 프로그램은 설치됐지만 연결 준비를 확인하지 못했다는 뜻입니다. Viewer에서 연결 테스트를 실행하고, TCP/18443이 실패할 때 Windows 관리자에게 확인하세요. 규칙을 AGENT_CONNECTION_REFUSED가 보이면 Viewer에 스위치 IP나 localhost가 아니라 Agent를 설치한 PC의 실제 주소를 입력했는지 먼저 확인하세요. 같은 PC 시험에서는 해당 PC의 사설 IPv4 또는 localhost를 사용할 수 있습니다. 그 다음 Windows 서비스에서 SamsungSwitchWatchAgent가 Running인지 확인하고 TCP/18443을 점검합니다. TCP 단계는 성공하고 HTTPS 단계가 실패하면 방화벽이 아니라 Agent PC의 로컬 HTTPS/TLS 준비 상태를 확인합니다. AGENT_CLIENT_NOT_ALLOWED이면 Viewer 주소가 RFC1918 사설 범위인지 확인합니다. 서비스를 수동 등록하지 말고 0.11.10-poc Agent Setup을 사용하세요.</w:t>
+        <w:t>Agent Setup에 AGENT_LOCAL_CONNECTION_UNCONFIRMED 또는 FIREWALL_REMOTE_ACCESS_UNCONFIRMED가 표시되면 Agent 서비스와 프로그램은 설치됐지만 연결 준비를 확인하지 못했다는 뜻입니다. Viewer에서 연결 테스트를 실행하고, TCP/18443이 실패할 때 Windows 관리자에게 확인하세요. 규칙을 AGENT_CONNECTION_REFUSED가 보이면 Viewer에 스위치 IP나 localhost가 아니라 Agent를 설치한 PC의 실제 주소를 입력했는지 먼저 확인하세요. 같은 PC 시험에서는 해당 PC의 사설 IPv4 또는 localhost를 사용할 수 있습니다. 그 다음 Windows 서비스에서 SamsungSwitchWatchAgent가 Running인지 확인하고 TCP/18443을 점검합니다. TCP 단계는 성공하고 HTTPS 단계가 실패하면 방화벽이 아니라 Agent PC의 로컬 HTTPS/TLS 준비 상태를 확인합니다. AGENT_CLIENT_NOT_ALLOWED이면 Viewer 주소가 RFC1918 사설 범위인지 확인합니다. 서비스를 수동 등록하지 말고 0.11.11-poc Agent Setup을 사용하세요.</w:t>
       </w:r>
     </w:p>
     <w:p>
@@ -2543,7 +2543,7 @@
           <w:color w:val="16324F"/>
           <w:sz w:val="21"/>
         </w:rPr>
-        <w:t>0.11.10-poc는 코드 서명되지 않아 SmartScreen이나 사내 EDR이 차단할 수 있습니다. ZIP을 완전히 압축 해제하고 Setup, Viewer EXE와 제공된 DLL이 같은 폴더에 있는지 확인하세요. EDR·AppLocker·WDAC가 차단하면 우회하지 말고 공식 ZIP의 버전·해시와 차단 기록을 보안 담당자에게 전달하세요.</w:t>
+        <w:t>0.11.11-poc는 코드 서명되지 않아 SmartScreen이나 사내 EDR이 차단할 수 있습니다. ZIP을 완전히 압축 해제하고 Setup, Viewer EXE와 제공된 DLL이 같은 폴더에 있는지 확인하세요. EDR·AppLocker·WDAC가 차단하면 우회하지 말고 공식 ZIP의 버전·해시와 차단 기록을 보안 담당자에게 전달하세요.</w:t>
       </w:r>
     </w:p>
     <w:p>
@@ -2601,7 +2601,36 @@
           <w:color w:val="16324F"/>
           <w:sz w:val="21"/>
         </w:rPr>
-        <w:t>Setup이 미완료 journal을 찾으면 설치/업데이트를 잠급니다. '이전 상태 복구'를 눌러 복구 완료를 확인한 다음 설치/업데이트를 별도로 다시 누르세요. 복구 성공이 설치를 자동으로 시작하지는 않습니다. 장비·연결·DPAPI·감시 데이터는 보존되고 Setup 전용 journal과 증거 파일만 정리됩니다. 활성화·복구 파일 이동과 삭제는 취소 가능한 제한 재시도로 일시적인 EDR 잠금을 처리합니다. commit 전 새 Viewer가 손상된 경우에는 해당 세대를 failed 위치로 격리한 뒤 검증된 이전 설치를 복구하고 다시 확인합니다.</w:t>
+        <w:t>Setup이 미완료 journal을 찾으면 설치/업데이트를 잠급니다. '이전 상태 복구'를 눌러 복구 완료를 확인한 다음 설치/업데이트를 별도로 다시 누르세요. 복구 성공이 설치를 자동으로 시작하지는 않습니다. 장비·연결·DPAPI·감시 데이터는 보존되고 Setup 전용 journal과 증거 파일만 정리됩니다. 활성화·복구 파일 이동과 삭제는 취소 가능한 제한 재시도로 일시적인 EDR 잠금을 처리합니다. 새 작업은 journal format 3으로 기록하고 기존 format 2도 원래 의미대로 복구합니다. format 3 복구가 남으면 이 버전 또는 더 최신 Viewer Setup으로 복구를 완료한 뒤에만 이전 버전으로 내리세요.</w:t>
+      </w:r>
+    </w:p>
+    <w:p>
+      <w:pPr>
+        <w:keepLines/>
+        <w:pageBreakBefore w:val="0"/>
+        <w:spacing w:before="80" w:after="160" w:line="283" w:lineRule="auto"/>
+        <w:ind w:left="115" w:right="58"/>
+        <w:shd w:fill="FFF8E8"/>
+        <w:pBdr>
+          <w:left w:val="single" w:sz="16" w:space="8" w:color="8A5A00"/>
+        </w:pBdr>
+      </w:pPr>
+      <w:r>
+        <w:rPr>
+          <w:rFonts w:ascii="맑은 고딕" w:hAnsi="맑은 고딕" w:eastAsia="맑은 고딕" w:cs="맑은 고딕"/>
+          <w:b/>
+          <w:color w:val="8A5A00"/>
+          <w:sz w:val="21"/>
+        </w:rPr>
+        <w:t xml:space="preserve">검증되지 않은 기존 프로그램의 자동 격리  </w:t>
+      </w:r>
+      <w:r>
+        <w:rPr>
+          <w:rFonts w:ascii="맑은 고딕" w:hAnsi="맑은 고딕" w:eastAsia="맑은 고딕" w:cs="맑은 고딕"/>
+          <w:color w:val="16324F"/>
+          <w:sz w:val="21"/>
+        </w:rPr>
+        <w:t>기존 Viewer 프로그램 폴더가 package 검증을 통과하지 못하면 바로 삭제하지 않고 이번 transaction backup으로 이동합니다. 새 Viewer가 commit되기 전 실패하거나 취소되면 원래 설치 경로로 되돌리고, 정상 실행 뒤에만 최근 제품 격리본 1개로 확정합니다. 모호한 경로·marker·reparse 상태는 변경하지 않습니다. %LOCALAPPDATA%\SamsungSwitchWatch의 장비·연결·DPAPI 자격 증명과 감시 데이터는 격리 대상이 아닙니다.</w:t>
       </w:r>
     </w:p>
     <w:p>
@@ -2655,6 +2684,84 @@
     </w:p>
     <w:p>
       <w:pPr>
+        <w:keepNext/>
+        <w:spacing w:before="80" w:after="0"/>
+        <w:jc w:val="center"/>
+      </w:pPr>
+      <w:r>
+        <w:drawing>
+          <wp:inline xmlns:a="http://schemas.openxmlformats.org/drawingml/2006/main" xmlns:pic="http://schemas.openxmlformats.org/drawingml/2006/picture">
+            <wp:extent cx="4389120" cy="4514523"/>
+            <wp:docPr id="4" name="Picture 4" title="Viewer Setup 실패와 SWS1 지원 코드" descr="기존 Viewer 자동 격리와 복구 상태, 선택·복사 가능한 SWS1 지원 코드를 보여 주는 Viewer Setup 실패 화면"/>
+            <wp:cNvGraphicFramePr>
+              <a:graphicFrameLocks noChangeAspect="1"/>
+            </wp:cNvGraphicFramePr>
+            <a:graphic>
+              <a:graphicData uri="http://schemas.openxmlformats.org/drawingml/2006/picture">
+                <pic:pic>
+                  <pic:nvPicPr>
+                    <pic:cNvPr id="0" name="00-viewer-setup-failed.png"/>
+                    <pic:cNvPicPr/>
+                  </pic:nvPicPr>
+                  <pic:blipFill>
+                    <a:blip r:embed="rId16"/>
+                    <a:stretch>
+                      <a:fillRect/>
+                    </a:stretch>
+                  </pic:blipFill>
+                  <pic:spPr>
+                    <a:xfrm>
+                      <a:off x="0" y="0"/>
+                      <a:ext cx="4389120" cy="4514523"/>
+                    </a:xfrm>
+                    <a:prstGeom prst="rect"/>
+                  </pic:spPr>
+                </pic:pic>
+              </a:graphicData>
+            </a:graphic>
+          </wp:inline>
+        </w:drawing>
+      </w:r>
+    </w:p>
+    <w:p>
+      <w:pPr>
+        <w:pStyle w:val="Caption"/>
+      </w:pPr>
+      <w:r>
+        <w:t>그림 4. Viewer 자동 격리 복구와 짧은 SWS1 지원 코드</w:t>
+      </w:r>
+    </w:p>
+    <w:p>
+      <w:pPr>
+        <w:keepLines/>
+        <w:pageBreakBefore w:val="0"/>
+        <w:spacing w:before="80" w:after="160" w:line="283" w:lineRule="auto"/>
+        <w:ind w:left="115" w:right="58"/>
+        <w:shd w:fill="E8EEF5"/>
+        <w:pBdr>
+          <w:left w:val="single" w:sz="16" w:space="8" w:color="2E74B5"/>
+        </w:pBdr>
+      </w:pPr>
+      <w:r>
+        <w:rPr>
+          <w:rFonts w:ascii="맑은 고딕" w:hAnsi="맑은 고딕" w:eastAsia="맑은 고딕" w:cs="맑은 고딕"/>
+          <w:b/>
+          <w:color w:val="2E74B5"/>
+          <w:sz w:val="21"/>
+        </w:rPr>
+        <w:t xml:space="preserve">Viewer Setup 전용 SWS1  </w:t>
+      </w:r>
+      <w:r>
+        <w:rPr>
+          <w:rFonts w:ascii="맑은 고딕" w:hAnsi="맑은 고딕" w:eastAsia="맑은 고딕" w:cs="맑은 고딕"/>
+          <w:color w:val="16324F"/>
+          <w:sz w:val="21"/>
+        </w:rPr>
+        <w:t>취소·중복 실행을 제외한 조치 가능한 Viewer Setup 설치·복구 실패와 복구 불가 검사에는 SWS1-XXXX-XXXX-XXXX-XXXX 형식의 별도 지원 코드가 표시됩니다. 코드를 선택하거나 복사해 전달할 수 있고 새 작업·성공·취소 때 이전 값이 지워집니다. SWS1에는 제품 버전과 작업·실패·복구 상태 같은 제한된 분류만 들어가며 경로, 사용자, 파일 해시, transaction ID, 자격 증명, 장비 정보와 예외 원문은 들어가지 않습니다. 기존 Agent Setup과 Viewer 연결 실패의 SWD1은 그대로 유지됩니다.</w:t>
+      </w:r>
+    </w:p>
+    <w:p>
+      <w:pPr>
         <w:pStyle w:val="Heading2"/>
         <w:pageBreakBefore w:val="0"/>
         <w:numPr>
@@ -2682,7 +2789,7 @@
         <w:drawing>
           <wp:inline xmlns:a="http://schemas.openxmlformats.org/drawingml/2006/main" xmlns:pic="http://schemas.openxmlformats.org/drawingml/2006/picture">
             <wp:extent cx="3200400" cy="4037427"/>
-            <wp:docPr id="4" name="Picture 4" title="Agent 연결 창" descr="Agent PC 주소 하나와 자동 HTTPS 연결 단계, 연결 확인 및 저장 버튼을 보여 주는 연결 설정 창"/>
+            <wp:docPr id="5" name="Picture 5" title="Agent 연결 창" descr="Agent PC 주소 하나와 자동 HTTPS 연결 단계, 연결 확인 및 저장 버튼을 보여 주는 연결 설정 창"/>
             <wp:cNvGraphicFramePr>
               <a:graphicFrameLocks noChangeAspect="1"/>
             </wp:cNvGraphicFramePr>
@@ -2694,7 +2801,7 @@
                     <pic:cNvPicPr/>
                   </pic:nvPicPr>
                   <pic:blipFill>
-                    <a:blip r:embed="rId16"/>
+                    <a:blip r:embed="rId17"/>
                     <a:stretch>
                       <a:fillRect/>
                     </a:stretch>
@@ -2718,7 +2825,7 @@
         <w:pStyle w:val="Caption"/>
       </w:pPr>
       <w:r>
-        <w:t>그림 4. Agent 주소만 입력하는 연결 설정</w:t>
+        <w:t>그림 5. Agent 주소만 입력하는 연결 설정</w:t>
       </w:r>
     </w:p>
     <w:p>
@@ -2746,7 +2853,7 @@
         <w:drawing>
           <wp:inline xmlns:a="http://schemas.openxmlformats.org/drawingml/2006/main" xmlns:pic="http://schemas.openxmlformats.org/drawingml/2006/picture">
             <wp:extent cx="3200400" cy="4037427"/>
-            <wp:docPr id="5" name="Picture 5" title="Agent 연결 실패와 지원 코드" descr="TCP 18443 연결 거부 단계와 선택 가능한 SWD1 지원 코드를 함께 표시하는 Viewer Agent 연결 실패 창"/>
+            <wp:docPr id="6" name="Picture 6" title="Agent 연결 실패와 지원 코드" descr="TCP 18443 연결 거부 단계와 선택 가능한 SWD1 지원 코드를 함께 표시하는 Viewer Agent 연결 실패 창"/>
             <wp:cNvGraphicFramePr>
               <a:graphicFrameLocks noChangeAspect="1"/>
             </wp:cNvGraphicFramePr>
@@ -2758,7 +2865,7 @@
                     <pic:cNvPicPr/>
                   </pic:nvPicPr>
                   <pic:blipFill>
-                    <a:blip r:embed="rId17"/>
+                    <a:blip r:embed="rId18"/>
                     <a:stretch>
                       <a:fillRect/>
                     </a:stretch>
@@ -2782,7 +2889,7 @@
         <w:pStyle w:val="Caption"/>
       </w:pPr>
       <w:r>
-        <w:t>그림 5. Viewer Agent 연결 실패와 짧은 SWD1 지원 코드</w:t>
+        <w:t>그림 6. Viewer Agent 연결 실패와 짧은 SWD1 지원 코드</w:t>
       </w:r>
     </w:p>
     <w:p>
@@ -2924,7 +3031,7 @@
           <w:color w:val="8A5A00"/>
           <w:sz w:val="21"/>
         </w:rPr>
-        <w:t xml:space="preserve">세 가지 진단을 구분하세요  </w:t>
+        <w:t xml:space="preserve">지원 코드와 진단을 구분하세요  </w:t>
       </w:r>
       <w:r>
         <w:rPr>
@@ -2932,7 +3039,7 @@
           <w:color w:val="16324F"/>
           <w:sz w:val="21"/>
         </w:rPr>
-        <w:t>SWD1은 Agent Setup 또는 Viewer 연결 실패를 전화·메신저로 짧게 전달하는 코드입니다. Agent Setup의 '진단정보 복사'는 실패 전용 긴 비식별 요약을 클립보드에 복사하고, '익명 진단 저장'은 작업이나 연결 검사가 끝난 뒤 SSW_FIELD_DIAGNOSTIC/2 한 장용 TXT를 사용자가 선택해 저장합니다. SWD1은 기존 진단을 대체하지 않으며 접속 권한을 부여하지 않습니다.</w:t>
+        <w:t>SWD1은 Agent Setup 또는 Viewer 연결 실패를, SWS1은 Viewer Setup 실패를 전화·메신저로 짧게 전달하는 서로 다른 코드입니다. Agent Setup의 '진단정보 복사'는 실패 전용 긴 비식별 요약을 클립보드에 복사하고, '익명 진단 저장'은 작업이나 연결 검사가 끝난 뒤 SSW_FIELD_DIAGNOSTIC/2 한 장용 TXT를 사용자가 선택해 저장합니다. SWD1과 SWS1은 기존 진단을 대체하지 않으며 접속 권한을 부여하지 않습니다.</w:t>
       </w:r>
     </w:p>
     <w:p>
@@ -2964,7 +3071,7 @@
         <w:drawing>
           <wp:inline xmlns:a="http://schemas.openxmlformats.org/drawingml/2006/main" xmlns:pic="http://schemas.openxmlformats.org/drawingml/2006/picture">
             <wp:extent cx="5029200" cy="3540967"/>
-            <wp:docPr id="6" name="Picture 6" title="장비 관리 창" descr="장비명, IPv4, 계정 ID와 비밀번호를 입력하고 자동 판별된 모델과 감시 설정을 확인하는 창"/>
+            <wp:docPr id="7" name="Picture 7" title="장비 관리 창" descr="장비명, IPv4, 계정 ID와 비밀번호를 입력하고 자동 판별된 모델과 감시 설정을 확인하는 창"/>
             <wp:cNvGraphicFramePr>
               <a:graphicFrameLocks noChangeAspect="1"/>
             </wp:cNvGraphicFramePr>
@@ -2976,7 +3083,7 @@
                     <pic:cNvPicPr/>
                   </pic:nvPicPr>
                   <pic:blipFill>
-                    <a:blip r:embed="rId18"/>
+                    <a:blip r:embed="rId19"/>
                     <a:stretch>
                       <a:fillRect/>
                     </a:stretch>
@@ -3000,7 +3107,7 @@
         <w:pStyle w:val="Caption"/>
       </w:pPr>
       <w:r>
-        <w:t>그림 6. Viewer가 보관하는 장비 및 계정 입력 화면</w:t>
+        <w:t>그림 7. Viewer가 보관하는 장비 및 계정 입력 화면</w:t>
       </w:r>
     </w:p>
     <w:p>
@@ -3805,7 +3912,7 @@
         <w:drawing>
           <wp:inline xmlns:a="http://schemas.openxmlformats.org/drawingml/2006/main" xmlns:pic="http://schemas.openxmlformats.org/drawingml/2006/picture">
             <wp:extent cx="3977639" cy="2486024"/>
-            <wp:docPr id="7" name="Picture 7" title="장비 명령 실행 화면" descr="show port status를 입력하고 데모 스위치의 익명화된 결과를 확인하는 장비 명령 탭"/>
+            <wp:docPr id="8" name="Picture 8" title="장비 명령 실행 화면" descr="show port status를 입력하고 데모 스위치의 익명화된 결과를 확인하는 장비 명령 탭"/>
             <wp:cNvGraphicFramePr>
               <a:graphicFrameLocks noChangeAspect="1"/>
             </wp:cNvGraphicFramePr>
@@ -3817,7 +3924,7 @@
                     <pic:cNvPicPr/>
                   </pic:nvPicPr>
                   <pic:blipFill>
-                    <a:blip r:embed="rId19"/>
+                    <a:blip r:embed="rId20"/>
                     <a:stretch>
                       <a:fillRect/>
                     </a:stretch>
@@ -3841,7 +3948,7 @@
         <w:pStyle w:val="Caption"/>
       </w:pPr>
       <w:r>
-        <w:t>그림 7. 한 줄 show 명령 실행과 메모리 내 결과 확인</w:t>
+        <w:t>그림 8. 한 줄 show 명령 실행과 메모리 내 결과 확인</w:t>
       </w:r>
     </w:p>
     <w:tbl>
@@ -4916,7 +5023,7 @@
         <w:drawing>
           <wp:inline xmlns:a="http://schemas.openxmlformats.org/drawingml/2006/main" xmlns:pic="http://schemas.openxmlformats.org/drawingml/2006/picture">
             <wp:extent cx="4754880" cy="2971800"/>
-            <wp:docPr id="8" name="Picture 8" title="Viewer 대시보드" descr="장비 목록, 선택 장비 상태, 최근 이벤트와 Viewer 감시 상태를 보여 주는 대시보드"/>
+            <wp:docPr id="9" name="Picture 9" title="Viewer 대시보드" descr="장비 목록, 선택 장비 상태, 최근 이벤트와 Viewer 감시 상태를 보여 주는 대시보드"/>
             <wp:cNvGraphicFramePr>
               <a:graphicFrameLocks noChangeAspect="1"/>
             </wp:cNvGraphicFramePr>
@@ -4928,7 +5035,7 @@
                     <pic:cNvPicPr/>
                   </pic:nvPicPr>
                   <pic:blipFill>
-                    <a:blip r:embed="rId20"/>
+                    <a:blip r:embed="rId21"/>
                     <a:stretch>
                       <a:fillRect/>
                     </a:stretch>
@@ -4952,7 +5059,7 @@
         <w:pStyle w:val="Caption"/>
       </w:pPr>
       <w:r>
-        <w:t>그림 8. Viewer 중심 대시보드 전체 화면</w:t>
+        <w:t>그림 9. Viewer 중심 대시보드 전체 화면</w:t>
       </w:r>
     </w:p>
     <w:tbl>
@@ -5453,7 +5560,7 @@
         <w:drawing>
           <wp:inline xmlns:a="http://schemas.openxmlformats.org/drawingml/2006/main" xmlns:pic="http://schemas.openxmlformats.org/drawingml/2006/picture">
             <wp:extent cx="2971800" cy="1556656"/>
-            <wp:docPr id="9" name="Picture 9" title="항상 위 미니 창" descr="정상, 경고, 장애 수와 최근 문제를 보여 주는 작은 항상 위 창"/>
+            <wp:docPr id="10" name="Picture 10" title="항상 위 미니 창" descr="정상, 경고, 장애 수와 최근 문제를 보여 주는 작은 항상 위 창"/>
             <wp:cNvGraphicFramePr>
               <a:graphicFrameLocks noChangeAspect="1"/>
             </wp:cNvGraphicFramePr>
@@ -5465,7 +5572,7 @@
                     <pic:cNvPicPr/>
                   </pic:nvPicPr>
                   <pic:blipFill>
-                    <a:blip r:embed="rId21"/>
+                    <a:blip r:embed="rId22"/>
                     <a:stretch>
                       <a:fillRect/>
                     </a:stretch>
@@ -5489,7 +5596,7 @@
         <w:pStyle w:val="Caption"/>
       </w:pPr>
       <w:r>
-        <w:t>그림 9. 반복 운영용 미니 창</w:t>
+        <w:t>그림 10. 반복 운영용 미니 창</w:t>
       </w:r>
     </w:p>
     <w:p>
@@ -5502,7 +5609,7 @@
         <w:drawing>
           <wp:inline xmlns:a="http://schemas.openxmlformats.org/drawingml/2006/main" xmlns:pic="http://schemas.openxmlformats.org/drawingml/2006/picture">
             <wp:extent cx="3154680" cy="1231827"/>
-            <wp:docPr id="10" name="Picture 10" title="장애 알림 팝업" descr="데모 업링크 포트 Down 장애와 발생 시각을 보여 주는 알림 팝업"/>
+            <wp:docPr id="11" name="Picture 11" title="장애 알림 팝업" descr="데모 업링크 포트 Down 장애와 발생 시각을 보여 주는 알림 팝업"/>
             <wp:cNvGraphicFramePr>
               <a:graphicFrameLocks noChangeAspect="1"/>
             </wp:cNvGraphicFramePr>
@@ -5514,7 +5621,7 @@
                     <pic:cNvPicPr/>
                   </pic:nvPicPr>
                   <pic:blipFill>
-                    <a:blip r:embed="rId22"/>
+                    <a:blip r:embed="rId23"/>
                     <a:stretch>
                       <a:fillRect/>
                     </a:stretch>
@@ -5538,7 +5645,7 @@
         <w:pStyle w:val="Caption"/>
       </w:pPr>
       <w:r>
-        <w:t>그림 10. 새 장애 알림 팝업</w:t>
+        <w:t>그림 11. 새 장애 알림 팝업</w:t>
       </w:r>
     </w:p>
     <w:p>
@@ -9129,6 +9236,118 @@
                 <w:rFonts w:ascii="맑은 고딕" w:hAnsi="맑은 고딕" w:eastAsia="맑은 고딕" w:cs="맑은 고딕"/>
                 <w:sz w:val="16"/>
               </w:rPr>
+              <w:t>Viewer format 3 복구 필요</w:t>
+            </w:r>
+          </w:p>
+        </w:tc>
+        <w:tc>
+          <w:tcPr>
+            <w:tcW w:type="dxa" w:w="5060"/>
+            <w:tcMar>
+              <w:top w:w="80" w:type="dxa"/>
+              <w:start w:w="120" w:type="dxa"/>
+              <w:bottom w:w="80" w:type="dxa"/>
+              <w:end w:w="120" w:type="dxa"/>
+            </w:tcMar>
+            <w:vAlign w:val="center"/>
+          </w:tcPr>
+          <w:p>
+            <w:pPr>
+              <w:spacing w:before="0" w:after="0" w:line="240" w:lineRule="auto"/>
+              <w:jc w:val="left"/>
+            </w:pPr>
+            <w:r>
+              <w:rPr>
+                <w:rFonts w:ascii="맑은 고딕" w:hAnsi="맑은 고딕" w:eastAsia="맑은 고딕" w:cs="맑은 고딕"/>
+                <w:sz w:val="16"/>
+              </w:rPr>
+              <w:t>v0.11.11 또는 더 최신 Viewer Setup으로 이전 상태 복구 완료 → 설치/업데이트 별도 실행 → 그 뒤에만 downgrade</w:t>
+            </w:r>
+          </w:p>
+        </w:tc>
+      </w:tr>
+      <w:tr>
+        <w:trPr>
+          <w:cantSplit w:val="1"/>
+        </w:trPr>
+        <w:tc>
+          <w:tcPr>
+            <w:tcW w:type="dxa" w:w="4300"/>
+            <w:shd w:fill="FAFBFC"/>
+            <w:tcMar>
+              <w:top w:w="80" w:type="dxa"/>
+              <w:start w:w="120" w:type="dxa"/>
+              <w:bottom w:w="80" w:type="dxa"/>
+              <w:end w:w="120" w:type="dxa"/>
+            </w:tcMar>
+            <w:vAlign w:val="center"/>
+          </w:tcPr>
+          <w:p>
+            <w:pPr>
+              <w:spacing w:before="0" w:after="0" w:line="240" w:lineRule="auto"/>
+              <w:jc w:val="left"/>
+            </w:pPr>
+            <w:r>
+              <w:rPr>
+                <w:rFonts w:ascii="맑은 고딕" w:hAnsi="맑은 고딕" w:eastAsia="맑은 고딕" w:cs="맑은 고딕"/>
+                <w:sz w:val="16"/>
+              </w:rPr>
+              <w:t>SWS1 지원 코드</w:t>
+            </w:r>
+          </w:p>
+        </w:tc>
+        <w:tc>
+          <w:tcPr>
+            <w:tcW w:type="dxa" w:w="5060"/>
+            <w:shd w:fill="FAFBFC"/>
+            <w:tcMar>
+              <w:top w:w="80" w:type="dxa"/>
+              <w:start w:w="120" w:type="dxa"/>
+              <w:bottom w:w="80" w:type="dxa"/>
+              <w:end w:w="120" w:type="dxa"/>
+            </w:tcMar>
+            <w:vAlign w:val="center"/>
+          </w:tcPr>
+          <w:p>
+            <w:pPr>
+              <w:spacing w:before="0" w:after="0" w:line="240" w:lineRule="auto"/>
+              <w:jc w:val="left"/>
+            </w:pPr>
+            <w:r>
+              <w:rPr>
+                <w:rFonts w:ascii="맑은 고딕" w:hAnsi="맑은 고딕" w:eastAsia="맑은 고딕" w:cs="맑은 고딕"/>
+                <w:sz w:val="16"/>
+              </w:rPr>
+              <w:t>Viewer Setup 실패 전용 코드만 전달 → 경로·사용자·해시·transaction ID·자격 증명·장비 정보는 포함되지 않음</w:t>
+            </w:r>
+          </w:p>
+        </w:tc>
+      </w:tr>
+      <w:tr>
+        <w:trPr>
+          <w:cantSplit w:val="1"/>
+        </w:trPr>
+        <w:tc>
+          <w:tcPr>
+            <w:tcW w:type="dxa" w:w="4300"/>
+            <w:tcMar>
+              <w:top w:w="80" w:type="dxa"/>
+              <w:start w:w="120" w:type="dxa"/>
+              <w:bottom w:w="80" w:type="dxa"/>
+              <w:end w:w="120" w:type="dxa"/>
+            </w:tcMar>
+            <w:vAlign w:val="center"/>
+          </w:tcPr>
+          <w:p>
+            <w:pPr>
+              <w:spacing w:before="0" w:after="0" w:line="240" w:lineRule="auto"/>
+              <w:jc w:val="left"/>
+            </w:pPr>
+            <w:r>
+              <w:rPr>
+                <w:rFonts w:ascii="맑은 고딕" w:hAnsi="맑은 고딕" w:eastAsia="맑은 고딕" w:cs="맑은 고딕"/>
+                <w:sz w:val="16"/>
+              </w:rPr>
               <w:t>TARGET_NOT_ALLOWED</w:t>
             </w:r>
           </w:p>
@@ -11293,7 +11512,7 @@
         <w:color w:val="64748B"/>
         <w:sz w:val="17"/>
       </w:rPr>
-      <w:t xml:space="preserve">v0.11.10-poc  |  </w:t>
+      <w:t xml:space="preserve">v0.11.11-poc  |  </w:t>
     </w:r>
     <w:r>
       <w:rPr>
@@ -11324,7 +11543,7 @@
         <w:color w:val="64748B"/>
         <w:sz w:val="17"/>
       </w:rPr>
-      <w:t>v0.11.10-poc  |  2026-08-13</w:t>
+      <w:t>v0.11.11-poc  |  2026-08-13</w:t>
     </w:r>
   </w:p>
 </w:ftr>

</xml_diff>

<commit_message>
docs: publish current paired Windows screens and verified manual
</commit_message>
<xml_diff>
--- a/docs/SamsungSwitchWatch_User_Manual_KO.docx
+++ b/docs/SamsungSwitchWatch_User_Manual_KO.docx
@@ -509,8 +509,37 @@
     </w:p>
     <w:p>
       <w:pPr>
+        <w:keepLines/>
+        <w:pageBreakBefore w:val="0"/>
+        <w:spacing w:before="80" w:after="160" w:line="283" w:lineRule="auto"/>
+        <w:ind w:left="115" w:right="58"/>
+        <w:shd w:fill="E8EEF5"/>
+        <w:pBdr>
+          <w:left w:val="single" w:sz="16" w:space="8" w:color="2E74B5"/>
+        </w:pBdr>
+      </w:pPr>
+      <w:r>
+        <w:rPr>
+          <w:rFonts w:ascii="Noto Sans KR" w:hAnsi="Noto Sans KR" w:eastAsia="Noto Sans KR" w:cs="Noto Sans KR"/>
+          <w:b/>
+          <w:color w:val="2E74B5"/>
+          <w:sz w:val="21"/>
+        </w:rPr>
+        <w:t xml:space="preserve">화면의 출처와 검증 범위  </w:t>
+      </w:r>
+      <w:r>
+        <w:rPr>
+          <w:rFonts w:ascii="Noto Sans KR" w:hAnsi="Noto Sans KR" w:eastAsia="Noto Sans KR" w:cs="Noto Sans KR"/>
+          <w:color w:val="16324F"/>
+          <w:sz w:val="21"/>
+        </w:rPr>
+        <w:t>이 설명서의 모든 그림은 0.13.0-poc 실제 WPF 창을 Windows runner에서 렌더링한 합성 예시입니다. 문서용 주소·계정·응답과 fake client/probe를 사용했으며 실제 스위치 접속이나 서비스 설치를 수행하지 않았습니다. 페어링 코드는 공개 fixture를 마스킹했습니다. UI 캡처 source SHA, 실행 URL과 PNG SHA-256은 docs/manual/images/capture-manifest.json에서 확인할 수 있습니다. 실제 설치·원격 연결·펌웨어 호환성은 별도 검증해야 합니다.</w:t>
+      </w:r>
+    </w:p>
+    <w:p>
+      <w:pPr>
         <w:pStyle w:val="Heading2"/>
-        <w:pageBreakBefore w:val="0"/>
+        <w:pageBreakBefore/>
       </w:pPr>
       <w:r>
         <w:rPr>
@@ -547,7 +576,7 @@
         <w:rPr>
           <w:rFonts w:ascii="Noto Sans KR" w:hAnsi="Noto Sans KR" w:eastAsia="Noto Sans KR" w:cs="Noto Sans KR"/>
         </w:rPr>
-        <w:t>Agent Setup에는 Viewer IP나 관리망 CIDR을 입력하지 않습니다. 설치 내용을 확인하고 '설치 / 업데이트'를 누릅니다.</w:t>
+        <w:t>Agent Setup에서 승인된 스위치 관리망 CIDR(한 줄에 하나, 최대 32개)을 확인한 뒤 '설치 / 업데이트'를 누릅니다.</w:t>
       </w:r>
     </w:p>
     <w:p>
@@ -1005,7 +1034,7 @@
                 <w:rFonts w:ascii="Noto Sans KR" w:hAnsi="Noto Sans KR" w:eastAsia="Noto Sans KR" w:cs="Noto Sans KR"/>
                 <w:sz w:val="18"/>
               </w:rPr>
-              <w:t>같은 RFC1918 사설 주소의 장비만 허용</w:t>
+              <w:t>설정된 허용 관리망 CIDR 안의 RFC1918 장비만 허용</w:t>
             </w:r>
           </w:p>
         </w:tc>
@@ -1173,7 +1202,7 @@
           <w:color w:val="16324F"/>
           <w:sz w:val="21"/>
         </w:rPr>
-        <w:t>0.12.0-poc는 코드 서명되지 않은 시험판입니다. 압축을 풀기 전에 Agent와 Viewer ZIP의 SHA-256을 해당 GitHub Release 본문에 표시된 값과 비교하고 사내 보안 반입 절차를 완료하세요. SmartScreen 또는 EDR 경고를 우회하지 않습니다.</w:t>
+        <w:t>0.13.0-poc는 코드 서명되지 않은 시험판입니다. 압축을 풀기 전에 Agent와 Viewer ZIP의 SHA-256을 해당 GitHub Release 본문에 표시된 값과 비교하고 사내 보안 반입 절차를 완료하세요. SmartScreen 또는 EDR 경고를 우회하지 않습니다.</w:t>
       </w:r>
     </w:p>
     <w:p>
@@ -1215,7 +1244,7 @@
         <w:rPr>
           <w:rFonts w:ascii="Noto Sans KR" w:hAnsi="Noto Sans KR" w:eastAsia="Noto Sans KR" w:cs="Noto Sans KR"/>
         </w:rPr>
-        <w:t>설치 내용을 확인합니다. Viewer와 스위치 허용 범위는 RFC1918 사설 대역으로 자동 적용되므로 별도 입력이 없습니다.</w:t>
+        <w:t>설치 내용과 허용할 스위치 관리망 CIDR을 확인합니다. 기본 RFC1918 범위를 승인된 관리 VLAN으로 좁히고 canonical 사설 CIDR을 한 줄에 하나씩 입력합니다.</w:t>
       </w:r>
     </w:p>
     <w:p>
@@ -1255,8 +1284,8 @@
       <w:r>
         <w:drawing>
           <wp:inline xmlns:a="http://schemas.openxmlformats.org/drawingml/2006/main" xmlns:pic="http://schemas.openxmlformats.org/drawingml/2006/picture">
-            <wp:extent cx="4114800" cy="3789947"/>
-            <wp:docPr id="1" name="Picture 1" title="Agent Setup 화면" descr="Viewer IP와 관리망 CIDR 입력 없이 설치 내용과 설치 버튼을 보여 주는 Agent Setup 화면"/>
+            <wp:extent cx="4114800" cy="4266398"/>
+            <wp:docPr id="1" name="Picture 1" title="Agent Setup 화면" descr="허용할 스위치 관리망 CIDR과 설치·페어링 버튼을 보여 주는 Agent Setup 합성 화면"/>
             <wp:cNvGraphicFramePr>
               <a:graphicFrameLocks noChangeAspect="1"/>
             </wp:cNvGraphicFramePr>
@@ -1276,7 +1305,7 @@
                   <pic:spPr>
                     <a:xfrm>
                       <a:off x="0" y="0"/>
-                      <a:ext cx="4114800" cy="3789947"/>
+                      <a:ext cx="4114800" cy="4266398"/>
                     </a:xfrm>
                     <a:prstGeom prst="rect"/>
                   </pic:spPr>
@@ -1292,7 +1321,7 @@
         <w:pStyle w:val="Caption"/>
       </w:pPr>
       <w:r>
-        <w:t>그림 1. 별도 네트워크 입력이 없는 Agent Setup 화면</w:t>
+        <w:t>그림 1. 관리망 CIDR을 확인하는 Agent Setup 합성 화면</w:t>
       </w:r>
     </w:p>
     <w:p>
@@ -1313,7 +1342,7 @@
           <w:color w:val="2E74B5"/>
           <w:sz w:val="21"/>
         </w:rPr>
-        <w:t xml:space="preserve">입력 없이 설치  </w:t>
+        <w:t xml:space="preserve">스위치 관리망을 확인한 뒤 설치  </w:t>
       </w:r>
       <w:r>
         <w:rPr>
@@ -1321,7 +1350,7 @@
           <w:color w:val="16324F"/>
           <w:sz w:val="21"/>
         </w:rPr>
-        <w:t>Setup은 제품 파일, Windows 서비스와 방화벽 규칙을 준비합니다. Viewer IP와 스위치 CIDR은 요구하지 않습니다. Agent는 10/8, 172.16/12, 192.168/16에서 들어오는 Viewer 요청과 같은 사설 대역의 Telnet/23 장비만 자동으로 허용합니다.</w:t>
+        <w:t>Setup은 제품 파일, Windows 서비스와 방화벽 규칙을 준비합니다. Viewer의 인바운드 경계와 스위치 대상 allowlist를 구분하세요. 스위치 관리망은 1~32개의 canonical RFC1918 CIDR로 입력하며, 빈 값·공인망·IPv6·host bit가 포함된 범위는 거부됩니다. 이 화면의 CIDR은 합성 예시입니다.</w:t>
       </w:r>
     </w:p>
     <w:p>
@@ -1333,7 +1362,7 @@
       <w:r>
         <w:drawing>
           <wp:inline xmlns:a="http://schemas.openxmlformats.org/drawingml/2006/main" xmlns:pic="http://schemas.openxmlformats.org/drawingml/2006/picture">
-            <wp:extent cx="4114800" cy="4872789"/>
+            <wp:extent cx="4114800" cy="4266398"/>
             <wp:docPr id="2" name="Picture 2" title="Agent Setup 복구 실패 화면" descr="복구 자료 정리가 끝나지 않아 설치를 계속 잠그고 작업 기록 보존, 복구 재시도와 익명 진단 저장을 안내하는 Agent Setup 화면"/>
             <wp:cNvGraphicFramePr>
               <a:graphicFrameLocks noChangeAspect="1"/>
@@ -1354,7 +1383,7 @@
                   <pic:spPr>
                     <a:xfrm>
                       <a:off x="0" y="0"/>
-                      <a:ext cx="4114800" cy="4872789"/>
+                      <a:ext cx="4114800" cy="4266398"/>
                     </a:xfrm>
                     <a:prstGeom prst="rect"/>
                   </pic:spPr>
@@ -1577,7 +1606,7 @@
           <w:color w:val="243447"/>
           <w:sz w:val="17"/>
         </w:rPr>
-        <w:t>장비 허용 범위        : 10/8, 172.16/12, 192.168/16 · Telnet/23</w:t>
+        <w:t>장비 허용 범위        : Setup에서 승인한 RFC1918 CIDR · Telnet/23</w:t>
       </w:r>
       <w:r>
         <w:br/>
@@ -2343,7 +2372,7 @@
           <w:color w:val="2E74B5"/>
           <w:sz w:val="21"/>
         </w:rPr>
-        <w:t xml:space="preserve">네트워크 정책은 자동 적용  </w:t>
+        <w:t xml:space="preserve">관리망 변경 시 허용 범위를 다시 확인  </w:t>
       </w:r>
       <w:r>
         <w:rPr>
@@ -2351,7 +2380,7 @@
           <w:color w:val="16324F"/>
           <w:sz w:val="21"/>
         </w:rPr>
-        <w:t>Viewer PC 주소나 스위치 관리망이 바뀌어도 CIDR을 다시 입력하지 않습니다. Viewer와 스위치가 10/8, 172.16/12 또는 192.168/16에 있고 Agent까지 라우팅 가능한지 확인합니다. 공인 주소와 그 밖의 특수 주소는 허용되지 않습니다.</w:t>
+        <w:t>스위치 관리망이 바뀌면 Agent Setup의 허용 대상 CIDR과 라우팅을 함께 확인합니다. 빈 기존 AllowedTargetCidrs는 업그레이드 호환을 위해 RFC1918 세 범위로 해석되므로 필요한 관리 VLAN만 허용하도록 범위를 좁히세요. Viewer는 별도로 SSW1 재페어링 여부를 확인합니다.</w:t>
       </w:r>
     </w:p>
     <w:p>
@@ -2395,7 +2424,7 @@
           <w:color w:val="16324F"/>
           <w:sz w:val="21"/>
         </w:rPr>
-        <w:t>Agent Setup에 AGENT_LOCAL_CONNECTION_UNCONFIRMED 또는 FIREWALL_REMOTE_ACCESS_UNCONFIRMED가 표시되면 Agent 서비스와 프로그램은 설치됐지만 연결 준비를 확인하지 못했다는 뜻입니다. Viewer에서 연결 테스트를 실행하고, TCP/18443이 실패할 때 Windows 관리자에게 확인하세요. 규칙을 AGENT_CONNECTION_REFUSED가 보이면 Viewer에 스위치 IP나 localhost가 아니라 Agent를 설치한 PC의 실제 주소를 입력했는지 먼저 확인하세요. 같은 PC 시험에서는 해당 PC의 사설 IPv4 또는 localhost를 사용할 수 있습니다. 그 다음 Windows 서비스에서 SamsungSwitchWatchAgent가 Running인지 확인하고 TCP/18443을 점검합니다. TCP 단계는 성공하고 HTTPS 단계가 실패하면 방화벽이 아니라 Agent PC의 로컬 HTTPS/TLS 준비 상태를 확인합니다. AGENT_CLIENT_NOT_ALLOWED이면 Viewer 주소가 RFC1918 사설 범위인지 확인합니다. 서비스를 수동 등록하지 말고 0.12.0-poc Agent Setup을 사용하세요.</w:t>
+        <w:t>Agent Setup에 AGENT_LOCAL_CONNECTION_UNCONFIRMED 또는 FIREWALL_REMOTE_ACCESS_UNCONFIRMED가 표시되면 Agent 서비스와 프로그램은 설치됐지만 연결 준비를 확인하지 못했다는 뜻입니다. Viewer에서 연결 테스트를 실행하고, TCP/18443이 실패할 때 Windows 관리자에게 확인하세요. 규칙을 AGENT_CONNECTION_REFUSED가 보이면 Viewer에 스위치 IP나 localhost가 아니라 Agent를 설치한 PC의 실제 주소를 입력했는지 먼저 확인하세요. 같은 PC 시험에서는 해당 PC의 사설 IPv4 또는 localhost를 사용할 수 있습니다. 그 다음 Windows 서비스에서 SamsungSwitchWatchAgent가 Running인지 확인하고 TCP/18443을 점검합니다. TCP 단계는 성공하고 HTTPS 단계가 실패하면 방화벽이 아니라 Agent PC의 로컬 HTTPS/TLS 준비 상태를 확인합니다. AGENT_CLIENT_NOT_ALLOWED이면 Viewer 주소가 RFC1918 사설 범위인지 확인합니다. 서비스를 수동 등록하지 말고 0.13.0-poc Agent Setup을 사용하세요.</w:t>
       </w:r>
     </w:p>
     <w:p>
@@ -2557,7 +2586,7 @@
           <w:color w:val="16324F"/>
           <w:sz w:val="21"/>
         </w:rPr>
-        <w:t>0.12.0-poc는 코드 서명되지 않아 SmartScreen이나 사내 EDR이 차단할 수 있습니다. ZIP을 완전히 압축 해제하고 Setup, Viewer EXE와 제공된 DLL이 같은 폴더에 있는지 확인하세요. EDR·AppLocker·WDAC가 차단하면 우회하지 말고 공식 ZIP의 버전·해시와 차단 기록을 보안 담당자에게 전달하세요.</w:t>
+        <w:t>0.13.0-poc는 코드 서명되지 않아 SmartScreen이나 사내 EDR이 차단할 수 있습니다. ZIP을 완전히 압축 해제하고 Setup, Viewer EXE와 제공된 DLL이 같은 폴더에 있는지 확인하세요. EDR·AppLocker·WDAC가 차단하면 우회하지 말고 공식 ZIP의 버전·해시와 차단 기록을 보안 담당자에게 전달하세요.</w:t>
       </w:r>
     </w:p>
     <w:p>
@@ -2795,8 +2824,57 @@
     </w:p>
     <w:p>
       <w:pPr>
+        <w:keepNext/>
+        <w:spacing w:before="80" w:after="0"/>
+        <w:jc w:val="center"/>
+      </w:pPr>
+      <w:r>
+        <w:drawing>
+          <wp:inline xmlns:a="http://schemas.openxmlformats.org/drawingml/2006/main" xmlns:pic="http://schemas.openxmlformats.org/drawingml/2006/picture">
+            <wp:extent cx="4114800" cy="4355358"/>
+            <wp:docPr id="5" name="Picture 5" title="Agent 페어링 연결 화면" descr="마스킹된 합성 페어링 코드, SPKI 고정과 API v5 전용 연결 안내"/>
+            <wp:cNvGraphicFramePr>
+              <a:graphicFrameLocks noChangeAspect="1"/>
+            </wp:cNvGraphicFramePr>
+            <a:graphic>
+              <a:graphicData uri="http://schemas.openxmlformats.org/drawingml/2006/picture">
+                <pic:pic>
+                  <pic:nvPicPr>
+                    <pic:cNvPr id="0" name="02-agent-connection.png"/>
+                    <pic:cNvPicPr/>
+                  </pic:nvPicPr>
+                  <pic:blipFill>
+                    <a:blip r:embed="rId17"/>
+                    <a:stretch>
+                      <a:fillRect/>
+                    </a:stretch>
+                  </pic:blipFill>
+                  <pic:spPr>
+                    <a:xfrm>
+                      <a:off x="0" y="0"/>
+                      <a:ext cx="4114800" cy="4355358"/>
+                    </a:xfrm>
+                    <a:prstGeom prst="rect"/>
+                  </pic:spPr>
+                </pic:pic>
+              </a:graphicData>
+            </a:graphic>
+          </wp:inline>
+        </w:drawing>
+      </w:r>
+    </w:p>
+    <w:p>
+      <w:pPr>
+        <w:pStyle w:val="Caption"/>
+      </w:pPr>
+      <w:r>
+        <w:t>그림 5. 페어링과 SPKI 고정을 안내하는 현재 연결 창</w:t>
+      </w:r>
+    </w:p>
+    <w:p>
+      <w:pPr>
         <w:pStyle w:val="Heading3"/>
-        <w:pageBreakBefore w:val="0"/>
+        <w:pageBreakBefore/>
       </w:pPr>
       <w:r>
         <w:rPr>
@@ -2806,6 +2884,55 @@
           <w:sz w:val="24"/>
         </w:rPr>
         <w:t>연결 실패 화면과 확인 순서</w:t>
+      </w:r>
+    </w:p>
+    <w:p>
+      <w:pPr>
+        <w:keepNext/>
+        <w:spacing w:before="80" w:after="0"/>
+        <w:jc w:val="center"/>
+      </w:pPr>
+      <w:r>
+        <w:drawing>
+          <wp:inline xmlns:a="http://schemas.openxmlformats.org/drawingml/2006/main" xmlns:pic="http://schemas.openxmlformats.org/drawingml/2006/picture">
+            <wp:extent cx="3657600" cy="3871429"/>
+            <wp:docPr id="6" name="Picture 6" title="Agent 연결 실패 단계" descr="아래로 스크롤한 실제 연결 창에서 TCP 18443 실패와 이후 미수행 단계를 표시"/>
+            <wp:cNvGraphicFramePr>
+              <a:graphicFrameLocks noChangeAspect="1"/>
+            </wp:cNvGraphicFramePr>
+            <a:graphic>
+              <a:graphicData uri="http://schemas.openxmlformats.org/drawingml/2006/picture">
+                <pic:pic>
+                  <pic:nvPicPr>
+                    <pic:cNvPr id="0" name="02-agent-connection-failed.png"/>
+                    <pic:cNvPicPr/>
+                  </pic:nvPicPr>
+                  <pic:blipFill>
+                    <a:blip r:embed="rId18"/>
+                    <a:stretch>
+                      <a:fillRect/>
+                    </a:stretch>
+                  </pic:blipFill>
+                  <pic:spPr>
+                    <a:xfrm>
+                      <a:off x="0" y="0"/>
+                      <a:ext cx="3657600" cy="3871429"/>
+                    </a:xfrm>
+                    <a:prstGeom prst="rect"/>
+                  </pic:spPr>
+                </pic:pic>
+              </a:graphicData>
+            </a:graphic>
+          </wp:inline>
+        </w:drawing>
+      </w:r>
+    </w:p>
+    <w:p>
+      <w:pPr>
+        <w:pStyle w:val="Caption"/>
+      </w:pPr>
+      <w:r>
+        <w:t>그림 6. TCP 실패와 이후 미수행 단계의 합성 재현</w:t>
       </w:r>
     </w:p>
     <w:p>
@@ -3002,8 +3129,8 @@
       <w:r>
         <w:drawing>
           <wp:inline xmlns:a="http://schemas.openxmlformats.org/drawingml/2006/main" xmlns:pic="http://schemas.openxmlformats.org/drawingml/2006/picture">
-            <wp:extent cx="5029200" cy="3540967"/>
-            <wp:docPr id="5" name="Picture 5" title="장비 관리 창" descr="장비명, IPv4, 계정 ID와 비밀번호를 입력하고 자동 판별된 모델과 감시 설정을 확인하는 창"/>
+            <wp:extent cx="5029200" cy="3530704"/>
+            <wp:docPr id="7" name="Picture 7" title="장비 관리 창" descr="장비명, IPv4, 계정 ID와 비밀번호를 입력하고 자동 판별된 모델과 감시 설정을 확인하는 창"/>
             <wp:cNvGraphicFramePr>
               <a:graphicFrameLocks noChangeAspect="1"/>
             </wp:cNvGraphicFramePr>
@@ -3015,7 +3142,7 @@
                     <pic:cNvPicPr/>
                   </pic:nvPicPr>
                   <pic:blipFill>
-                    <a:blip r:embed="rId17"/>
+                    <a:blip r:embed="rId19"/>
                     <a:stretch>
                       <a:fillRect/>
                     </a:stretch>
@@ -3023,7 +3150,7 @@
                   <pic:spPr>
                     <a:xfrm>
                       <a:off x="0" y="0"/>
-                      <a:ext cx="5029200" cy="3540967"/>
+                      <a:ext cx="5029200" cy="3530704"/>
                     </a:xfrm>
                     <a:prstGeom prst="rect"/>
                   </pic:spPr>
@@ -3437,7 +3564,7 @@
                 <w:rFonts w:ascii="Noto Sans KR" w:hAnsi="Noto Sans KR" w:eastAsia="Noto Sans KR" w:cs="Noto Sans KR"/>
                 <w:sz w:val="18"/>
               </w:rPr>
-              <w:t>10/8, 172.16/12 또는 192.168/16의 스위치 관리 IPv4</w:t>
+              <w:t>Agent Setup에서 허용한 CIDR 안의 RFC1918 스위치 관리 IPv4</w:t>
             </w:r>
           </w:p>
         </w:tc>
@@ -3843,8 +3970,8 @@
       <w:r>
         <w:drawing>
           <wp:inline xmlns:a="http://schemas.openxmlformats.org/drawingml/2006/main" xmlns:pic="http://schemas.openxmlformats.org/drawingml/2006/picture">
-            <wp:extent cx="3977639" cy="2486024"/>
-            <wp:docPr id="6" name="Picture 6" title="장비 명령 실행 화면" descr="show port status를 입력하고 데모 스위치의 익명화된 결과를 확인하는 장비 명령 탭"/>
+            <wp:extent cx="3977639" cy="2448734"/>
+            <wp:docPr id="8" name="Picture 8" title="장비 명령 실행 화면" descr="show port status를 입력하고 데모 스위치의 익명화된 결과를 확인하는 장비 명령 탭"/>
             <wp:cNvGraphicFramePr>
               <a:graphicFrameLocks noChangeAspect="1"/>
             </wp:cNvGraphicFramePr>
@@ -3856,7 +3983,7 @@
                     <pic:cNvPicPr/>
                   </pic:nvPicPr>
                   <pic:blipFill>
-                    <a:blip r:embed="rId18"/>
+                    <a:blip r:embed="rId20"/>
                     <a:stretch>
                       <a:fillRect/>
                     </a:stretch>
@@ -3864,7 +3991,7 @@
                   <pic:spPr>
                     <a:xfrm>
                       <a:off x="0" y="0"/>
-                      <a:ext cx="3977639" cy="2486024"/>
+                      <a:ext cx="3977639" cy="2448734"/>
                     </a:xfrm>
                     <a:prstGeom prst="rect"/>
                   </pic:spPr>
@@ -5162,8 +5289,8 @@
       <w:r>
         <w:drawing>
           <wp:inline xmlns:a="http://schemas.openxmlformats.org/drawingml/2006/main" xmlns:pic="http://schemas.openxmlformats.org/drawingml/2006/picture">
-            <wp:extent cx="4754880" cy="2971800"/>
-            <wp:docPr id="7" name="Picture 7" title="Viewer 대시보드" descr="장비 목록, 선택 장비 상태, 최근 이벤트와 Viewer 감시 상태를 보여 주는 대시보드"/>
+            <wp:extent cx="4754880" cy="2927223"/>
+            <wp:docPr id="9" name="Picture 9" title="Viewer 대시보드" descr="장비 목록, 선택 장비 상태, 최근 이벤트와 Viewer 감시 상태를 보여 주는 대시보드"/>
             <wp:cNvGraphicFramePr>
               <a:graphicFrameLocks noChangeAspect="1"/>
             </wp:cNvGraphicFramePr>
@@ -5175,7 +5302,7 @@
                     <pic:cNvPicPr/>
                   </pic:nvPicPr>
                   <pic:blipFill>
-                    <a:blip r:embed="rId19"/>
+                    <a:blip r:embed="rId21"/>
                     <a:stretch>
                       <a:fillRect/>
                     </a:stretch>
@@ -5183,7 +5310,7 @@
                   <pic:spPr>
                     <a:xfrm>
                       <a:off x="0" y="0"/>
-                      <a:ext cx="4754880" cy="2971800"/>
+                      <a:ext cx="4754880" cy="2927223"/>
                     </a:xfrm>
                     <a:prstGeom prst="rect"/>
                   </pic:spPr>
@@ -5700,7 +5827,7 @@
         <w:drawing>
           <wp:inline xmlns:a="http://schemas.openxmlformats.org/drawingml/2006/main" xmlns:pic="http://schemas.openxmlformats.org/drawingml/2006/picture">
             <wp:extent cx="2971800" cy="1556656"/>
-            <wp:docPr id="8" name="Picture 8" title="항상 위 미니 창" descr="정상, 경고, 장애 수와 최근 문제를 보여 주는 작은 항상 위 창"/>
+            <wp:docPr id="10" name="Picture 10" title="항상 위 미니 창" descr="정상, 경고, 장애 수와 최근 문제를 보여 주는 작은 항상 위 창"/>
             <wp:cNvGraphicFramePr>
               <a:graphicFrameLocks noChangeAspect="1"/>
             </wp:cNvGraphicFramePr>
@@ -5712,7 +5839,7 @@
                     <pic:cNvPicPr/>
                   </pic:nvPicPr>
                   <pic:blipFill>
-                    <a:blip r:embed="rId20"/>
+                    <a:blip r:embed="rId22"/>
                     <a:stretch>
                       <a:fillRect/>
                     </a:stretch>
@@ -5749,7 +5876,7 @@
         <w:drawing>
           <wp:inline xmlns:a="http://schemas.openxmlformats.org/drawingml/2006/main" xmlns:pic="http://schemas.openxmlformats.org/drawingml/2006/picture">
             <wp:extent cx="3154680" cy="1231827"/>
-            <wp:docPr id="9" name="Picture 9" title="장애 알림 팝업" descr="데모 업링크 포트 Down 장애와 발생 시각을 보여 주는 알림 팝업"/>
+            <wp:docPr id="11" name="Picture 11" title="장애 알림 팝업" descr="데모 업링크 포트 Down 장애와 발생 시각을 보여 주는 알림 팝업"/>
             <wp:cNvGraphicFramePr>
               <a:graphicFrameLocks noChangeAspect="1"/>
             </wp:cNvGraphicFramePr>
@@ -5761,7 +5888,7 @@
                     <pic:cNvPicPr/>
                   </pic:nvPicPr>
                   <pic:blipFill>
-                    <a:blip r:embed="rId21"/>
+                    <a:blip r:embed="rId23"/>
                     <a:stretch>
                       <a:fillRect/>
                     </a:stretch>
@@ -6801,7 +6928,7 @@
           <w:rFonts w:ascii="Noto Sans KR" w:hAnsi="Noto Sans KR" w:eastAsia="Noto Sans KR" w:cs="Noto Sans KR"/>
           <w:sz w:val="22"/>
         </w:rPr>
-        <w:t>제품 방화벽 규칙은 RFC1918 사설 Viewer 주소를 허용하고 Agent 업무 API v5는 bearer를 추가로 요구합니다. Agent는 RFC1918 사설 장비의 Telnet/23만 사용합니다.</w:t>
+        <w:t>제품 방화벽 규칙은 RFC1918 사설 Viewer 주소를 허용하고 Agent 업무 API v5는 bearer를 추가로 요구합니다. Agent는 설정된 허용 관리망 CIDR 안의 RFC1918 사설 장비에만 Telnet/23을 사용합니다.</w:t>
       </w:r>
     </w:p>
     <w:p>
@@ -9650,7 +9777,7 @@
                 <w:rFonts w:ascii="Noto Sans KR" w:hAnsi="Noto Sans KR" w:eastAsia="Noto Sans KR" w:cs="Noto Sans KR"/>
                 <w:sz w:val="16"/>
               </w:rPr>
-              <w:t>v0.12.0-poc 또는 더 최신 Viewer Setup으로 이전 상태 복구 완료 → 설치/업데이트 별도 실행 → 그 뒤에만 downgrade</w:t>
+              <w:t>v0.13.0-poc 또는 더 최신 Viewer Setup으로 이전 상태 복구 완료 → 설치/업데이트 별도 실행 → 그 뒤에만 downgrade</w:t>
             </w:r>
           </w:p>
         </w:tc>
@@ -9762,7 +9889,7 @@
                 <w:rFonts w:ascii="Noto Sans KR" w:hAnsi="Noto Sans KR" w:eastAsia="Noto Sans KR" w:cs="Noto Sans KR"/>
                 <w:sz w:val="16"/>
               </w:rPr>
-              <w:t>장비 IPv4가 10/8, 172.16/12 또는 192.168/16인지 확인</w:t>
+              <w:t>장비 IPv4가 RFC1918이고 Agent Setup의 허용 대상 CIDR에 포함되는지 확인</w:t>
             </w:r>
           </w:p>
         </w:tc>
@@ -11623,7 +11750,7 @@
     <w:p>
       <w:pPr>
         <w:pStyle w:val="Heading1"/>
-        <w:pageBreakBefore w:val="0"/>
+        <w:pageBreakBefore/>
         <w:numPr>
           <w:ilvl w:val="0"/>
           <w:numId w:val="11"/>
@@ -11683,7 +11810,7 @@
         <w:rPr>
           <w:rFonts w:ascii="Noto Sans KR" w:hAnsi="Noto Sans KR" w:eastAsia="Noto Sans KR" w:cs="Noto Sans KR"/>
         </w:rPr>
-        <w:t>Agent PC에서 SamsungSwitchWatch.Agent.Setup.exe를 실행합니다. 입력 없이 설치/업데이트를 진행합니다.</w:t>
+        <w:t>Agent PC에서 SamsungSwitchWatch.Agent.Setup.exe를 실행합니다. 승인된 스위치 관리망 CIDR을 확인한 뒤 설치/업데이트하고 새 SSW1 코드로 Viewer를 페어링합니다.</w:t>
       </w:r>
     </w:p>
     <w:p>
@@ -11901,7 +12028,7 @@
         <w:color w:val="64748B"/>
         <w:sz w:val="17"/>
       </w:rPr>
-      <w:t xml:space="preserve">v0.12.0-poc  |  </w:t>
+      <w:t xml:space="preserve">v0.13.0-poc  |  </w:t>
     </w:r>
     <w:r>
       <w:rPr>
@@ -11932,7 +12059,7 @@
         <w:color w:val="64748B"/>
         <w:sz w:val="17"/>
       </w:rPr>
-      <w:t>v0.12.0-poc  |  2026-08-24</w:t>
+      <w:t>v0.13.0-poc  |  2026-09-08</w:t>
     </w:r>
   </w:p>
 </w:ftr>

</xml_diff>

<commit_message>
docs: refresh paired Windows UI gallery and manual (#72)
* docs: make current WPF usage captures reproducible

* build: align capture tool lock with current Viewer dependencies

* build: preserve declared package range in capture lock

* docs: render full WPF content on small CI desktops

* docs: preserve WPF background and full capture layout

* docs: retain window data context and capture failure details

* docs: keep synthetic event age meaningful in regenerated captures

* docs: publish current paired Windows screens and verified manual
</commit_message>
<xml_diff>
--- a/docs/SamsungSwitchWatch_User_Manual_KO.docx
+++ b/docs/SamsungSwitchWatch_User_Manual_KO.docx
@@ -509,8 +509,37 @@
     </w:p>
     <w:p>
       <w:pPr>
+        <w:keepLines/>
+        <w:pageBreakBefore w:val="0"/>
+        <w:spacing w:before="80" w:after="160" w:line="283" w:lineRule="auto"/>
+        <w:ind w:left="115" w:right="58"/>
+        <w:shd w:fill="E8EEF5"/>
+        <w:pBdr>
+          <w:left w:val="single" w:sz="16" w:space="8" w:color="2E74B5"/>
+        </w:pBdr>
+      </w:pPr>
+      <w:r>
+        <w:rPr>
+          <w:rFonts w:ascii="Noto Sans KR" w:hAnsi="Noto Sans KR" w:eastAsia="Noto Sans KR" w:cs="Noto Sans KR"/>
+          <w:b/>
+          <w:color w:val="2E74B5"/>
+          <w:sz w:val="21"/>
+        </w:rPr>
+        <w:t xml:space="preserve">화면의 출처와 검증 범위  </w:t>
+      </w:r>
+      <w:r>
+        <w:rPr>
+          <w:rFonts w:ascii="Noto Sans KR" w:hAnsi="Noto Sans KR" w:eastAsia="Noto Sans KR" w:cs="Noto Sans KR"/>
+          <w:color w:val="16324F"/>
+          <w:sz w:val="21"/>
+        </w:rPr>
+        <w:t>이 설명서의 모든 그림은 0.13.0-poc 실제 WPF 창을 Windows runner에서 렌더링한 합성 예시입니다. 문서용 주소·계정·응답과 fake client/probe를 사용했으며 실제 스위치 접속이나 서비스 설치를 수행하지 않았습니다. 페어링 코드는 공개 fixture를 마스킹했습니다. UI 캡처 source SHA, 실행 URL과 PNG SHA-256은 docs/manual/images/capture-manifest.json에서 확인할 수 있습니다. 실제 설치·원격 연결·펌웨어 호환성은 별도 검증해야 합니다.</w:t>
+      </w:r>
+    </w:p>
+    <w:p>
+      <w:pPr>
         <w:pStyle w:val="Heading2"/>
-        <w:pageBreakBefore w:val="0"/>
+        <w:pageBreakBefore/>
       </w:pPr>
       <w:r>
         <w:rPr>
@@ -547,7 +576,7 @@
         <w:rPr>
           <w:rFonts w:ascii="Noto Sans KR" w:hAnsi="Noto Sans KR" w:eastAsia="Noto Sans KR" w:cs="Noto Sans KR"/>
         </w:rPr>
-        <w:t>Agent Setup에는 Viewer IP나 관리망 CIDR을 입력하지 않습니다. 설치 내용을 확인하고 '설치 / 업데이트'를 누릅니다.</w:t>
+        <w:t>Agent Setup에서 승인된 스위치 관리망 CIDR(한 줄에 하나, 최대 32개)을 확인한 뒤 '설치 / 업데이트'를 누릅니다.</w:t>
       </w:r>
     </w:p>
     <w:p>
@@ -1005,7 +1034,7 @@
                 <w:rFonts w:ascii="Noto Sans KR" w:hAnsi="Noto Sans KR" w:eastAsia="Noto Sans KR" w:cs="Noto Sans KR"/>
                 <w:sz w:val="18"/>
               </w:rPr>
-              <w:t>같은 RFC1918 사설 주소의 장비만 허용</w:t>
+              <w:t>설정된 허용 관리망 CIDR 안의 RFC1918 장비만 허용</w:t>
             </w:r>
           </w:p>
         </w:tc>
@@ -1173,7 +1202,7 @@
           <w:color w:val="16324F"/>
           <w:sz w:val="21"/>
         </w:rPr>
-        <w:t>0.12.0-poc는 코드 서명되지 않은 시험판입니다. 압축을 풀기 전에 Agent와 Viewer ZIP의 SHA-256을 해당 GitHub Release 본문에 표시된 값과 비교하고 사내 보안 반입 절차를 완료하세요. SmartScreen 또는 EDR 경고를 우회하지 않습니다.</w:t>
+        <w:t>0.13.0-poc는 코드 서명되지 않은 시험판입니다. 압축을 풀기 전에 Agent와 Viewer ZIP의 SHA-256을 해당 GitHub Release 본문에 표시된 값과 비교하고 사내 보안 반입 절차를 완료하세요. SmartScreen 또는 EDR 경고를 우회하지 않습니다.</w:t>
       </w:r>
     </w:p>
     <w:p>
@@ -1215,7 +1244,7 @@
         <w:rPr>
           <w:rFonts w:ascii="Noto Sans KR" w:hAnsi="Noto Sans KR" w:eastAsia="Noto Sans KR" w:cs="Noto Sans KR"/>
         </w:rPr>
-        <w:t>설치 내용을 확인합니다. Viewer와 스위치 허용 범위는 RFC1918 사설 대역으로 자동 적용되므로 별도 입력이 없습니다.</w:t>
+        <w:t>설치 내용과 허용할 스위치 관리망 CIDR을 확인합니다. 기본 RFC1918 범위를 승인된 관리 VLAN으로 좁히고 canonical 사설 CIDR을 한 줄에 하나씩 입력합니다.</w:t>
       </w:r>
     </w:p>
     <w:p>
@@ -1255,8 +1284,8 @@
       <w:r>
         <w:drawing>
           <wp:inline xmlns:a="http://schemas.openxmlformats.org/drawingml/2006/main" xmlns:pic="http://schemas.openxmlformats.org/drawingml/2006/picture">
-            <wp:extent cx="4114800" cy="3789947"/>
-            <wp:docPr id="1" name="Picture 1" title="Agent Setup 화면" descr="Viewer IP와 관리망 CIDR 입력 없이 설치 내용과 설치 버튼을 보여 주는 Agent Setup 화면"/>
+            <wp:extent cx="4114800" cy="4266398"/>
+            <wp:docPr id="1" name="Picture 1" title="Agent Setup 화면" descr="허용할 스위치 관리망 CIDR과 설치·페어링 버튼을 보여 주는 Agent Setup 합성 화면"/>
             <wp:cNvGraphicFramePr>
               <a:graphicFrameLocks noChangeAspect="1"/>
             </wp:cNvGraphicFramePr>
@@ -1276,7 +1305,7 @@
                   <pic:spPr>
                     <a:xfrm>
                       <a:off x="0" y="0"/>
-                      <a:ext cx="4114800" cy="3789947"/>
+                      <a:ext cx="4114800" cy="4266398"/>
                     </a:xfrm>
                     <a:prstGeom prst="rect"/>
                   </pic:spPr>
@@ -1292,7 +1321,7 @@
         <w:pStyle w:val="Caption"/>
       </w:pPr>
       <w:r>
-        <w:t>그림 1. 별도 네트워크 입력이 없는 Agent Setup 화면</w:t>
+        <w:t>그림 1. 관리망 CIDR을 확인하는 Agent Setup 합성 화면</w:t>
       </w:r>
     </w:p>
     <w:p>
@@ -1313,7 +1342,7 @@
           <w:color w:val="2E74B5"/>
           <w:sz w:val="21"/>
         </w:rPr>
-        <w:t xml:space="preserve">입력 없이 설치  </w:t>
+        <w:t xml:space="preserve">스위치 관리망을 확인한 뒤 설치  </w:t>
       </w:r>
       <w:r>
         <w:rPr>
@@ -1321,7 +1350,7 @@
           <w:color w:val="16324F"/>
           <w:sz w:val="21"/>
         </w:rPr>
-        <w:t>Setup은 제품 파일, Windows 서비스와 방화벽 규칙을 준비합니다. Viewer IP와 스위치 CIDR은 요구하지 않습니다. Agent는 10/8, 172.16/12, 192.168/16에서 들어오는 Viewer 요청과 같은 사설 대역의 Telnet/23 장비만 자동으로 허용합니다.</w:t>
+        <w:t>Setup은 제품 파일, Windows 서비스와 방화벽 규칙을 준비합니다. Viewer의 인바운드 경계와 스위치 대상 allowlist를 구분하세요. 스위치 관리망은 1~32개의 canonical RFC1918 CIDR로 입력하며, 빈 값·공인망·IPv6·host bit가 포함된 범위는 거부됩니다. 이 화면의 CIDR은 합성 예시입니다.</w:t>
       </w:r>
     </w:p>
     <w:p>
@@ -1333,7 +1362,7 @@
       <w:r>
         <w:drawing>
           <wp:inline xmlns:a="http://schemas.openxmlformats.org/drawingml/2006/main" xmlns:pic="http://schemas.openxmlformats.org/drawingml/2006/picture">
-            <wp:extent cx="4114800" cy="4872789"/>
+            <wp:extent cx="4114800" cy="4266398"/>
             <wp:docPr id="2" name="Picture 2" title="Agent Setup 복구 실패 화면" descr="복구 자료 정리가 끝나지 않아 설치를 계속 잠그고 작업 기록 보존, 복구 재시도와 익명 진단 저장을 안내하는 Agent Setup 화면"/>
             <wp:cNvGraphicFramePr>
               <a:graphicFrameLocks noChangeAspect="1"/>
@@ -1354,7 +1383,7 @@
                   <pic:spPr>
                     <a:xfrm>
                       <a:off x="0" y="0"/>
-                      <a:ext cx="4114800" cy="4872789"/>
+                      <a:ext cx="4114800" cy="4266398"/>
                     </a:xfrm>
                     <a:prstGeom prst="rect"/>
                   </pic:spPr>
@@ -1577,7 +1606,7 @@
           <w:color w:val="243447"/>
           <w:sz w:val="17"/>
         </w:rPr>
-        <w:t>장비 허용 범위        : 10/8, 172.16/12, 192.168/16 · Telnet/23</w:t>
+        <w:t>장비 허용 범위        : Setup에서 승인한 RFC1918 CIDR · Telnet/23</w:t>
       </w:r>
       <w:r>
         <w:br/>
@@ -2343,7 +2372,7 @@
           <w:color w:val="2E74B5"/>
           <w:sz w:val="21"/>
         </w:rPr>
-        <w:t xml:space="preserve">네트워크 정책은 자동 적용  </w:t>
+        <w:t xml:space="preserve">관리망 변경 시 허용 범위를 다시 확인  </w:t>
       </w:r>
       <w:r>
         <w:rPr>
@@ -2351,7 +2380,7 @@
           <w:color w:val="16324F"/>
           <w:sz w:val="21"/>
         </w:rPr>
-        <w:t>Viewer PC 주소나 스위치 관리망이 바뀌어도 CIDR을 다시 입력하지 않습니다. Viewer와 스위치가 10/8, 172.16/12 또는 192.168/16에 있고 Agent까지 라우팅 가능한지 확인합니다. 공인 주소와 그 밖의 특수 주소는 허용되지 않습니다.</w:t>
+        <w:t>스위치 관리망이 바뀌면 Agent Setup의 허용 대상 CIDR과 라우팅을 함께 확인합니다. 빈 기존 AllowedTargetCidrs는 업그레이드 호환을 위해 RFC1918 세 범위로 해석되므로 필요한 관리 VLAN만 허용하도록 범위를 좁히세요. Viewer는 별도로 SSW1 재페어링 여부를 확인합니다.</w:t>
       </w:r>
     </w:p>
     <w:p>
@@ -2395,7 +2424,7 @@
           <w:color w:val="16324F"/>
           <w:sz w:val="21"/>
         </w:rPr>
-        <w:t>Agent Setup에 AGENT_LOCAL_CONNECTION_UNCONFIRMED 또는 FIREWALL_REMOTE_ACCESS_UNCONFIRMED가 표시되면 Agent 서비스와 프로그램은 설치됐지만 연결 준비를 확인하지 못했다는 뜻입니다. Viewer에서 연결 테스트를 실행하고, TCP/18443이 실패할 때 Windows 관리자에게 확인하세요. 규칙을 AGENT_CONNECTION_REFUSED가 보이면 Viewer에 스위치 IP나 localhost가 아니라 Agent를 설치한 PC의 실제 주소를 입력했는지 먼저 확인하세요. 같은 PC 시험에서는 해당 PC의 사설 IPv4 또는 localhost를 사용할 수 있습니다. 그 다음 Windows 서비스에서 SamsungSwitchWatchAgent가 Running인지 확인하고 TCP/18443을 점검합니다. TCP 단계는 성공하고 HTTPS 단계가 실패하면 방화벽이 아니라 Agent PC의 로컬 HTTPS/TLS 준비 상태를 확인합니다. AGENT_CLIENT_NOT_ALLOWED이면 Viewer 주소가 RFC1918 사설 범위인지 확인합니다. 서비스를 수동 등록하지 말고 0.12.0-poc Agent Setup을 사용하세요.</w:t>
+        <w:t>Agent Setup에 AGENT_LOCAL_CONNECTION_UNCONFIRMED 또는 FIREWALL_REMOTE_ACCESS_UNCONFIRMED가 표시되면 Agent 서비스와 프로그램은 설치됐지만 연결 준비를 확인하지 못했다는 뜻입니다. Viewer에서 연결 테스트를 실행하고, TCP/18443이 실패할 때 Windows 관리자에게 확인하세요. 규칙을 AGENT_CONNECTION_REFUSED가 보이면 Viewer에 스위치 IP나 localhost가 아니라 Agent를 설치한 PC의 실제 주소를 입력했는지 먼저 확인하세요. 같은 PC 시험에서는 해당 PC의 사설 IPv4 또는 localhost를 사용할 수 있습니다. 그 다음 Windows 서비스에서 SamsungSwitchWatchAgent가 Running인지 확인하고 TCP/18443을 점검합니다. TCP 단계는 성공하고 HTTPS 단계가 실패하면 방화벽이 아니라 Agent PC의 로컬 HTTPS/TLS 준비 상태를 확인합니다. AGENT_CLIENT_NOT_ALLOWED이면 Viewer 주소가 RFC1918 사설 범위인지 확인합니다. 서비스를 수동 등록하지 말고 0.13.0-poc Agent Setup을 사용하세요.</w:t>
       </w:r>
     </w:p>
     <w:p>
@@ -2557,7 +2586,7 @@
           <w:color w:val="16324F"/>
           <w:sz w:val="21"/>
         </w:rPr>
-        <w:t>0.12.0-poc는 코드 서명되지 않아 SmartScreen이나 사내 EDR이 차단할 수 있습니다. ZIP을 완전히 압축 해제하고 Setup, Viewer EXE와 제공된 DLL이 같은 폴더에 있는지 확인하세요. EDR·AppLocker·WDAC가 차단하면 우회하지 말고 공식 ZIP의 버전·해시와 차단 기록을 보안 담당자에게 전달하세요.</w:t>
+        <w:t>0.13.0-poc는 코드 서명되지 않아 SmartScreen이나 사내 EDR이 차단할 수 있습니다. ZIP을 완전히 압축 해제하고 Setup, Viewer EXE와 제공된 DLL이 같은 폴더에 있는지 확인하세요. EDR·AppLocker·WDAC가 차단하면 우회하지 말고 공식 ZIP의 버전·해시와 차단 기록을 보안 담당자에게 전달하세요.</w:t>
       </w:r>
     </w:p>
     <w:p>
@@ -2795,8 +2824,57 @@
     </w:p>
     <w:p>
       <w:pPr>
+        <w:keepNext/>
+        <w:spacing w:before="80" w:after="0"/>
+        <w:jc w:val="center"/>
+      </w:pPr>
+      <w:r>
+        <w:drawing>
+          <wp:inline xmlns:a="http://schemas.openxmlformats.org/drawingml/2006/main" xmlns:pic="http://schemas.openxmlformats.org/drawingml/2006/picture">
+            <wp:extent cx="4114800" cy="4355358"/>
+            <wp:docPr id="5" name="Picture 5" title="Agent 페어링 연결 화면" descr="마스킹된 합성 페어링 코드, SPKI 고정과 API v5 전용 연결 안내"/>
+            <wp:cNvGraphicFramePr>
+              <a:graphicFrameLocks noChangeAspect="1"/>
+            </wp:cNvGraphicFramePr>
+            <a:graphic>
+              <a:graphicData uri="http://schemas.openxmlformats.org/drawingml/2006/picture">
+                <pic:pic>
+                  <pic:nvPicPr>
+                    <pic:cNvPr id="0" name="02-agent-connection.png"/>
+                    <pic:cNvPicPr/>
+                  </pic:nvPicPr>
+                  <pic:blipFill>
+                    <a:blip r:embed="rId17"/>
+                    <a:stretch>
+                      <a:fillRect/>
+                    </a:stretch>
+                  </pic:blipFill>
+                  <pic:spPr>
+                    <a:xfrm>
+                      <a:off x="0" y="0"/>
+                      <a:ext cx="4114800" cy="4355358"/>
+                    </a:xfrm>
+                    <a:prstGeom prst="rect"/>
+                  </pic:spPr>
+                </pic:pic>
+              </a:graphicData>
+            </a:graphic>
+          </wp:inline>
+        </w:drawing>
+      </w:r>
+    </w:p>
+    <w:p>
+      <w:pPr>
+        <w:pStyle w:val="Caption"/>
+      </w:pPr>
+      <w:r>
+        <w:t>그림 5. 페어링과 SPKI 고정을 안내하는 현재 연결 창</w:t>
+      </w:r>
+    </w:p>
+    <w:p>
+      <w:pPr>
         <w:pStyle w:val="Heading3"/>
-        <w:pageBreakBefore w:val="0"/>
+        <w:pageBreakBefore/>
       </w:pPr>
       <w:r>
         <w:rPr>
@@ -2806,6 +2884,55 @@
           <w:sz w:val="24"/>
         </w:rPr>
         <w:t>연결 실패 화면과 확인 순서</w:t>
+      </w:r>
+    </w:p>
+    <w:p>
+      <w:pPr>
+        <w:keepNext/>
+        <w:spacing w:before="80" w:after="0"/>
+        <w:jc w:val="center"/>
+      </w:pPr>
+      <w:r>
+        <w:drawing>
+          <wp:inline xmlns:a="http://schemas.openxmlformats.org/drawingml/2006/main" xmlns:pic="http://schemas.openxmlformats.org/drawingml/2006/picture">
+            <wp:extent cx="3657600" cy="3871429"/>
+            <wp:docPr id="6" name="Picture 6" title="Agent 연결 실패 단계" descr="아래로 스크롤한 실제 연결 창에서 TCP 18443 실패와 이후 미수행 단계를 표시"/>
+            <wp:cNvGraphicFramePr>
+              <a:graphicFrameLocks noChangeAspect="1"/>
+            </wp:cNvGraphicFramePr>
+            <a:graphic>
+              <a:graphicData uri="http://schemas.openxmlformats.org/drawingml/2006/picture">
+                <pic:pic>
+                  <pic:nvPicPr>
+                    <pic:cNvPr id="0" name="02-agent-connection-failed.png"/>
+                    <pic:cNvPicPr/>
+                  </pic:nvPicPr>
+                  <pic:blipFill>
+                    <a:blip r:embed="rId18"/>
+                    <a:stretch>
+                      <a:fillRect/>
+                    </a:stretch>
+                  </pic:blipFill>
+                  <pic:spPr>
+                    <a:xfrm>
+                      <a:off x="0" y="0"/>
+                      <a:ext cx="3657600" cy="3871429"/>
+                    </a:xfrm>
+                    <a:prstGeom prst="rect"/>
+                  </pic:spPr>
+                </pic:pic>
+              </a:graphicData>
+            </a:graphic>
+          </wp:inline>
+        </w:drawing>
+      </w:r>
+    </w:p>
+    <w:p>
+      <w:pPr>
+        <w:pStyle w:val="Caption"/>
+      </w:pPr>
+      <w:r>
+        <w:t>그림 6. TCP 실패와 이후 미수행 단계의 합성 재현</w:t>
       </w:r>
     </w:p>
     <w:p>
@@ -3002,8 +3129,8 @@
       <w:r>
         <w:drawing>
           <wp:inline xmlns:a="http://schemas.openxmlformats.org/drawingml/2006/main" xmlns:pic="http://schemas.openxmlformats.org/drawingml/2006/picture">
-            <wp:extent cx="5029200" cy="3540967"/>
-            <wp:docPr id="5" name="Picture 5" title="장비 관리 창" descr="장비명, IPv4, 계정 ID와 비밀번호를 입력하고 자동 판별된 모델과 감시 설정을 확인하는 창"/>
+            <wp:extent cx="5029200" cy="3530704"/>
+            <wp:docPr id="7" name="Picture 7" title="장비 관리 창" descr="장비명, IPv4, 계정 ID와 비밀번호를 입력하고 자동 판별된 모델과 감시 설정을 확인하는 창"/>
             <wp:cNvGraphicFramePr>
               <a:graphicFrameLocks noChangeAspect="1"/>
             </wp:cNvGraphicFramePr>
@@ -3015,7 +3142,7 @@
                     <pic:cNvPicPr/>
                   </pic:nvPicPr>
                   <pic:blipFill>
-                    <a:blip r:embed="rId17"/>
+                    <a:blip r:embed="rId19"/>
                     <a:stretch>
                       <a:fillRect/>
                     </a:stretch>
@@ -3023,7 +3150,7 @@
                   <pic:spPr>
                     <a:xfrm>
                       <a:off x="0" y="0"/>
-                      <a:ext cx="5029200" cy="3540967"/>
+                      <a:ext cx="5029200" cy="3530704"/>
                     </a:xfrm>
                     <a:prstGeom prst="rect"/>
                   </pic:spPr>
@@ -3437,7 +3564,7 @@
                 <w:rFonts w:ascii="Noto Sans KR" w:hAnsi="Noto Sans KR" w:eastAsia="Noto Sans KR" w:cs="Noto Sans KR"/>
                 <w:sz w:val="18"/>
               </w:rPr>
-              <w:t>10/8, 172.16/12 또는 192.168/16의 스위치 관리 IPv4</w:t>
+              <w:t>Agent Setup에서 허용한 CIDR 안의 RFC1918 스위치 관리 IPv4</w:t>
             </w:r>
           </w:p>
         </w:tc>
@@ -3843,8 +3970,8 @@
       <w:r>
         <w:drawing>
           <wp:inline xmlns:a="http://schemas.openxmlformats.org/drawingml/2006/main" xmlns:pic="http://schemas.openxmlformats.org/drawingml/2006/picture">
-            <wp:extent cx="3977639" cy="2486024"/>
-            <wp:docPr id="6" name="Picture 6" title="장비 명령 실행 화면" descr="show port status를 입력하고 데모 스위치의 익명화된 결과를 확인하는 장비 명령 탭"/>
+            <wp:extent cx="3977639" cy="2448734"/>
+            <wp:docPr id="8" name="Picture 8" title="장비 명령 실행 화면" descr="show port status를 입력하고 데모 스위치의 익명화된 결과를 확인하는 장비 명령 탭"/>
             <wp:cNvGraphicFramePr>
               <a:graphicFrameLocks noChangeAspect="1"/>
             </wp:cNvGraphicFramePr>
@@ -3856,7 +3983,7 @@
                     <pic:cNvPicPr/>
                   </pic:nvPicPr>
                   <pic:blipFill>
-                    <a:blip r:embed="rId18"/>
+                    <a:blip r:embed="rId20"/>
                     <a:stretch>
                       <a:fillRect/>
                     </a:stretch>
@@ -3864,7 +3991,7 @@
                   <pic:spPr>
                     <a:xfrm>
                       <a:off x="0" y="0"/>
-                      <a:ext cx="3977639" cy="2486024"/>
+                      <a:ext cx="3977639" cy="2448734"/>
                     </a:xfrm>
                     <a:prstGeom prst="rect"/>
                   </pic:spPr>
@@ -5162,8 +5289,8 @@
       <w:r>
         <w:drawing>
           <wp:inline xmlns:a="http://schemas.openxmlformats.org/drawingml/2006/main" xmlns:pic="http://schemas.openxmlformats.org/drawingml/2006/picture">
-            <wp:extent cx="4754880" cy="2971800"/>
-            <wp:docPr id="7" name="Picture 7" title="Viewer 대시보드" descr="장비 목록, 선택 장비 상태, 최근 이벤트와 Viewer 감시 상태를 보여 주는 대시보드"/>
+            <wp:extent cx="4754880" cy="2927223"/>
+            <wp:docPr id="9" name="Picture 9" title="Viewer 대시보드" descr="장비 목록, 선택 장비 상태, 최근 이벤트와 Viewer 감시 상태를 보여 주는 대시보드"/>
             <wp:cNvGraphicFramePr>
               <a:graphicFrameLocks noChangeAspect="1"/>
             </wp:cNvGraphicFramePr>
@@ -5175,7 +5302,7 @@
                     <pic:cNvPicPr/>
                   </pic:nvPicPr>
                   <pic:blipFill>
-                    <a:blip r:embed="rId19"/>
+                    <a:blip r:embed="rId21"/>
                     <a:stretch>
                       <a:fillRect/>
                     </a:stretch>
@@ -5183,7 +5310,7 @@
                   <pic:spPr>
                     <a:xfrm>
                       <a:off x="0" y="0"/>
-                      <a:ext cx="4754880" cy="2971800"/>
+                      <a:ext cx="4754880" cy="2927223"/>
                     </a:xfrm>
                     <a:prstGeom prst="rect"/>
                   </pic:spPr>
@@ -5700,7 +5827,7 @@
         <w:drawing>
           <wp:inline xmlns:a="http://schemas.openxmlformats.org/drawingml/2006/main" xmlns:pic="http://schemas.openxmlformats.org/drawingml/2006/picture">
             <wp:extent cx="2971800" cy="1556656"/>
-            <wp:docPr id="8" name="Picture 8" title="항상 위 미니 창" descr="정상, 경고, 장애 수와 최근 문제를 보여 주는 작은 항상 위 창"/>
+            <wp:docPr id="10" name="Picture 10" title="항상 위 미니 창" descr="정상, 경고, 장애 수와 최근 문제를 보여 주는 작은 항상 위 창"/>
             <wp:cNvGraphicFramePr>
               <a:graphicFrameLocks noChangeAspect="1"/>
             </wp:cNvGraphicFramePr>
@@ -5712,7 +5839,7 @@
                     <pic:cNvPicPr/>
                   </pic:nvPicPr>
                   <pic:blipFill>
-                    <a:blip r:embed="rId20"/>
+                    <a:blip r:embed="rId22"/>
                     <a:stretch>
                       <a:fillRect/>
                     </a:stretch>
@@ -5749,7 +5876,7 @@
         <w:drawing>
           <wp:inline xmlns:a="http://schemas.openxmlformats.org/drawingml/2006/main" xmlns:pic="http://schemas.openxmlformats.org/drawingml/2006/picture">
             <wp:extent cx="3154680" cy="1231827"/>
-            <wp:docPr id="9" name="Picture 9" title="장애 알림 팝업" descr="데모 업링크 포트 Down 장애와 발생 시각을 보여 주는 알림 팝업"/>
+            <wp:docPr id="11" name="Picture 11" title="장애 알림 팝업" descr="데모 업링크 포트 Down 장애와 발생 시각을 보여 주는 알림 팝업"/>
             <wp:cNvGraphicFramePr>
               <a:graphicFrameLocks noChangeAspect="1"/>
             </wp:cNvGraphicFramePr>
@@ -5761,7 +5888,7 @@
                     <pic:cNvPicPr/>
                   </pic:nvPicPr>
                   <pic:blipFill>
-                    <a:blip r:embed="rId21"/>
+                    <a:blip r:embed="rId23"/>
                     <a:stretch>
                       <a:fillRect/>
                     </a:stretch>
@@ -6801,7 +6928,7 @@
           <w:rFonts w:ascii="Noto Sans KR" w:hAnsi="Noto Sans KR" w:eastAsia="Noto Sans KR" w:cs="Noto Sans KR"/>
           <w:sz w:val="22"/>
         </w:rPr>
-        <w:t>제품 방화벽 규칙은 RFC1918 사설 Viewer 주소를 허용하고 Agent 업무 API v5는 bearer를 추가로 요구합니다. Agent는 RFC1918 사설 장비의 Telnet/23만 사용합니다.</w:t>
+        <w:t>제품 방화벽 규칙은 RFC1918 사설 Viewer 주소를 허용하고 Agent 업무 API v5는 bearer를 추가로 요구합니다. Agent는 설정된 허용 관리망 CIDR 안의 RFC1918 사설 장비에만 Telnet/23을 사용합니다.</w:t>
       </w:r>
     </w:p>
     <w:p>
@@ -9650,7 +9777,7 @@
                 <w:rFonts w:ascii="Noto Sans KR" w:hAnsi="Noto Sans KR" w:eastAsia="Noto Sans KR" w:cs="Noto Sans KR"/>
                 <w:sz w:val="16"/>
               </w:rPr>
-              <w:t>v0.12.0-poc 또는 더 최신 Viewer Setup으로 이전 상태 복구 완료 → 설치/업데이트 별도 실행 → 그 뒤에만 downgrade</w:t>
+              <w:t>v0.13.0-poc 또는 더 최신 Viewer Setup으로 이전 상태 복구 완료 → 설치/업데이트 별도 실행 → 그 뒤에만 downgrade</w:t>
             </w:r>
           </w:p>
         </w:tc>
@@ -9762,7 +9889,7 @@
                 <w:rFonts w:ascii="Noto Sans KR" w:hAnsi="Noto Sans KR" w:eastAsia="Noto Sans KR" w:cs="Noto Sans KR"/>
                 <w:sz w:val="16"/>
               </w:rPr>
-              <w:t>장비 IPv4가 10/8, 172.16/12 또는 192.168/16인지 확인</w:t>
+              <w:t>장비 IPv4가 RFC1918이고 Agent Setup의 허용 대상 CIDR에 포함되는지 확인</w:t>
             </w:r>
           </w:p>
         </w:tc>
@@ -11623,7 +11750,7 @@
     <w:p>
       <w:pPr>
         <w:pStyle w:val="Heading1"/>
-        <w:pageBreakBefore w:val="0"/>
+        <w:pageBreakBefore/>
         <w:numPr>
           <w:ilvl w:val="0"/>
           <w:numId w:val="11"/>
@@ -11683,7 +11810,7 @@
         <w:rPr>
           <w:rFonts w:ascii="Noto Sans KR" w:hAnsi="Noto Sans KR" w:eastAsia="Noto Sans KR" w:cs="Noto Sans KR"/>
         </w:rPr>
-        <w:t>Agent PC에서 SamsungSwitchWatch.Agent.Setup.exe를 실행합니다. 입력 없이 설치/업데이트를 진행합니다.</w:t>
+        <w:t>Agent PC에서 SamsungSwitchWatch.Agent.Setup.exe를 실행합니다. 승인된 스위치 관리망 CIDR을 확인한 뒤 설치/업데이트하고 새 SSW1 코드로 Viewer를 페어링합니다.</w:t>
       </w:r>
     </w:p>
     <w:p>
@@ -11901,7 +12028,7 @@
         <w:color w:val="64748B"/>
         <w:sz w:val="17"/>
       </w:rPr>
-      <w:t xml:space="preserve">v0.12.0-poc  |  </w:t>
+      <w:t xml:space="preserve">v0.13.0-poc  |  </w:t>
     </w:r>
     <w:r>
       <w:rPr>
@@ -11932,7 +12059,7 @@
         <w:color w:val="64748B"/>
         <w:sz w:val="17"/>
       </w:rPr>
-      <w:t>v0.12.0-poc  |  2026-08-24</w:t>
+      <w:t>v0.13.0-poc  |  2026-09-08</w:t>
     </w:r>
   </w:p>
 </w:ftr>

</xml_diff>